<commit_message>
docs: adiciona secoes de usuarios, senhas, salarios e extracao passo a passo no TOTVS
</commit_message>
<xml_diff>
--- a/DOCUMENTACAO_DO_SISTEMA.docx
+++ b/DOCUMENTACAO_DO_SISTEMA.docx
@@ -31,7 +31,7 @@
           <w:color w:val="007A87"/>
           <w:sz w:val="26"/>
         </w:rPr>
-        <w:t>Manual Técnico Completo, Guia de Atualização de Dados e Procedimentos de Manutenção</w:t>
+        <w:t>Manual Técnico Completo, Guia de Extração no TOTVS, Atualização de Dados e Manutenção</w:t>
       </w:r>
     </w:p>
     <w:tbl>
@@ -237,7 +237,7 @@
                 <w:color w:val="2D3748"/>
                 <w:sz w:val="19"/>
               </w:rPr>
-              <w:t>Versão 2.0 - Edição Definitiva de Transição Técnica</w:t>
+              <w:t>Versão 2.1 - Edição com Guia de Usuários, Salários e Extrações TOTVS</w:t>
             </w:r>
           </w:p>
         </w:tc>
@@ -359,7 +359,7 @@
           <w:color w:val="2D3748"/>
           <w:sz w:val="21"/>
         </w:rPr>
-        <w:t>Este manual está estruturado em 3 grandes partes para facilitar o uso por diferentes perfis de usuários na empresa:</w:t>
+        <w:t>Este manual está estruturado em 3 grandes partes para atender às necessidades operacionais e técnicas da empresa:</w:t>
       </w:r>
     </w:p>
     <w:p>
@@ -405,7 +405,7 @@
           <w:color w:val="2D3748"/>
           <w:sz w:val="21"/>
         </w:rPr>
-        <w:t>Passo a passo minucioso de onde extrair planilhas, onde clicar no sistema, como importar e como conferir os dados.</w:t>
+        <w:t>Criação de usuários, alteração de senhas, tabela salarial, cadastro de cargos, passo a passo exato de extração de relatórios no TOTVS Protheus e procedimentos de importação.</w:t>
       </w:r>
     </w:p>
     <w:p>
@@ -477,7 +477,7 @@
                 <w:color w:val="2D3748"/>
                 <w:sz w:val="20"/>
               </w:rPr>
-              <w:t>Este documento foi elaborado para garantir a total autonomia da equipe operacional após a saída do desenvolvedor original. Guarde este arquivo em local seguro na rede interna e mantenha uma cópia impressa do Guia Rápido de Contingência próxima ao computador servidor.</w:t>
+              <w:t>Este manual contém o roteiro prático e exato de telas do TOTVS Protheus para extração dos arquivos SRA, SRG, Líquidos de Rescisão e SRD, além dos passos de administração de usuários e salários.</w:t>
             </w:r>
           </w:p>
         </w:tc>
@@ -1732,7 +1732,7 @@
           <w:color w:val="2D3748"/>
           <w:sz w:val="21"/>
         </w:rPr>
-        <w:t>Esta seção foi escrita em linguagem direta e operacional para que qualquer membro da equipe consiga atualizar os números do sistema periodicamente, mesmo sem conhecimento de programação.</w:t>
+        <w:t>Esta seção foi estruturada para ser a referência rápida do dia a dia da equipe operacional. Apresentamos primeiro a gestão de usuários, senhas e tabela de salários, seguida do roteiro exato de extração de relatórios no TOTVS Protheus.</w:t>
       </w:r>
     </w:p>
     <w:p>
@@ -1748,992 +1748,7 @@
           <w:color w:val="007A87"/>
           <w:sz w:val="26"/>
         </w:rPr>
-        <w:t>2.1 Resumo dos Módulos e Arquivos Aceitos</w:t>
-      </w:r>
-    </w:p>
-    <w:tbl>
-      <w:tblPr>
-        <w:tblW w:type="auto" w:w="0"/>
-        <w:jc w:val="center"/>
-        <w:tblLook w:firstColumn="1" w:firstRow="1" w:lastColumn="0" w:lastRow="0" w:noHBand="0" w:noVBand="1" w:val="04A0"/>
-      </w:tblPr>
-      <w:tblGrid>
-        <w:gridCol w:w="1987"/>
-        <w:gridCol w:w="1987"/>
-        <w:gridCol w:w="1987"/>
-        <w:gridCol w:w="1987"/>
-        <w:gridCol w:w="1987"/>
-      </w:tblGrid>
-      <w:tr>
-        <w:tc>
-          <w:tcPr>
-            <w:tcW w:type="dxa" w:w="1987"/>
-            <w:shd w:fill="1B365D"/>
-          </w:tcPr>
-          <w:p>
-            <w:pPr>
-              <w:spacing w:before="80" w:after="80"/>
-            </w:pPr>
-            <w:r>
-              <w:rPr>
-                <w:rFonts w:ascii="Arial" w:hAnsi="Arial"/>
-                <w:b/>
-                <w:color w:val="FFFFFF"/>
-                <w:sz w:val="19"/>
-              </w:rPr>
-              <w:t>Módulo</w:t>
-            </w:r>
-          </w:p>
-        </w:tc>
-        <w:tc>
-          <w:tcPr>
-            <w:tcW w:type="dxa" w:w="1987"/>
-            <w:shd w:fill="1B365D"/>
-          </w:tcPr>
-          <w:p>
-            <w:pPr>
-              <w:spacing w:before="80" w:after="80"/>
-            </w:pPr>
-            <w:r>
-              <w:rPr>
-                <w:rFonts w:ascii="Arial" w:hAnsi="Arial"/>
-                <w:b/>
-                <w:color w:val="FFFFFF"/>
-                <w:sz w:val="19"/>
-              </w:rPr>
-              <w:t>Arquivo Necessário</w:t>
-            </w:r>
-          </w:p>
-        </w:tc>
-        <w:tc>
-          <w:tcPr>
-            <w:tcW w:type="dxa" w:w="1987"/>
-            <w:shd w:fill="1B365D"/>
-          </w:tcPr>
-          <w:p>
-            <w:pPr>
-              <w:spacing w:before="80" w:after="80"/>
-            </w:pPr>
-            <w:r>
-              <w:rPr>
-                <w:rFonts w:ascii="Arial" w:hAnsi="Arial"/>
-                <w:b/>
-                <w:color w:val="FFFFFF"/>
-                <w:sz w:val="19"/>
-              </w:rPr>
-              <w:t>Formato</w:t>
-            </w:r>
-          </w:p>
-        </w:tc>
-        <w:tc>
-          <w:tcPr>
-            <w:tcW w:type="dxa" w:w="1987"/>
-            <w:shd w:fill="1B365D"/>
-          </w:tcPr>
-          <w:p>
-            <w:pPr>
-              <w:spacing w:before="80" w:after="80"/>
-            </w:pPr>
-            <w:r>
-              <w:rPr>
-                <w:rFonts w:ascii="Arial" w:hAnsi="Arial"/>
-                <w:b/>
-                <w:color w:val="FFFFFF"/>
-                <w:sz w:val="19"/>
-              </w:rPr>
-              <w:t>Origem dos Dados</w:t>
-            </w:r>
-          </w:p>
-        </w:tc>
-        <w:tc>
-          <w:tcPr>
-            <w:tcW w:type="dxa" w:w="1987"/>
-            <w:shd w:fill="1B365D"/>
-          </w:tcPr>
-          <w:p>
-            <w:pPr>
-              <w:spacing w:before="80" w:after="80"/>
-            </w:pPr>
-            <w:r>
-              <w:rPr>
-                <w:rFonts w:ascii="Arial" w:hAnsi="Arial"/>
-                <w:b/>
-                <w:color w:val="FFFFFF"/>
-                <w:sz w:val="19"/>
-              </w:rPr>
-              <w:t>Frequência Recomendada</w:t>
-            </w:r>
-          </w:p>
-        </w:tc>
-      </w:tr>
-      <w:tr>
-        <w:tc>
-          <w:tcPr>
-            <w:tcW w:type="dxa" w:w="1987"/>
-          </w:tcPr>
-          <w:p>
-            <w:pPr>
-              <w:spacing w:before="60" w:after="60" w:line="264" w:lineRule="auto"/>
-            </w:pPr>
-            <w:r>
-              <w:rPr>
-                <w:rFonts w:ascii="Calibri" w:hAnsi="Calibri"/>
-                <w:color w:val="2D3748"/>
-                <w:sz w:val="19"/>
-              </w:rPr>
-              <w:t>Headcount / Colaboradores</w:t>
-            </w:r>
-          </w:p>
-        </w:tc>
-        <w:tc>
-          <w:tcPr>
-            <w:tcW w:type="dxa" w:w="1987"/>
-          </w:tcPr>
-          <w:p>
-            <w:pPr>
-              <w:spacing w:before="60" w:after="60" w:line="264" w:lineRule="auto"/>
-            </w:pPr>
-            <w:r>
-              <w:rPr>
-                <w:rFonts w:ascii="Calibri" w:hAnsi="Calibri"/>
-                <w:color w:val="2D3748"/>
-                <w:sz w:val="19"/>
-              </w:rPr>
-              <w:t>Relatório SRA010</w:t>
-            </w:r>
-          </w:p>
-        </w:tc>
-        <w:tc>
-          <w:tcPr>
-            <w:tcW w:type="dxa" w:w="1987"/>
-          </w:tcPr>
-          <w:p>
-            <w:pPr>
-              <w:spacing w:before="60" w:after="60" w:line="264" w:lineRule="auto"/>
-            </w:pPr>
-            <w:r>
-              <w:rPr>
-                <w:rFonts w:ascii="Calibri" w:hAnsi="Calibri"/>
-                <w:color w:val="2D3748"/>
-                <w:sz w:val="19"/>
-              </w:rPr>
-              <w:t>.CSV</w:t>
-            </w:r>
-          </w:p>
-        </w:tc>
-        <w:tc>
-          <w:tcPr>
-            <w:tcW w:type="dxa" w:w="1987"/>
-          </w:tcPr>
-          <w:p>
-            <w:pPr>
-              <w:spacing w:before="60" w:after="60" w:line="264" w:lineRule="auto"/>
-            </w:pPr>
-            <w:r>
-              <w:rPr>
-                <w:rFonts w:ascii="Calibri" w:hAnsi="Calibri"/>
-                <w:color w:val="2D3748"/>
-                <w:sz w:val="19"/>
-              </w:rPr>
-              <w:t>TOTVS Protheus (RH)</w:t>
-            </w:r>
-          </w:p>
-        </w:tc>
-        <w:tc>
-          <w:tcPr>
-            <w:tcW w:type="dxa" w:w="1987"/>
-          </w:tcPr>
-          <w:p>
-            <w:pPr>
-              <w:spacing w:before="60" w:after="60" w:line="264" w:lineRule="auto"/>
-            </w:pPr>
-            <w:r>
-              <w:rPr>
-                <w:rFonts w:ascii="Calibri" w:hAnsi="Calibri"/>
-                <w:color w:val="2D3748"/>
-                <w:sz w:val="19"/>
-              </w:rPr>
-              <w:t>Semanal ou Mensal</w:t>
-            </w:r>
-          </w:p>
-        </w:tc>
-      </w:tr>
-      <w:tr>
-        <w:tc>
-          <w:tcPr>
-            <w:tcW w:type="dxa" w:w="1987"/>
-            <w:shd w:fill="F7FAFC"/>
-          </w:tcPr>
-          <w:p>
-            <w:pPr>
-              <w:spacing w:before="60" w:after="60" w:line="264" w:lineRule="auto"/>
-            </w:pPr>
-            <w:r>
-              <w:rPr>
-                <w:rFonts w:ascii="Calibri" w:hAnsi="Calibri"/>
-                <w:color w:val="2D3748"/>
-                <w:sz w:val="19"/>
-              </w:rPr>
-              <w:t>Ponto &amp; Ausências</w:t>
-            </w:r>
-          </w:p>
-        </w:tc>
-        <w:tc>
-          <w:tcPr>
-            <w:tcW w:type="dxa" w:w="1987"/>
-            <w:shd w:fill="F7FAFC"/>
-          </w:tcPr>
-          <w:p>
-            <w:pPr>
-              <w:spacing w:before="60" w:after="60" w:line="264" w:lineRule="auto"/>
-            </w:pPr>
-            <w:r>
-              <w:rPr>
-                <w:rFonts w:ascii="Calibri" w:hAnsi="Calibri"/>
-                <w:color w:val="2D3748"/>
-                <w:sz w:val="19"/>
-              </w:rPr>
-              <w:t>Relatório de Batidas / API</w:t>
-            </w:r>
-          </w:p>
-        </w:tc>
-        <w:tc>
-          <w:tcPr>
-            <w:tcW w:type="dxa" w:w="1987"/>
-            <w:shd w:fill="F7FAFC"/>
-          </w:tcPr>
-          <w:p>
-            <w:pPr>
-              <w:spacing w:before="60" w:after="60" w:line="264" w:lineRule="auto"/>
-            </w:pPr>
-            <w:r>
-              <w:rPr>
-                <w:rFonts w:ascii="Calibri" w:hAnsi="Calibri"/>
-                <w:color w:val="2D3748"/>
-                <w:sz w:val="19"/>
-              </w:rPr>
-              <w:t>.XLSX ou API</w:t>
-            </w:r>
-          </w:p>
-        </w:tc>
-        <w:tc>
-          <w:tcPr>
-            <w:tcW w:type="dxa" w:w="1987"/>
-            <w:shd w:fill="F7FAFC"/>
-          </w:tcPr>
-          <w:p>
-            <w:pPr>
-              <w:spacing w:before="60" w:after="60" w:line="264" w:lineRule="auto"/>
-            </w:pPr>
-            <w:r>
-              <w:rPr>
-                <w:rFonts w:ascii="Calibri" w:hAnsi="Calibri"/>
-                <w:color w:val="2D3748"/>
-                <w:sz w:val="19"/>
-              </w:rPr>
-              <w:t>GeoVictoria Ponto Eletrônico</w:t>
-            </w:r>
-          </w:p>
-        </w:tc>
-        <w:tc>
-          <w:tcPr>
-            <w:tcW w:type="dxa" w:w="1987"/>
-            <w:shd w:fill="F7FAFC"/>
-          </w:tcPr>
-          <w:p>
-            <w:pPr>
-              <w:spacing w:before="60" w:after="60" w:line="264" w:lineRule="auto"/>
-            </w:pPr>
-            <w:r>
-              <w:rPr>
-                <w:rFonts w:ascii="Calibri" w:hAnsi="Calibri"/>
-                <w:color w:val="2D3748"/>
-                <w:sz w:val="19"/>
-              </w:rPr>
-              <w:t>Semanal</w:t>
-            </w:r>
-          </w:p>
-        </w:tc>
-      </w:tr>
-      <w:tr>
-        <w:tc>
-          <w:tcPr>
-            <w:tcW w:type="dxa" w:w="1987"/>
-          </w:tcPr>
-          <w:p>
-            <w:pPr>
-              <w:spacing w:before="60" w:after="60" w:line="264" w:lineRule="auto"/>
-            </w:pPr>
-            <w:r>
-              <w:rPr>
-                <w:rFonts w:ascii="Calibri" w:hAnsi="Calibri"/>
-                <w:color w:val="2D3748"/>
-                <w:sz w:val="19"/>
-              </w:rPr>
-              <w:t>Turnover / Rescisões</w:t>
-            </w:r>
-          </w:p>
-        </w:tc>
-        <w:tc>
-          <w:tcPr>
-            <w:tcW w:type="dxa" w:w="1987"/>
-          </w:tcPr>
-          <w:p>
-            <w:pPr>
-              <w:spacing w:before="60" w:after="60" w:line="264" w:lineRule="auto"/>
-            </w:pPr>
-            <w:r>
-              <w:rPr>
-                <w:rFonts w:ascii="Calibri" w:hAnsi="Calibri"/>
-                <w:color w:val="2D3748"/>
-                <w:sz w:val="19"/>
-              </w:rPr>
-              <w:t>Termos de Rescisão</w:t>
-            </w:r>
-          </w:p>
-        </w:tc>
-        <w:tc>
-          <w:tcPr>
-            <w:tcW w:type="dxa" w:w="1987"/>
-          </w:tcPr>
-          <w:p>
-            <w:pPr>
-              <w:spacing w:before="60" w:after="60" w:line="264" w:lineRule="auto"/>
-            </w:pPr>
-            <w:r>
-              <w:rPr>
-                <w:rFonts w:ascii="Calibri" w:hAnsi="Calibri"/>
-                <w:color w:val="2D3748"/>
-                <w:sz w:val="19"/>
-              </w:rPr>
-              <w:t>.CSV</w:t>
-            </w:r>
-          </w:p>
-        </w:tc>
-        <w:tc>
-          <w:tcPr>
-            <w:tcW w:type="dxa" w:w="1987"/>
-          </w:tcPr>
-          <w:p>
-            <w:pPr>
-              <w:spacing w:before="60" w:after="60" w:line="264" w:lineRule="auto"/>
-            </w:pPr>
-            <w:r>
-              <w:rPr>
-                <w:rFonts w:ascii="Calibri" w:hAnsi="Calibri"/>
-                <w:color w:val="2D3748"/>
-                <w:sz w:val="19"/>
-              </w:rPr>
-              <w:t>Planilha de Homologações</w:t>
-            </w:r>
-          </w:p>
-        </w:tc>
-        <w:tc>
-          <w:tcPr>
-            <w:tcW w:type="dxa" w:w="1987"/>
-          </w:tcPr>
-          <w:p>
-            <w:pPr>
-              <w:spacing w:before="60" w:after="60" w:line="264" w:lineRule="auto"/>
-            </w:pPr>
-            <w:r>
-              <w:rPr>
-                <w:rFonts w:ascii="Calibri" w:hAnsi="Calibri"/>
-                <w:color w:val="2D3748"/>
-                <w:sz w:val="19"/>
-              </w:rPr>
-              <w:t>Mensal</w:t>
-            </w:r>
-          </w:p>
-        </w:tc>
-      </w:tr>
-      <w:tr>
-        <w:tc>
-          <w:tcPr>
-            <w:tcW w:type="dxa" w:w="1987"/>
-            <w:shd w:fill="F7FAFC"/>
-          </w:tcPr>
-          <w:p>
-            <w:pPr>
-              <w:spacing w:before="60" w:after="60" w:line="264" w:lineRule="auto"/>
-            </w:pPr>
-            <w:r>
-              <w:rPr>
-                <w:rFonts w:ascii="Calibri" w:hAnsi="Calibri"/>
-                <w:color w:val="2D3748"/>
-                <w:sz w:val="19"/>
-              </w:rPr>
-              <w:t>Valores de Rescisão</w:t>
-            </w:r>
-          </w:p>
-        </w:tc>
-        <w:tc>
-          <w:tcPr>
-            <w:tcW w:type="dxa" w:w="1987"/>
-            <w:shd w:fill="F7FAFC"/>
-          </w:tcPr>
-          <w:p>
-            <w:pPr>
-              <w:spacing w:before="60" w:after="60" w:line="264" w:lineRule="auto"/>
-            </w:pPr>
-            <w:r>
-              <w:rPr>
-                <w:rFonts w:ascii="Calibri" w:hAnsi="Calibri"/>
-                <w:color w:val="2D3748"/>
-                <w:sz w:val="19"/>
-              </w:rPr>
-              <w:t>Relatório GPER020</w:t>
-            </w:r>
-          </w:p>
-        </w:tc>
-        <w:tc>
-          <w:tcPr>
-            <w:tcW w:type="dxa" w:w="1987"/>
-            <w:shd w:fill="F7FAFC"/>
-          </w:tcPr>
-          <w:p>
-            <w:pPr>
-              <w:spacing w:before="60" w:after="60" w:line="264" w:lineRule="auto"/>
-            </w:pPr>
-            <w:r>
-              <w:rPr>
-                <w:rFonts w:ascii="Calibri" w:hAnsi="Calibri"/>
-                <w:color w:val="2D3748"/>
-                <w:sz w:val="19"/>
-              </w:rPr>
-              <w:t>.XML ou .XLSX</w:t>
-            </w:r>
-          </w:p>
-        </w:tc>
-        <w:tc>
-          <w:tcPr>
-            <w:tcW w:type="dxa" w:w="1987"/>
-            <w:shd w:fill="F7FAFC"/>
-          </w:tcPr>
-          <w:p>
-            <w:pPr>
-              <w:spacing w:before="60" w:after="60" w:line="264" w:lineRule="auto"/>
-            </w:pPr>
-            <w:r>
-              <w:rPr>
-                <w:rFonts w:ascii="Calibri" w:hAnsi="Calibri"/>
-                <w:color w:val="2D3748"/>
-                <w:sz w:val="19"/>
-              </w:rPr>
-              <w:t>TOTVS Protheus (Folha)</w:t>
-            </w:r>
-          </w:p>
-        </w:tc>
-        <w:tc>
-          <w:tcPr>
-            <w:tcW w:type="dxa" w:w="1987"/>
-            <w:shd w:fill="F7FAFC"/>
-          </w:tcPr>
-          <w:p>
-            <w:pPr>
-              <w:spacing w:before="60" w:after="60" w:line="264" w:lineRule="auto"/>
-            </w:pPr>
-            <w:r>
-              <w:rPr>
-                <w:rFonts w:ascii="Calibri" w:hAnsi="Calibri"/>
-                <w:color w:val="2D3748"/>
-                <w:sz w:val="19"/>
-              </w:rPr>
-              <w:t>Mensal</w:t>
-            </w:r>
-          </w:p>
-        </w:tc>
-      </w:tr>
-      <w:tr>
-        <w:tc>
-          <w:tcPr>
-            <w:tcW w:type="dxa" w:w="1987"/>
-          </w:tcPr>
-          <w:p>
-            <w:pPr>
-              <w:spacing w:before="60" w:after="60" w:line="264" w:lineRule="auto"/>
-            </w:pPr>
-            <w:r>
-              <w:rPr>
-                <w:rFonts w:ascii="Calibri" w:hAnsi="Calibri"/>
-                <w:color w:val="2D3748"/>
-                <w:sz w:val="19"/>
-              </w:rPr>
-              <w:t>Folha de Pagamento</w:t>
-            </w:r>
-          </w:p>
-        </w:tc>
-        <w:tc>
-          <w:tcPr>
-            <w:tcW w:type="dxa" w:w="1987"/>
-          </w:tcPr>
-          <w:p>
-            <w:pPr>
-              <w:spacing w:before="60" w:after="60" w:line="264" w:lineRule="auto"/>
-            </w:pPr>
-            <w:r>
-              <w:rPr>
-                <w:rFonts w:ascii="Calibri" w:hAnsi="Calibri"/>
-                <w:color w:val="2D3748"/>
-                <w:sz w:val="19"/>
-              </w:rPr>
-              <w:t>Relatório SRD (Folha)</w:t>
-            </w:r>
-          </w:p>
-        </w:tc>
-        <w:tc>
-          <w:tcPr>
-            <w:tcW w:type="dxa" w:w="1987"/>
-          </w:tcPr>
-          <w:p>
-            <w:pPr>
-              <w:spacing w:before="60" w:after="60" w:line="264" w:lineRule="auto"/>
-            </w:pPr>
-            <w:r>
-              <w:rPr>
-                <w:rFonts w:ascii="Calibri" w:hAnsi="Calibri"/>
-                <w:color w:val="2D3748"/>
-                <w:sz w:val="19"/>
-              </w:rPr>
-              <w:t>.CSV</w:t>
-            </w:r>
-          </w:p>
-        </w:tc>
-        <w:tc>
-          <w:tcPr>
-            <w:tcW w:type="dxa" w:w="1987"/>
-          </w:tcPr>
-          <w:p>
-            <w:pPr>
-              <w:spacing w:before="60" w:after="60" w:line="264" w:lineRule="auto"/>
-            </w:pPr>
-            <w:r>
-              <w:rPr>
-                <w:rFonts w:ascii="Calibri" w:hAnsi="Calibri"/>
-                <w:color w:val="2D3748"/>
-                <w:sz w:val="19"/>
-              </w:rPr>
-              <w:t>TOTVS Protheus (Folha)</w:t>
-            </w:r>
-          </w:p>
-        </w:tc>
-        <w:tc>
-          <w:tcPr>
-            <w:tcW w:type="dxa" w:w="1987"/>
-          </w:tcPr>
-          <w:p>
-            <w:pPr>
-              <w:spacing w:before="60" w:after="60" w:line="264" w:lineRule="auto"/>
-            </w:pPr>
-            <w:r>
-              <w:rPr>
-                <w:rFonts w:ascii="Calibri" w:hAnsi="Calibri"/>
-                <w:color w:val="2D3748"/>
-                <w:sz w:val="19"/>
-              </w:rPr>
-              <w:t>Mensal (após fechamento)</w:t>
-            </w:r>
-          </w:p>
-        </w:tc>
-      </w:tr>
-      <w:tr>
-        <w:tc>
-          <w:tcPr>
-            <w:tcW w:type="dxa" w:w="1987"/>
-            <w:shd w:fill="F7FAFC"/>
-          </w:tcPr>
-          <w:p>
-            <w:pPr>
-              <w:spacing w:before="60" w:after="60" w:line="264" w:lineRule="auto"/>
-            </w:pPr>
-            <w:r>
-              <w:rPr>
-                <w:rFonts w:ascii="Calibri" w:hAnsi="Calibri"/>
-                <w:color w:val="2D3748"/>
-                <w:sz w:val="19"/>
-              </w:rPr>
-              <w:t>De-Para de Verbas</w:t>
-            </w:r>
-          </w:p>
-        </w:tc>
-        <w:tc>
-          <w:tcPr>
-            <w:tcW w:type="dxa" w:w="1987"/>
-            <w:shd w:fill="F7FAFC"/>
-          </w:tcPr>
-          <w:p>
-            <w:pPr>
-              <w:spacing w:before="60" w:after="60" w:line="264" w:lineRule="auto"/>
-            </w:pPr>
-            <w:r>
-              <w:rPr>
-                <w:rFonts w:ascii="Calibri" w:hAnsi="Calibri"/>
-                <w:color w:val="2D3748"/>
-                <w:sz w:val="19"/>
-              </w:rPr>
-              <w:t>DE_PARA_DE_VERBAS_2</w:t>
-            </w:r>
-          </w:p>
-        </w:tc>
-        <w:tc>
-          <w:tcPr>
-            <w:tcW w:type="dxa" w:w="1987"/>
-            <w:shd w:fill="F7FAFC"/>
-          </w:tcPr>
-          <w:p>
-            <w:pPr>
-              <w:spacing w:before="60" w:after="60" w:line="264" w:lineRule="auto"/>
-            </w:pPr>
-            <w:r>
-              <w:rPr>
-                <w:rFonts w:ascii="Calibri" w:hAnsi="Calibri"/>
-                <w:color w:val="2D3748"/>
-                <w:sz w:val="19"/>
-              </w:rPr>
-              <w:t>.XLSX</w:t>
-            </w:r>
-          </w:p>
-        </w:tc>
-        <w:tc>
-          <w:tcPr>
-            <w:tcW w:type="dxa" w:w="1987"/>
-            <w:shd w:fill="F7FAFC"/>
-          </w:tcPr>
-          <w:p>
-            <w:pPr>
-              <w:spacing w:before="60" w:after="60" w:line="264" w:lineRule="auto"/>
-            </w:pPr>
-            <w:r>
-              <w:rPr>
-                <w:rFonts w:ascii="Calibri" w:hAnsi="Calibri"/>
-                <w:color w:val="2D3748"/>
-                <w:sz w:val="19"/>
-              </w:rPr>
-              <w:t>Pasta de Rede F:\TOTVS</w:t>
-            </w:r>
-          </w:p>
-        </w:tc>
-        <w:tc>
-          <w:tcPr>
-            <w:tcW w:type="dxa" w:w="1987"/>
-            <w:shd w:fill="F7FAFC"/>
-          </w:tcPr>
-          <w:p>
-            <w:pPr>
-              <w:spacing w:before="60" w:after="60" w:line="264" w:lineRule="auto"/>
-            </w:pPr>
-            <w:r>
-              <w:rPr>
-                <w:rFonts w:ascii="Calibri" w:hAnsi="Calibri"/>
-                <w:color w:val="2D3748"/>
-                <w:sz w:val="19"/>
-              </w:rPr>
-              <w:t>Sempre que houver nova verba</w:t>
-            </w:r>
-          </w:p>
-        </w:tc>
-      </w:tr>
-      <w:tr>
-        <w:tc>
-          <w:tcPr>
-            <w:tcW w:type="dxa" w:w="1987"/>
-          </w:tcPr>
-          <w:p>
-            <w:pPr>
-              <w:spacing w:before="60" w:after="60" w:line="264" w:lineRule="auto"/>
-            </w:pPr>
-            <w:r>
-              <w:rPr>
-                <w:rFonts w:ascii="Calibri" w:hAnsi="Calibri"/>
-                <w:color w:val="2D3748"/>
-                <w:sz w:val="19"/>
-              </w:rPr>
-              <w:t>Diárias Operacionais</w:t>
-            </w:r>
-          </w:p>
-        </w:tc>
-        <w:tc>
-          <w:tcPr>
-            <w:tcW w:type="dxa" w:w="1987"/>
-          </w:tcPr>
-          <w:p>
-            <w:pPr>
-              <w:spacing w:before="60" w:after="60" w:line="264" w:lineRule="auto"/>
-            </w:pPr>
-            <w:r>
-              <w:rPr>
-                <w:rFonts w:ascii="Calibri" w:hAnsi="Calibri"/>
-                <w:color w:val="2D3748"/>
-                <w:sz w:val="19"/>
-              </w:rPr>
-              <w:t>Base Sistema + Base Manual</w:t>
-            </w:r>
-          </w:p>
-        </w:tc>
-        <w:tc>
-          <w:tcPr>
-            <w:tcW w:type="dxa" w:w="1987"/>
-          </w:tcPr>
-          <w:p>
-            <w:pPr>
-              <w:spacing w:before="60" w:after="60" w:line="264" w:lineRule="auto"/>
-            </w:pPr>
-            <w:r>
-              <w:rPr>
-                <w:rFonts w:ascii="Calibri" w:hAnsi="Calibri"/>
-                <w:color w:val="2D3748"/>
-                <w:sz w:val="19"/>
-              </w:rPr>
-              <w:t>.CSV e .XLSX</w:t>
-            </w:r>
-          </w:p>
-        </w:tc>
-        <w:tc>
-          <w:tcPr>
-            <w:tcW w:type="dxa" w:w="1987"/>
-          </w:tcPr>
-          <w:p>
-            <w:pPr>
-              <w:spacing w:before="60" w:after="60" w:line="264" w:lineRule="auto"/>
-            </w:pPr>
-            <w:r>
-              <w:rPr>
-                <w:rFonts w:ascii="Calibri" w:hAnsi="Calibri"/>
-                <w:color w:val="2D3748"/>
-                <w:sz w:val="19"/>
-              </w:rPr>
-              <w:t>Sistema Operacional + Planilhas</w:t>
-            </w:r>
-          </w:p>
-        </w:tc>
-        <w:tc>
-          <w:tcPr>
-            <w:tcW w:type="dxa" w:w="1987"/>
-          </w:tcPr>
-          <w:p>
-            <w:pPr>
-              <w:spacing w:before="60" w:after="60" w:line="264" w:lineRule="auto"/>
-            </w:pPr>
-            <w:r>
-              <w:rPr>
-                <w:rFonts w:ascii="Calibri" w:hAnsi="Calibri"/>
-                <w:color w:val="2D3748"/>
-                <w:sz w:val="19"/>
-              </w:rPr>
-              <w:t>Mensal</w:t>
-            </w:r>
-          </w:p>
-        </w:tc>
-      </w:tr>
-      <w:tr>
-        <w:tc>
-          <w:tcPr>
-            <w:tcW w:type="dxa" w:w="1987"/>
-            <w:shd w:fill="F7FAFC"/>
-          </w:tcPr>
-          <w:p>
-            <w:pPr>
-              <w:spacing w:before="60" w:after="60" w:line="264" w:lineRule="auto"/>
-            </w:pPr>
-            <w:r>
-              <w:rPr>
-                <w:rFonts w:ascii="Calibri" w:hAnsi="Calibri"/>
-                <w:color w:val="2D3748"/>
-                <w:sz w:val="19"/>
-              </w:rPr>
-              <w:t>Prêmios Operacionais</w:t>
-            </w:r>
-          </w:p>
-        </w:tc>
-        <w:tc>
-          <w:tcPr>
-            <w:tcW w:type="dxa" w:w="1987"/>
-            <w:shd w:fill="F7FAFC"/>
-          </w:tcPr>
-          <w:p>
-            <w:pPr>
-              <w:spacing w:before="60" w:after="60" w:line="264" w:lineRule="auto"/>
-            </w:pPr>
-            <w:r>
-              <w:rPr>
-                <w:rFonts w:ascii="Calibri" w:hAnsi="Calibri"/>
-                <w:color w:val="2D3748"/>
-                <w:sz w:val="19"/>
-              </w:rPr>
-              <w:t>Base Sistema + Base Manual</w:t>
-            </w:r>
-          </w:p>
-        </w:tc>
-        <w:tc>
-          <w:tcPr>
-            <w:tcW w:type="dxa" w:w="1987"/>
-            <w:shd w:fill="F7FAFC"/>
-          </w:tcPr>
-          <w:p>
-            <w:pPr>
-              <w:spacing w:before="60" w:after="60" w:line="264" w:lineRule="auto"/>
-            </w:pPr>
-            <w:r>
-              <w:rPr>
-                <w:rFonts w:ascii="Calibri" w:hAnsi="Calibri"/>
-                <w:color w:val="2D3748"/>
-                <w:sz w:val="19"/>
-              </w:rPr>
-              <w:t>.XLSX (ambos)</w:t>
-            </w:r>
-          </w:p>
-        </w:tc>
-        <w:tc>
-          <w:tcPr>
-            <w:tcW w:type="dxa" w:w="1987"/>
-            <w:shd w:fill="F7FAFC"/>
-          </w:tcPr>
-          <w:p>
-            <w:pPr>
-              <w:spacing w:before="60" w:after="60" w:line="264" w:lineRule="auto"/>
-            </w:pPr>
-            <w:r>
-              <w:rPr>
-                <w:rFonts w:ascii="Calibri" w:hAnsi="Calibri"/>
-                <w:color w:val="2D3748"/>
-                <w:sz w:val="19"/>
-              </w:rPr>
-              <w:t>Apuração de Metas Comerciais</w:t>
-            </w:r>
-          </w:p>
-        </w:tc>
-        <w:tc>
-          <w:tcPr>
-            <w:tcW w:type="dxa" w:w="1987"/>
-            <w:shd w:fill="F7FAFC"/>
-          </w:tcPr>
-          <w:p>
-            <w:pPr>
-              <w:spacing w:before="60" w:after="60" w:line="264" w:lineRule="auto"/>
-            </w:pPr>
-            <w:r>
-              <w:rPr>
-                <w:rFonts w:ascii="Calibri" w:hAnsi="Calibri"/>
-                <w:color w:val="2D3748"/>
-                <w:sz w:val="19"/>
-              </w:rPr>
-              <w:t>Mensal</w:t>
-            </w:r>
-          </w:p>
-        </w:tc>
-      </w:tr>
-      <w:tr>
-        <w:tc>
-          <w:tcPr>
-            <w:tcW w:type="dxa" w:w="1987"/>
-          </w:tcPr>
-          <w:p>
-            <w:pPr>
-              <w:spacing w:before="60" w:after="60" w:line="264" w:lineRule="auto"/>
-            </w:pPr>
-            <w:r>
-              <w:rPr>
-                <w:rFonts w:ascii="Calibri" w:hAnsi="Calibri"/>
-                <w:color w:val="2D3748"/>
-                <w:sz w:val="19"/>
-              </w:rPr>
-              <w:t>Escopos Mensais</w:t>
-            </w:r>
-          </w:p>
-        </w:tc>
-        <w:tc>
-          <w:tcPr>
-            <w:tcW w:type="dxa" w:w="1987"/>
-          </w:tcPr>
-          <w:p>
-            <w:pPr>
-              <w:spacing w:before="60" w:after="60" w:line="264" w:lineRule="auto"/>
-            </w:pPr>
-            <w:r>
-              <w:rPr>
-                <w:rFonts w:ascii="Calibri" w:hAnsi="Calibri"/>
-                <w:color w:val="2D3748"/>
-                <w:sz w:val="19"/>
-              </w:rPr>
-              <w:t>Cadastro no Sistema</w:t>
-            </w:r>
-          </w:p>
-        </w:tc>
-        <w:tc>
-          <w:tcPr>
-            <w:tcW w:type="dxa" w:w="1987"/>
-          </w:tcPr>
-          <w:p>
-            <w:pPr>
-              <w:spacing w:before="60" w:after="60" w:line="264" w:lineRule="auto"/>
-            </w:pPr>
-            <w:r>
-              <w:rPr>
-                <w:rFonts w:ascii="Calibri" w:hAnsi="Calibri"/>
-                <w:color w:val="2D3748"/>
-                <w:sz w:val="19"/>
-              </w:rPr>
-              <w:t>Interface Web</w:t>
-            </w:r>
-          </w:p>
-        </w:tc>
-        <w:tc>
-          <w:tcPr>
-            <w:tcW w:type="dxa" w:w="1987"/>
-          </w:tcPr>
-          <w:p>
-            <w:pPr>
-              <w:spacing w:before="60" w:after="60" w:line="264" w:lineRule="auto"/>
-            </w:pPr>
-            <w:r>
-              <w:rPr>
-                <w:rFonts w:ascii="Calibri" w:hAnsi="Calibri"/>
-                <w:color w:val="2D3748"/>
-                <w:sz w:val="19"/>
-              </w:rPr>
-              <w:t>Definição da Gerência</w:t>
-            </w:r>
-          </w:p>
-        </w:tc>
-        <w:tc>
-          <w:tcPr>
-            <w:tcW w:type="dxa" w:w="1987"/>
-          </w:tcPr>
-          <w:p>
-            <w:pPr>
-              <w:spacing w:before="60" w:after="60" w:line="264" w:lineRule="auto"/>
-            </w:pPr>
-            <w:r>
-              <w:rPr>
-                <w:rFonts w:ascii="Calibri" w:hAnsi="Calibri"/>
-                <w:color w:val="2D3748"/>
-                <w:sz w:val="19"/>
-              </w:rPr>
-              <w:t>Mensal</w:t>
-            </w:r>
-          </w:p>
-        </w:tc>
-      </w:tr>
-    </w:tbl>
-    <w:p>
-      <w:pPr>
-        <w:spacing w:before="0" w:after="80"/>
-      </w:pPr>
-    </w:p>
-    <w:p>
-      <w:pPr>
-        <w:pStyle w:val="Heading2"/>
-        <w:keepNext/>
-        <w:spacing w:before="240" w:after="80"/>
-      </w:pPr>
-      <w:r>
-        <w:rPr>
-          <w:rFonts w:ascii="Arial" w:hAnsi="Arial"/>
-          <w:b/>
-          <w:color w:val="007A87"/>
-          <w:sz w:val="26"/>
-        </w:rPr>
-        <w:t>2.2 Importação de Headcount e Colaboradores (TOTVS SRA)</w:t>
+        <w:t>2.1 Gestão de Usuários, Senhas e Permissões</w:t>
       </w:r>
     </w:p>
     <w:p>
@@ -2748,14 +1763,38 @@
           <w:color w:val="2D3748"/>
           <w:sz w:val="21"/>
         </w:rPr>
-        <w:t>A importação de colaboradores é a espinha dorsal do sistema. Ela atualiza a lista de funcionários ativos, cargos, lojas de lotação e datas de admissão/demissão.</w:t>
+        <w:t>O controle de quem acessa o sistema e o que cada usuário pode visualizar ou editar é feito no Menu Lateral &gt; Usuários:</w:t>
       </w:r>
     </w:p>
     <w:p>
       <w:pPr>
-        <w:pStyle w:val="ListBullet"/>
-        <w:spacing w:before="20" w:after="40" w:line="276" w:lineRule="auto"/>
-      </w:pPr>
+        <w:pStyle w:val="Heading3"/>
+        <w:keepNext/>
+        <w:spacing w:before="160" w:after="40"/>
+      </w:pPr>
+      <w:r>
+        <w:rPr>
+          <w:rFonts w:ascii="Calibri" w:hAnsi="Calibri"/>
+          <w:b/>
+          <w:color w:val="2D3748"/>
+          <w:sz w:val="23"/>
+        </w:rPr>
+        <w:t>A) Como Criar um Novo Usuário:</w:t>
+      </w:r>
+    </w:p>
+    <w:p>
+      <w:pPr>
+        <w:spacing w:before="40" w:after="60" w:line="276" w:lineRule="auto"/>
+      </w:pPr>
+      <w:r>
+        <w:rPr>
+          <w:rFonts w:ascii="Arial" w:hAnsi="Arial"/>
+          <w:b/>
+          <w:color w:val="007A87"/>
+          <w:sz w:val="20"/>
+        </w:rPr>
+        <w:t xml:space="preserve">1. </w:t>
+      </w:r>
       <w:r>
         <w:rPr>
           <w:rFonts w:ascii="Calibri" w:hAnsi="Calibri"/>
@@ -2763,7 +1802,7 @@
           <w:color w:val="2D3748"/>
           <w:sz w:val="21"/>
         </w:rPr>
-        <w:t xml:space="preserve">Onde importar: </w:t>
+        <w:t xml:space="preserve">Navegação: </w:t>
       </w:r>
       <w:r>
         <w:rPr>
@@ -2771,14 +1810,22 @@
           <w:color w:val="2D3748"/>
           <w:sz w:val="21"/>
         </w:rPr>
-        <w:t>Acesse o sistema e vá em Menu Lateral &gt; Configurações ou Colaboradores &gt; Importar Colaboradores.</w:t>
+        <w:t>Acesse o menu lateral esquerdo e clique em 'Usuários'.</w:t>
       </w:r>
     </w:p>
     <w:p>
       <w:pPr>
-        <w:pStyle w:val="ListBullet"/>
-        <w:spacing w:before="20" w:after="40" w:line="276" w:lineRule="auto"/>
-      </w:pPr>
+        <w:spacing w:before="40" w:after="60" w:line="276" w:lineRule="auto"/>
+      </w:pPr>
+      <w:r>
+        <w:rPr>
+          <w:rFonts w:ascii="Arial" w:hAnsi="Arial"/>
+          <w:b/>
+          <w:color w:val="007A87"/>
+          <w:sz w:val="20"/>
+        </w:rPr>
+        <w:t xml:space="preserve">2. </w:t>
+      </w:r>
       <w:r>
         <w:rPr>
           <w:rFonts w:ascii="Calibri" w:hAnsi="Calibri"/>
@@ -2786,7 +1833,7 @@
           <w:color w:val="2D3748"/>
           <w:sz w:val="21"/>
         </w:rPr>
-        <w:t xml:space="preserve">Arquivo esperado: </w:t>
+        <w:t xml:space="preserve">Abrir Modal: </w:t>
       </w:r>
       <w:r>
         <w:rPr>
@@ -2794,14 +1841,22 @@
           <w:color w:val="2D3748"/>
           <w:sz w:val="21"/>
         </w:rPr>
-        <w:t>Arquivo CSV exportado da tabela SRA010 do Protheus.</w:t>
+        <w:t>No canto superior direito da tela, clique no botão azul 'Novo Usuário'.</w:t>
       </w:r>
     </w:p>
     <w:p>
       <w:pPr>
-        <w:pStyle w:val="ListBullet"/>
-        <w:spacing w:before="20" w:after="40" w:line="276" w:lineRule="auto"/>
-      </w:pPr>
+        <w:spacing w:before="40" w:after="60" w:line="276" w:lineRule="auto"/>
+      </w:pPr>
+      <w:r>
+        <w:rPr>
+          <w:rFonts w:ascii="Arial" w:hAnsi="Arial"/>
+          <w:b/>
+          <w:color w:val="007A87"/>
+          <w:sz w:val="20"/>
+        </w:rPr>
+        <w:t xml:space="preserve">3. </w:t>
+      </w:r>
       <w:r>
         <w:rPr>
           <w:rFonts w:ascii="Calibri" w:hAnsi="Calibri"/>
@@ -2809,7 +1864,7 @@
           <w:color w:val="2D3748"/>
           <w:sz w:val="21"/>
         </w:rPr>
-        <w:t xml:space="preserve">Colunas fundamentais: </w:t>
+        <w:t xml:space="preserve">Preenchimento: </w:t>
       </w:r>
       <w:r>
         <w:rPr>
@@ -2817,14 +1872,22 @@
           <w:color w:val="2D3748"/>
           <w:sz w:val="21"/>
         </w:rPr>
-        <w:t>Matrícula/RE, Nome do Colaborador, CPF, Centro de Custo, Cargo, Data de Admissão, Data de Demissão e Situação da Folha.</w:t>
+        <w:t>Preencha o Nome de Usuário (login único), Nome Completo, E-mail corporativo e a Senha inicial de acesso.</w:t>
       </w:r>
     </w:p>
     <w:p>
       <w:pPr>
-        <w:pStyle w:val="ListBullet"/>
-        <w:spacing w:before="20" w:after="40" w:line="276" w:lineRule="auto"/>
-      </w:pPr>
+        <w:spacing w:before="40" w:after="60" w:line="276" w:lineRule="auto"/>
+      </w:pPr>
+      <w:r>
+        <w:rPr>
+          <w:rFonts w:ascii="Arial" w:hAnsi="Arial"/>
+          <w:b/>
+          <w:color w:val="007A87"/>
+          <w:sz w:val="20"/>
+        </w:rPr>
+        <w:t xml:space="preserve">4. </w:t>
+      </w:r>
       <w:r>
         <w:rPr>
           <w:rFonts w:ascii="Calibri" w:hAnsi="Calibri"/>
@@ -2832,7 +1895,7 @@
           <w:color w:val="2D3748"/>
           <w:sz w:val="21"/>
         </w:rPr>
-        <w:t xml:space="preserve">Como o sistema processa: </w:t>
+        <w:t xml:space="preserve">Perfil: </w:t>
       </w:r>
       <w:r>
         <w:rPr>
@@ -2840,7 +1903,1908 @@
           <w:color w:val="2D3748"/>
           <w:sz w:val="21"/>
         </w:rPr>
-        <w:t>O sistema lê o Centro de Custo e associa automaticamente o funcionário à filial correspondente cadastrada no módulo de Lojas.</w:t>
+        <w:t>Selecione o Grupo de Acesso (Função):</w:t>
+      </w:r>
+    </w:p>
+    <w:p>
+      <w:pPr>
+        <w:pStyle w:val="ListBullet"/>
+        <w:spacing w:before="20" w:after="40" w:line="276" w:lineRule="auto"/>
+      </w:pPr>
+      <w:r>
+        <w:rPr>
+          <w:rFonts w:ascii="Calibri" w:hAnsi="Calibri"/>
+          <w:b/>
+          <w:color w:val="2D3748"/>
+          <w:sz w:val="21"/>
+        </w:rPr>
+        <w:t xml:space="preserve">• Administrador: </w:t>
+      </w:r>
+      <w:r>
+        <w:rPr>
+          <w:rFonts w:ascii="Calibri" w:hAnsi="Calibri"/>
+          <w:color w:val="2D3748"/>
+          <w:sz w:val="21"/>
+        </w:rPr>
+        <w:t>Acesso irrestrito a todas as telas, configurações e gerenciamento de contas.</w:t>
+      </w:r>
+    </w:p>
+    <w:p>
+      <w:pPr>
+        <w:pStyle w:val="ListBullet"/>
+        <w:spacing w:before="20" w:after="40" w:line="276" w:lineRule="auto"/>
+      </w:pPr>
+      <w:r>
+        <w:rPr>
+          <w:rFonts w:ascii="Calibri" w:hAnsi="Calibri"/>
+          <w:b/>
+          <w:color w:val="2D3748"/>
+          <w:sz w:val="21"/>
+        </w:rPr>
+        <w:t xml:space="preserve">• Gestão: </w:t>
+      </w:r>
+      <w:r>
+        <w:rPr>
+          <w:rFonts w:ascii="Calibri" w:hAnsi="Calibri"/>
+          <w:color w:val="2D3748"/>
+          <w:sz w:val="21"/>
+        </w:rPr>
+        <w:t>Acesso para visualização de relatórios, lançamentos e importações de dados, sem acesso ao cadastro de novos administradores.</w:t>
+      </w:r>
+    </w:p>
+    <w:p>
+      <w:pPr>
+        <w:pStyle w:val="ListBullet"/>
+        <w:spacing w:before="20" w:after="40" w:line="276" w:lineRule="auto"/>
+      </w:pPr>
+      <w:r>
+        <w:rPr>
+          <w:rFonts w:ascii="Calibri" w:hAnsi="Calibri"/>
+          <w:b/>
+          <w:color w:val="2D3748"/>
+          <w:sz w:val="21"/>
+        </w:rPr>
+        <w:t xml:space="preserve">• Aprendiz: </w:t>
+      </w:r>
+      <w:r>
+        <w:rPr>
+          <w:rFonts w:ascii="Calibri" w:hAnsi="Calibri"/>
+          <w:color w:val="2D3748"/>
+          <w:sz w:val="21"/>
+        </w:rPr>
+        <w:t>Perfil restrito para consulta operacional e apoio.</w:t>
+      </w:r>
+    </w:p>
+    <w:p>
+      <w:pPr>
+        <w:spacing w:before="40" w:after="60" w:line="276" w:lineRule="auto"/>
+      </w:pPr>
+      <w:r>
+        <w:rPr>
+          <w:rFonts w:ascii="Arial" w:hAnsi="Arial"/>
+          <w:b/>
+          <w:color w:val="007A87"/>
+          <w:sz w:val="20"/>
+        </w:rPr>
+        <w:t xml:space="preserve">5. </w:t>
+      </w:r>
+      <w:r>
+        <w:rPr>
+          <w:rFonts w:ascii="Calibri" w:hAnsi="Calibri"/>
+          <w:b/>
+          <w:color w:val="2D3748"/>
+          <w:sz w:val="21"/>
+        </w:rPr>
+        <w:t xml:space="preserve">Concluir: </w:t>
+      </w:r>
+      <w:r>
+        <w:rPr>
+          <w:rFonts w:ascii="Calibri" w:hAnsi="Calibri"/>
+          <w:color w:val="2D3748"/>
+          <w:sz w:val="21"/>
+        </w:rPr>
+        <w:t>Clique em 'Salvar Usuário'. Se houver e-mail cadastrado, o sistema enviará uma mensagem de boas-vindas com as credenciais.</w:t>
+      </w:r>
+    </w:p>
+    <w:p>
+      <w:pPr>
+        <w:pStyle w:val="Heading3"/>
+        <w:keepNext/>
+        <w:spacing w:before="160" w:after="40"/>
+      </w:pPr>
+      <w:r>
+        <w:rPr>
+          <w:rFonts w:ascii="Calibri" w:hAnsi="Calibri"/>
+          <w:b/>
+          <w:color w:val="2D3748"/>
+          <w:sz w:val="23"/>
+        </w:rPr>
+        <w:t>B) Como Alterar a Senha de um Usuário Existente:</w:t>
+      </w:r>
+    </w:p>
+    <w:p>
+      <w:pPr>
+        <w:spacing w:before="40" w:after="60" w:line="276" w:lineRule="auto"/>
+      </w:pPr>
+      <w:r>
+        <w:rPr>
+          <w:rFonts w:ascii="Arial" w:hAnsi="Arial"/>
+          <w:b/>
+          <w:color w:val="007A87"/>
+          <w:sz w:val="20"/>
+        </w:rPr>
+        <w:t xml:space="preserve">1. </w:t>
+      </w:r>
+      <w:r>
+        <w:rPr>
+          <w:rFonts w:ascii="Calibri" w:hAnsi="Calibri"/>
+          <w:b/>
+          <w:color w:val="2D3748"/>
+          <w:sz w:val="21"/>
+        </w:rPr>
+        <w:t xml:space="preserve">Navegação: </w:t>
+      </w:r>
+      <w:r>
+        <w:rPr>
+          <w:rFonts w:ascii="Calibri" w:hAnsi="Calibri"/>
+          <w:color w:val="2D3748"/>
+          <w:sz w:val="21"/>
+        </w:rPr>
+        <w:t>Acesse 'Usuários' no menu lateral.</w:t>
+      </w:r>
+    </w:p>
+    <w:p>
+      <w:pPr>
+        <w:spacing w:before="40" w:after="60" w:line="276" w:lineRule="auto"/>
+      </w:pPr>
+      <w:r>
+        <w:rPr>
+          <w:rFonts w:ascii="Arial" w:hAnsi="Arial"/>
+          <w:b/>
+          <w:color w:val="007A87"/>
+          <w:sz w:val="20"/>
+        </w:rPr>
+        <w:t xml:space="preserve">2. </w:t>
+      </w:r>
+      <w:r>
+        <w:rPr>
+          <w:rFonts w:ascii="Calibri" w:hAnsi="Calibri"/>
+          <w:b/>
+          <w:color w:val="2D3748"/>
+          <w:sz w:val="21"/>
+        </w:rPr>
+        <w:t xml:space="preserve">Seleção: </w:t>
+      </w:r>
+      <w:r>
+        <w:rPr>
+          <w:rFonts w:ascii="Calibri" w:hAnsi="Calibri"/>
+          <w:color w:val="2D3748"/>
+          <w:sz w:val="21"/>
+        </w:rPr>
+        <w:t>Localize o usuário na tabela e clique sobre a linha dele (ou no ícone de lápis de edição).</w:t>
+      </w:r>
+    </w:p>
+    <w:p>
+      <w:pPr>
+        <w:spacing w:before="40" w:after="60" w:line="276" w:lineRule="auto"/>
+      </w:pPr>
+      <w:r>
+        <w:rPr>
+          <w:rFonts w:ascii="Arial" w:hAnsi="Arial"/>
+          <w:b/>
+          <w:color w:val="007A87"/>
+          <w:sz w:val="20"/>
+        </w:rPr>
+        <w:t xml:space="preserve">3. </w:t>
+      </w:r>
+      <w:r>
+        <w:rPr>
+          <w:rFonts w:ascii="Calibri" w:hAnsi="Calibri"/>
+          <w:b/>
+          <w:color w:val="2D3748"/>
+          <w:sz w:val="21"/>
+        </w:rPr>
+        <w:t xml:space="preserve">Definir Senha: </w:t>
+      </w:r>
+      <w:r>
+        <w:rPr>
+          <w:rFonts w:ascii="Calibri" w:hAnsi="Calibri"/>
+          <w:color w:val="2D3748"/>
+          <w:sz w:val="21"/>
+        </w:rPr>
+        <w:t>No formulário que abrir, localize o campo 'Nova Senha'. Digite a nova senha desejada.</w:t>
+      </w:r>
+    </w:p>
+    <w:p>
+      <w:pPr>
+        <w:spacing w:before="40" w:after="60" w:line="276" w:lineRule="auto"/>
+      </w:pPr>
+      <w:r>
+        <w:rPr>
+          <w:rFonts w:ascii="Arial" w:hAnsi="Arial"/>
+          <w:b/>
+          <w:color w:val="007A87"/>
+          <w:sz w:val="20"/>
+        </w:rPr>
+        <w:t xml:space="preserve">4. </w:t>
+      </w:r>
+      <w:r>
+        <w:rPr>
+          <w:rFonts w:ascii="Calibri" w:hAnsi="Calibri"/>
+          <w:b/>
+          <w:color w:val="2D3748"/>
+          <w:sz w:val="21"/>
+        </w:rPr>
+        <w:t xml:space="preserve">Confirmar: </w:t>
+      </w:r>
+      <w:r>
+        <w:rPr>
+          <w:rFonts w:ascii="Calibri" w:hAnsi="Calibri"/>
+          <w:color w:val="2D3748"/>
+          <w:sz w:val="21"/>
+        </w:rPr>
+        <w:t>Clique em 'Salvar Alterações'. A senha é criptografada imediatamente no banco de dados com algoritmo de alta segurança (PBKDF2/SHA256).</w:t>
+      </w:r>
+    </w:p>
+    <w:p>
+      <w:pPr>
+        <w:pStyle w:val="Heading3"/>
+        <w:keepNext/>
+        <w:spacing w:before="160" w:after="40"/>
+      </w:pPr>
+      <w:r>
+        <w:rPr>
+          <w:rFonts w:ascii="Calibri" w:hAnsi="Calibri"/>
+          <w:b/>
+          <w:color w:val="2D3748"/>
+          <w:sz w:val="23"/>
+        </w:rPr>
+        <w:t>C) Recuperação de Senha Esquecida (Pelo Próprio Usuário):</w:t>
+      </w:r>
+    </w:p>
+    <w:p>
+      <w:pPr>
+        <w:spacing w:before="40" w:after="60" w:line="276" w:lineRule="auto"/>
+      </w:pPr>
+      <w:r>
+        <w:rPr>
+          <w:rFonts w:ascii="Arial" w:hAnsi="Arial"/>
+          <w:b/>
+          <w:color w:val="007A87"/>
+          <w:sz w:val="20"/>
+        </w:rPr>
+        <w:t xml:space="preserve">1. </w:t>
+      </w:r>
+      <w:r>
+        <w:rPr>
+          <w:rFonts w:ascii="Calibri" w:hAnsi="Calibri"/>
+          <w:b/>
+          <w:color w:val="2D3748"/>
+          <w:sz w:val="21"/>
+        </w:rPr>
+        <w:t xml:space="preserve">Solicitação: </w:t>
+      </w:r>
+      <w:r>
+        <w:rPr>
+          <w:rFonts w:ascii="Calibri" w:hAnsi="Calibri"/>
+          <w:color w:val="2D3748"/>
+          <w:sz w:val="21"/>
+        </w:rPr>
+        <w:t>Na tela de login do sistema, clique no link 'Esqueci minha senha'.</w:t>
+      </w:r>
+    </w:p>
+    <w:p>
+      <w:pPr>
+        <w:spacing w:before="40" w:after="60" w:line="276" w:lineRule="auto"/>
+      </w:pPr>
+      <w:r>
+        <w:rPr>
+          <w:rFonts w:ascii="Arial" w:hAnsi="Arial"/>
+          <w:b/>
+          <w:color w:val="007A87"/>
+          <w:sz w:val="20"/>
+        </w:rPr>
+        <w:t xml:space="preserve">2. </w:t>
+      </w:r>
+      <w:r>
+        <w:rPr>
+          <w:rFonts w:ascii="Calibri" w:hAnsi="Calibri"/>
+          <w:b/>
+          <w:color w:val="2D3748"/>
+          <w:sz w:val="21"/>
+        </w:rPr>
+        <w:t xml:space="preserve">Identificação: </w:t>
+      </w:r>
+      <w:r>
+        <w:rPr>
+          <w:rFonts w:ascii="Calibri" w:hAnsi="Calibri"/>
+          <w:color w:val="2D3748"/>
+          <w:sz w:val="21"/>
+        </w:rPr>
+        <w:t>Digite o e-mail cadastrado no sistema e clique em 'Enviar Link'.</w:t>
+      </w:r>
+    </w:p>
+    <w:p>
+      <w:pPr>
+        <w:spacing w:before="40" w:after="60" w:line="276" w:lineRule="auto"/>
+      </w:pPr>
+      <w:r>
+        <w:rPr>
+          <w:rFonts w:ascii="Arial" w:hAnsi="Arial"/>
+          <w:b/>
+          <w:color w:val="007A87"/>
+          <w:sz w:val="20"/>
+        </w:rPr>
+        <w:t xml:space="preserve">3. </w:t>
+      </w:r>
+      <w:r>
+        <w:rPr>
+          <w:rFonts w:ascii="Calibri" w:hAnsi="Calibri"/>
+          <w:b/>
+          <w:color w:val="2D3748"/>
+          <w:sz w:val="21"/>
+        </w:rPr>
+        <w:t xml:space="preserve">E-mail: </w:t>
+      </w:r>
+      <w:r>
+        <w:rPr>
+          <w:rFonts w:ascii="Calibri" w:hAnsi="Calibri"/>
+          <w:color w:val="2D3748"/>
+          <w:sz w:val="21"/>
+        </w:rPr>
+        <w:t>O usuário receberá em sua caixa postal um link exclusivo de uso único com token seguro.</w:t>
+      </w:r>
+    </w:p>
+    <w:p>
+      <w:pPr>
+        <w:spacing w:before="40" w:after="60" w:line="276" w:lineRule="auto"/>
+      </w:pPr>
+      <w:r>
+        <w:rPr>
+          <w:rFonts w:ascii="Arial" w:hAnsi="Arial"/>
+          <w:b/>
+          <w:color w:val="007A87"/>
+          <w:sz w:val="20"/>
+        </w:rPr>
+        <w:t xml:space="preserve">4. </w:t>
+      </w:r>
+      <w:r>
+        <w:rPr>
+          <w:rFonts w:ascii="Calibri" w:hAnsi="Calibri"/>
+          <w:b/>
+          <w:color w:val="2D3748"/>
+          <w:sz w:val="21"/>
+        </w:rPr>
+        <w:t xml:space="preserve">Redefinição: </w:t>
+      </w:r>
+      <w:r>
+        <w:rPr>
+          <w:rFonts w:ascii="Calibri" w:hAnsi="Calibri"/>
+          <w:color w:val="2D3748"/>
+          <w:sz w:val="21"/>
+        </w:rPr>
+        <w:t>Ao clicar no link, abrirá a tela para digitar e confirmar a nova senha.</w:t>
+      </w:r>
+    </w:p>
+    <w:p>
+      <w:pPr>
+        <w:pStyle w:val="Heading2"/>
+        <w:keepNext/>
+        <w:spacing w:before="240" w:after="80"/>
+      </w:pPr>
+      <w:r>
+        <w:rPr>
+          <w:rFonts w:ascii="Arial" w:hAnsi="Arial"/>
+          <w:b/>
+          <w:color w:val="007A87"/>
+          <w:sz w:val="26"/>
+        </w:rPr>
+        <w:t>2.2 Gestão da Tabela Salarial e Cadastro de Cargos</w:t>
+      </w:r>
+    </w:p>
+    <w:p>
+      <w:pPr>
+        <w:spacing w:before="0" w:after="80" w:line="276" w:lineRule="auto"/>
+      </w:pPr>
+      <w:r>
+        <w:rPr>
+          <w:rFonts w:ascii="Calibri" w:hAnsi="Calibri"/>
+          <w:b w:val="0"/>
+          <w:i w:val="0"/>
+          <w:color w:val="2D3748"/>
+          <w:sz w:val="21"/>
+        </w:rPr>
+        <w:t>A tabela de salários alimenta os cálculos de folha de pagamento projetada, custo médio de turnover e orçamentos de escopo. Ela fica localizada em Menu Lateral &gt; Salários:</w:t>
+      </w:r>
+    </w:p>
+    <w:p>
+      <w:pPr>
+        <w:pStyle w:val="Heading3"/>
+        <w:keepNext/>
+        <w:spacing w:before="160" w:after="40"/>
+      </w:pPr>
+      <w:r>
+        <w:rPr>
+          <w:rFonts w:ascii="Calibri" w:hAnsi="Calibri"/>
+          <w:b/>
+          <w:color w:val="2D3748"/>
+          <w:sz w:val="23"/>
+        </w:rPr>
+        <w:t>A) Como Criar um Novo Cargo:</w:t>
+      </w:r>
+    </w:p>
+    <w:p>
+      <w:pPr>
+        <w:spacing w:before="40" w:after="60" w:line="276" w:lineRule="auto"/>
+      </w:pPr>
+      <w:r>
+        <w:rPr>
+          <w:rFonts w:ascii="Arial" w:hAnsi="Arial"/>
+          <w:b/>
+          <w:color w:val="007A87"/>
+          <w:sz w:val="20"/>
+        </w:rPr>
+        <w:t xml:space="preserve">1. </w:t>
+      </w:r>
+      <w:r>
+        <w:rPr>
+          <w:rFonts w:ascii="Calibri" w:hAnsi="Calibri"/>
+          <w:b/>
+          <w:color w:val="2D3748"/>
+          <w:sz w:val="21"/>
+        </w:rPr>
+        <w:t xml:space="preserve">Navegação: </w:t>
+      </w:r>
+      <w:r>
+        <w:rPr>
+          <w:rFonts w:ascii="Calibri" w:hAnsi="Calibri"/>
+          <w:color w:val="2D3748"/>
+          <w:sz w:val="21"/>
+        </w:rPr>
+        <w:t>Acesse a tela 'Salários'.</w:t>
+      </w:r>
+    </w:p>
+    <w:p>
+      <w:pPr>
+        <w:spacing w:before="40" w:after="60" w:line="276" w:lineRule="auto"/>
+      </w:pPr>
+      <w:r>
+        <w:rPr>
+          <w:rFonts w:ascii="Arial" w:hAnsi="Arial"/>
+          <w:b/>
+          <w:color w:val="007A87"/>
+          <w:sz w:val="20"/>
+        </w:rPr>
+        <w:t xml:space="preserve">2. </w:t>
+      </w:r>
+      <w:r>
+        <w:rPr>
+          <w:rFonts w:ascii="Calibri" w:hAnsi="Calibri"/>
+          <w:b/>
+          <w:color w:val="2D3748"/>
+          <w:sz w:val="21"/>
+        </w:rPr>
+        <w:t xml:space="preserve">Abrir Modal: </w:t>
+      </w:r>
+      <w:r>
+        <w:rPr>
+          <w:rFonts w:ascii="Calibri" w:hAnsi="Calibri"/>
+          <w:color w:val="2D3748"/>
+          <w:sz w:val="21"/>
+        </w:rPr>
+        <w:t>No topo da tela, clique no botão cinza 'Novo Cargo' (ao lado de 'Novo Salário').</w:t>
+      </w:r>
+    </w:p>
+    <w:p>
+      <w:pPr>
+        <w:spacing w:before="40" w:after="60" w:line="276" w:lineRule="auto"/>
+      </w:pPr>
+      <w:r>
+        <w:rPr>
+          <w:rFonts w:ascii="Arial" w:hAnsi="Arial"/>
+          <w:b/>
+          <w:color w:val="007A87"/>
+          <w:sz w:val="20"/>
+        </w:rPr>
+        <w:t xml:space="preserve">3. </w:t>
+      </w:r>
+      <w:r>
+        <w:rPr>
+          <w:rFonts w:ascii="Calibri" w:hAnsi="Calibri"/>
+          <w:b/>
+          <w:color w:val="2D3748"/>
+          <w:sz w:val="21"/>
+        </w:rPr>
+        <w:t xml:space="preserve">Nomeclatura: </w:t>
+      </w:r>
+      <w:r>
+        <w:rPr>
+          <w:rFonts w:ascii="Calibri" w:hAnsi="Calibri"/>
+          <w:color w:val="2D3748"/>
+          <w:sz w:val="21"/>
+        </w:rPr>
+        <w:t>Digite o nome exato do novo cargo (ex: 'LÍDER DE LOJA', 'OPERADOR DE CAIXA', 'SUBGERENTE').</w:t>
+      </w:r>
+    </w:p>
+    <w:p>
+      <w:pPr>
+        <w:spacing w:before="40" w:after="60" w:line="276" w:lineRule="auto"/>
+      </w:pPr>
+      <w:r>
+        <w:rPr>
+          <w:rFonts w:ascii="Arial" w:hAnsi="Arial"/>
+          <w:b/>
+          <w:color w:val="007A87"/>
+          <w:sz w:val="20"/>
+        </w:rPr>
+        <w:t xml:space="preserve">4. </w:t>
+      </w:r>
+      <w:r>
+        <w:rPr>
+          <w:rFonts w:ascii="Calibri" w:hAnsi="Calibri"/>
+          <w:b/>
+          <w:color w:val="2D3748"/>
+          <w:sz w:val="21"/>
+        </w:rPr>
+        <w:t xml:space="preserve">Confirmar: </w:t>
+      </w:r>
+      <w:r>
+        <w:rPr>
+          <w:rFonts w:ascii="Calibri" w:hAnsi="Calibri"/>
+          <w:color w:val="2D3748"/>
+          <w:sz w:val="21"/>
+        </w:rPr>
+        <w:t>Clique em 'Salvar Cargo'. O novo cargo fica imediatamente disponível para receber valores de salário por estado.</w:t>
+      </w:r>
+    </w:p>
+    <w:p>
+      <w:pPr>
+        <w:pStyle w:val="Heading3"/>
+        <w:keepNext/>
+        <w:spacing w:before="160" w:after="40"/>
+      </w:pPr>
+      <w:r>
+        <w:rPr>
+          <w:rFonts w:ascii="Calibri" w:hAnsi="Calibri"/>
+          <w:b/>
+          <w:color w:val="2D3748"/>
+          <w:sz w:val="23"/>
+        </w:rPr>
+        <w:t>B) Como Criar um Novo Salário:</w:t>
+      </w:r>
+    </w:p>
+    <w:p>
+      <w:pPr>
+        <w:spacing w:before="40" w:after="60" w:line="276" w:lineRule="auto"/>
+      </w:pPr>
+      <w:r>
+        <w:rPr>
+          <w:rFonts w:ascii="Arial" w:hAnsi="Arial"/>
+          <w:b/>
+          <w:color w:val="007A87"/>
+          <w:sz w:val="20"/>
+        </w:rPr>
+        <w:t xml:space="preserve">1. </w:t>
+      </w:r>
+      <w:r>
+        <w:rPr>
+          <w:rFonts w:ascii="Calibri" w:hAnsi="Calibri"/>
+          <w:b/>
+          <w:color w:val="2D3748"/>
+          <w:sz w:val="21"/>
+        </w:rPr>
+        <w:t xml:space="preserve">Abrir Modal: </w:t>
+      </w:r>
+      <w:r>
+        <w:rPr>
+          <w:rFonts w:ascii="Calibri" w:hAnsi="Calibri"/>
+          <w:color w:val="2D3748"/>
+          <w:sz w:val="21"/>
+        </w:rPr>
+        <w:t>Na tela 'Salários', clique no botão azul 'Novo Salário'.</w:t>
+      </w:r>
+    </w:p>
+    <w:p>
+      <w:pPr>
+        <w:spacing w:before="40" w:after="60" w:line="276" w:lineRule="auto"/>
+      </w:pPr>
+      <w:r>
+        <w:rPr>
+          <w:rFonts w:ascii="Arial" w:hAnsi="Arial"/>
+          <w:b/>
+          <w:color w:val="007A87"/>
+          <w:sz w:val="20"/>
+        </w:rPr>
+        <w:t xml:space="preserve">2. </w:t>
+      </w:r>
+      <w:r>
+        <w:rPr>
+          <w:rFonts w:ascii="Calibri" w:hAnsi="Calibri"/>
+          <w:b/>
+          <w:color w:val="2D3748"/>
+          <w:sz w:val="21"/>
+        </w:rPr>
+        <w:t xml:space="preserve">Cargo: </w:t>
+      </w:r>
+      <w:r>
+        <w:rPr>
+          <w:rFonts w:ascii="Calibri" w:hAnsi="Calibri"/>
+          <w:color w:val="2D3748"/>
+          <w:sz w:val="21"/>
+        </w:rPr>
+        <w:t>No campo 'Cargo', selecione o cargo desejado na lista pesquisável.</w:t>
+      </w:r>
+    </w:p>
+    <w:p>
+      <w:pPr>
+        <w:spacing w:before="40" w:after="60" w:line="276" w:lineRule="auto"/>
+      </w:pPr>
+      <w:r>
+        <w:rPr>
+          <w:rFonts w:ascii="Arial" w:hAnsi="Arial"/>
+          <w:b/>
+          <w:color w:val="007A87"/>
+          <w:sz w:val="20"/>
+        </w:rPr>
+        <w:t xml:space="preserve">3. </w:t>
+      </w:r>
+      <w:r>
+        <w:rPr>
+          <w:rFonts w:ascii="Calibri" w:hAnsi="Calibri"/>
+          <w:b/>
+          <w:color w:val="2D3748"/>
+          <w:sz w:val="21"/>
+        </w:rPr>
+        <w:t xml:space="preserve">Estado (UF): </w:t>
+      </w:r>
+      <w:r>
+        <w:rPr>
+          <w:rFonts w:ascii="Calibri" w:hAnsi="Calibri"/>
+          <w:color w:val="2D3748"/>
+          <w:sz w:val="21"/>
+        </w:rPr>
+        <w:t>Selecione o Estado (UF) em que esse salário é vigente (ex: SP, RJ, MG, PR ou 'BR' para nacional).</w:t>
+      </w:r>
+    </w:p>
+    <w:p>
+      <w:pPr>
+        <w:spacing w:before="40" w:after="60" w:line="276" w:lineRule="auto"/>
+      </w:pPr>
+      <w:r>
+        <w:rPr>
+          <w:rFonts w:ascii="Arial" w:hAnsi="Arial"/>
+          <w:b/>
+          <w:color w:val="007A87"/>
+          <w:sz w:val="20"/>
+        </w:rPr>
+        <w:t xml:space="preserve">4. </w:t>
+      </w:r>
+      <w:r>
+        <w:rPr>
+          <w:rFonts w:ascii="Calibri" w:hAnsi="Calibri"/>
+          <w:b/>
+          <w:color w:val="2D3748"/>
+          <w:sz w:val="21"/>
+        </w:rPr>
+        <w:t xml:space="preserve">Ano: </w:t>
+      </w:r>
+      <w:r>
+        <w:rPr>
+          <w:rFonts w:ascii="Calibri" w:hAnsi="Calibri"/>
+          <w:color w:val="2D3748"/>
+          <w:sz w:val="21"/>
+        </w:rPr>
+        <w:t>Informe o Ano de vigência (ex: 2026).</w:t>
+      </w:r>
+    </w:p>
+    <w:p>
+      <w:pPr>
+        <w:spacing w:before="40" w:after="60" w:line="276" w:lineRule="auto"/>
+      </w:pPr>
+      <w:r>
+        <w:rPr>
+          <w:rFonts w:ascii="Arial" w:hAnsi="Arial"/>
+          <w:b/>
+          <w:color w:val="007A87"/>
+          <w:sz w:val="20"/>
+        </w:rPr>
+        <w:t xml:space="preserve">5. </w:t>
+      </w:r>
+      <w:r>
+        <w:rPr>
+          <w:rFonts w:ascii="Calibri" w:hAnsi="Calibri"/>
+          <w:b/>
+          <w:color w:val="2D3748"/>
+          <w:sz w:val="21"/>
+        </w:rPr>
+        <w:t xml:space="preserve">Valor (R$): </w:t>
+      </w:r>
+      <w:r>
+        <w:rPr>
+          <w:rFonts w:ascii="Calibri" w:hAnsi="Calibri"/>
+          <w:color w:val="2D3748"/>
+          <w:sz w:val="21"/>
+        </w:rPr>
+        <w:t>Digite o Valor do salário base em reais (ex: 1850.00).</w:t>
+      </w:r>
+    </w:p>
+    <w:p>
+      <w:pPr>
+        <w:spacing w:before="40" w:after="60" w:line="276" w:lineRule="auto"/>
+      </w:pPr>
+      <w:r>
+        <w:rPr>
+          <w:rFonts w:ascii="Arial" w:hAnsi="Arial"/>
+          <w:b/>
+          <w:color w:val="007A87"/>
+          <w:sz w:val="20"/>
+        </w:rPr>
+        <w:t xml:space="preserve">6. </w:t>
+      </w:r>
+      <w:r>
+        <w:rPr>
+          <w:rFonts w:ascii="Calibri" w:hAnsi="Calibri"/>
+          <w:b/>
+          <w:color w:val="2D3748"/>
+          <w:sz w:val="21"/>
+        </w:rPr>
+        <w:t xml:space="preserve">Confirmar: </w:t>
+      </w:r>
+      <w:r>
+        <w:rPr>
+          <w:rFonts w:ascii="Calibri" w:hAnsi="Calibri"/>
+          <w:color w:val="2D3748"/>
+          <w:sz w:val="21"/>
+        </w:rPr>
+        <w:t>Clique em 'Salvar'. O sistema registrará a vigência salarial.</w:t>
+      </w:r>
+    </w:p>
+    <w:p>
+      <w:pPr>
+        <w:pStyle w:val="Heading3"/>
+        <w:keepNext/>
+        <w:spacing w:before="160" w:after="40"/>
+      </w:pPr>
+      <w:r>
+        <w:rPr>
+          <w:rFonts w:ascii="Calibri" w:hAnsi="Calibri"/>
+          <w:b/>
+          <w:color w:val="2D3748"/>
+          <w:sz w:val="23"/>
+        </w:rPr>
+        <w:t>C) Como Alterar o Valor de um Salário Existente:</w:t>
+      </w:r>
+    </w:p>
+    <w:p>
+      <w:pPr>
+        <w:spacing w:before="40" w:after="60" w:line="276" w:lineRule="auto"/>
+      </w:pPr>
+      <w:r>
+        <w:rPr>
+          <w:rFonts w:ascii="Arial" w:hAnsi="Arial"/>
+          <w:b/>
+          <w:color w:val="007A87"/>
+          <w:sz w:val="20"/>
+        </w:rPr>
+        <w:t xml:space="preserve">1. </w:t>
+      </w:r>
+      <w:r>
+        <w:rPr>
+          <w:rFonts w:ascii="Calibri" w:hAnsi="Calibri"/>
+          <w:b/>
+          <w:color w:val="2D3748"/>
+          <w:sz w:val="21"/>
+        </w:rPr>
+        <w:t xml:space="preserve">Localizar: </w:t>
+      </w:r>
+      <w:r>
+        <w:rPr>
+          <w:rFonts w:ascii="Calibri" w:hAnsi="Calibri"/>
+          <w:color w:val="2D3748"/>
+          <w:sz w:val="21"/>
+        </w:rPr>
+        <w:t>Utilize os filtros no topo da tela para encontrar o salário desejado (filtre por Cargo, UF ou Ano).</w:t>
+      </w:r>
+    </w:p>
+    <w:p>
+      <w:pPr>
+        <w:spacing w:before="40" w:after="60" w:line="276" w:lineRule="auto"/>
+      </w:pPr>
+      <w:r>
+        <w:rPr>
+          <w:rFonts w:ascii="Arial" w:hAnsi="Arial"/>
+          <w:b/>
+          <w:color w:val="007A87"/>
+          <w:sz w:val="20"/>
+        </w:rPr>
+        <w:t xml:space="preserve">2. </w:t>
+      </w:r>
+      <w:r>
+        <w:rPr>
+          <w:rFonts w:ascii="Calibri" w:hAnsi="Calibri"/>
+          <w:b/>
+          <w:color w:val="2D3748"/>
+          <w:sz w:val="21"/>
+        </w:rPr>
+        <w:t xml:space="preserve">Editar: </w:t>
+      </w:r>
+      <w:r>
+        <w:rPr>
+          <w:rFonts w:ascii="Calibri" w:hAnsi="Calibri"/>
+          <w:color w:val="2D3748"/>
+          <w:sz w:val="21"/>
+        </w:rPr>
+        <w:t>Na linha do salário que deseja alterar, clique no ícone de Lápis (Editar) no canto direito.</w:t>
+      </w:r>
+    </w:p>
+    <w:p>
+      <w:pPr>
+        <w:spacing w:before="40" w:after="60" w:line="276" w:lineRule="auto"/>
+      </w:pPr>
+      <w:r>
+        <w:rPr>
+          <w:rFonts w:ascii="Arial" w:hAnsi="Arial"/>
+          <w:b/>
+          <w:color w:val="007A87"/>
+          <w:sz w:val="20"/>
+        </w:rPr>
+        <w:t xml:space="preserve">3. </w:t>
+      </w:r>
+      <w:r>
+        <w:rPr>
+          <w:rFonts w:ascii="Calibri" w:hAnsi="Calibri"/>
+          <w:b/>
+          <w:color w:val="2D3748"/>
+          <w:sz w:val="21"/>
+        </w:rPr>
+        <w:t xml:space="preserve">Ajuste: </w:t>
+      </w:r>
+      <w:r>
+        <w:rPr>
+          <w:rFonts w:ascii="Calibri" w:hAnsi="Calibri"/>
+          <w:color w:val="2D3748"/>
+          <w:sz w:val="21"/>
+        </w:rPr>
+        <w:t>Altere o campo 'Valor (R$)' para o novo montante reajustado.</w:t>
+      </w:r>
+    </w:p>
+    <w:p>
+      <w:pPr>
+        <w:spacing w:before="40" w:after="60" w:line="276" w:lineRule="auto"/>
+      </w:pPr>
+      <w:r>
+        <w:rPr>
+          <w:rFonts w:ascii="Arial" w:hAnsi="Arial"/>
+          <w:b/>
+          <w:color w:val="007A87"/>
+          <w:sz w:val="20"/>
+        </w:rPr>
+        <w:t xml:space="preserve">4. </w:t>
+      </w:r>
+      <w:r>
+        <w:rPr>
+          <w:rFonts w:ascii="Calibri" w:hAnsi="Calibri"/>
+          <w:b/>
+          <w:color w:val="2D3748"/>
+          <w:sz w:val="21"/>
+        </w:rPr>
+        <w:t xml:space="preserve">Concluir: </w:t>
+      </w:r>
+      <w:r>
+        <w:rPr>
+          <w:rFonts w:ascii="Calibri" w:hAnsi="Calibri"/>
+          <w:color w:val="2D3748"/>
+          <w:sz w:val="21"/>
+        </w:rPr>
+        <w:t>Clique em 'Salvar'. Todos os relatórios e cálculos do sistema passarão a usar o novo valor automaticamente.</w:t>
+      </w:r>
+    </w:p>
+    <w:p>
+      <w:pPr>
+        <w:pStyle w:val="Heading2"/>
+        <w:keepNext/>
+        <w:spacing w:before="240" w:after="80"/>
+      </w:pPr>
+      <w:r>
+        <w:rPr>
+          <w:rFonts w:ascii="Arial" w:hAnsi="Arial"/>
+          <w:b/>
+          <w:color w:val="007A87"/>
+          <w:sz w:val="26"/>
+        </w:rPr>
+        <w:t>2.3 Guia Passo a Passo: Como Obter os Arquivos no TOTVS Protheus</w:t>
+      </w:r>
+    </w:p>
+    <w:p>
+      <w:pPr>
+        <w:spacing w:before="0" w:after="80" w:line="276" w:lineRule="auto"/>
+      </w:pPr>
+      <w:r>
+        <w:rPr>
+          <w:rFonts w:ascii="Calibri" w:hAnsi="Calibri"/>
+          <w:b w:val="0"/>
+          <w:i w:val="0"/>
+          <w:color w:val="2D3748"/>
+          <w:sz w:val="21"/>
+        </w:rPr>
+        <w:t>Abaixo está o roteiro de cliques para extrair com exatidão cada um dos arquivos necessários no ERP TOTVS Protheus:</w:t>
+      </w:r>
+    </w:p>
+    <w:p>
+      <w:pPr>
+        <w:pStyle w:val="Heading3"/>
+        <w:keepNext/>
+        <w:spacing w:before="160" w:after="40"/>
+      </w:pPr>
+      <w:r>
+        <w:rPr>
+          <w:rFonts w:ascii="Calibri" w:hAnsi="Calibri"/>
+          <w:b/>
+          <w:color w:val="2D3748"/>
+          <w:sz w:val="23"/>
+        </w:rPr>
+        <w:t>A) Extração do Arquivo SRA (Colaboradores e Headcount):</w:t>
+      </w:r>
+    </w:p>
+    <w:p>
+      <w:pPr>
+        <w:spacing w:before="40" w:after="60" w:line="276" w:lineRule="auto"/>
+      </w:pPr>
+      <w:r>
+        <w:rPr>
+          <w:rFonts w:ascii="Arial" w:hAnsi="Arial"/>
+          <w:b/>
+          <w:color w:val="007A87"/>
+          <w:sz w:val="20"/>
+        </w:rPr>
+        <w:t xml:space="preserve">1. </w:t>
+      </w:r>
+      <w:r>
+        <w:rPr>
+          <w:rFonts w:ascii="Calibri" w:hAnsi="Calibri"/>
+          <w:b/>
+          <w:color w:val="2D3748"/>
+          <w:sz w:val="21"/>
+        </w:rPr>
+        <w:t xml:space="preserve">Acesso: </w:t>
+      </w:r>
+      <w:r>
+        <w:rPr>
+          <w:rFonts w:ascii="Calibri" w:hAnsi="Calibri"/>
+          <w:color w:val="2D3748"/>
+          <w:sz w:val="21"/>
+        </w:rPr>
+        <w:t>Faça login no sistema TOTVS Protheus.</w:t>
+      </w:r>
+    </w:p>
+    <w:p>
+      <w:pPr>
+        <w:spacing w:before="40" w:after="60" w:line="276" w:lineRule="auto"/>
+      </w:pPr>
+      <w:r>
+        <w:rPr>
+          <w:rFonts w:ascii="Arial" w:hAnsi="Arial"/>
+          <w:b/>
+          <w:color w:val="007A87"/>
+          <w:sz w:val="20"/>
+        </w:rPr>
+        <w:t xml:space="preserve">2. </w:t>
+      </w:r>
+      <w:r>
+        <w:rPr>
+          <w:rFonts w:ascii="Calibri" w:hAnsi="Calibri"/>
+          <w:b/>
+          <w:color w:val="2D3748"/>
+          <w:sz w:val="21"/>
+        </w:rPr>
+        <w:t xml:space="preserve">Menu: </w:t>
+      </w:r>
+      <w:r>
+        <w:rPr>
+          <w:rFonts w:ascii="Calibri" w:hAnsi="Calibri"/>
+          <w:color w:val="2D3748"/>
+          <w:sz w:val="21"/>
+        </w:rPr>
+        <w:t>Na parte esquerda da tela, localize e clique na aba de 'Consultas'.</w:t>
+      </w:r>
+    </w:p>
+    <w:p>
+      <w:pPr>
+        <w:spacing w:before="40" w:after="60" w:line="276" w:lineRule="auto"/>
+      </w:pPr>
+      <w:r>
+        <w:rPr>
+          <w:rFonts w:ascii="Arial" w:hAnsi="Arial"/>
+          <w:b/>
+          <w:color w:val="007A87"/>
+          <w:sz w:val="20"/>
+        </w:rPr>
+        <w:t xml:space="preserve">3. </w:t>
+      </w:r>
+      <w:r>
+        <w:rPr>
+          <w:rFonts w:ascii="Calibri" w:hAnsi="Calibri"/>
+          <w:b/>
+          <w:color w:val="2D3748"/>
+          <w:sz w:val="21"/>
+        </w:rPr>
+        <w:t xml:space="preserve">Submenu: </w:t>
+      </w:r>
+      <w:r>
+        <w:rPr>
+          <w:rFonts w:ascii="Calibri" w:hAnsi="Calibri"/>
+          <w:color w:val="2D3748"/>
+          <w:sz w:val="21"/>
+        </w:rPr>
+        <w:t>Clique na opção 'Genéricos'.</w:t>
+      </w:r>
+    </w:p>
+    <w:p>
+      <w:pPr>
+        <w:spacing w:before="40" w:after="60" w:line="276" w:lineRule="auto"/>
+      </w:pPr>
+      <w:r>
+        <w:rPr>
+          <w:rFonts w:ascii="Arial" w:hAnsi="Arial"/>
+          <w:b/>
+          <w:color w:val="007A87"/>
+          <w:sz w:val="20"/>
+        </w:rPr>
+        <w:t xml:space="preserve">4. </w:t>
+      </w:r>
+      <w:r>
+        <w:rPr>
+          <w:rFonts w:ascii="Calibri" w:hAnsi="Calibri"/>
+          <w:b/>
+          <w:color w:val="2D3748"/>
+          <w:sz w:val="21"/>
+        </w:rPr>
+        <w:t xml:space="preserve">Pesquisa: </w:t>
+      </w:r>
+      <w:r>
+        <w:rPr>
+          <w:rFonts w:ascii="Calibri" w:hAnsi="Calibri"/>
+          <w:color w:val="2D3748"/>
+          <w:sz w:val="21"/>
+        </w:rPr>
+        <w:t>Na barra de pesquisa, digite 'sra' e pressione Enter.</w:t>
+      </w:r>
+    </w:p>
+    <w:p>
+      <w:pPr>
+        <w:spacing w:before="40" w:after="60" w:line="276" w:lineRule="auto"/>
+      </w:pPr>
+      <w:r>
+        <w:rPr>
+          <w:rFonts w:ascii="Arial" w:hAnsi="Arial"/>
+          <w:b/>
+          <w:color w:val="007A87"/>
+          <w:sz w:val="20"/>
+        </w:rPr>
+        <w:t xml:space="preserve">5. </w:t>
+      </w:r>
+      <w:r>
+        <w:rPr>
+          <w:rFonts w:ascii="Calibri" w:hAnsi="Calibri"/>
+          <w:b/>
+          <w:color w:val="2D3748"/>
+          <w:sz w:val="21"/>
+        </w:rPr>
+        <w:t xml:space="preserve">Seleção: </w:t>
+      </w:r>
+      <w:r>
+        <w:rPr>
+          <w:rFonts w:ascii="Calibri" w:hAnsi="Calibri"/>
+          <w:color w:val="2D3748"/>
+          <w:sz w:val="21"/>
+        </w:rPr>
+        <w:t>Dê 2 cliques no resultado 'SRA'.</w:t>
+      </w:r>
+    </w:p>
+    <w:p>
+      <w:pPr>
+        <w:spacing w:before="40" w:after="60" w:line="276" w:lineRule="auto"/>
+      </w:pPr>
+      <w:r>
+        <w:rPr>
+          <w:rFonts w:ascii="Arial" w:hAnsi="Arial"/>
+          <w:b/>
+          <w:color w:val="007A87"/>
+          <w:sz w:val="20"/>
+        </w:rPr>
+        <w:t xml:space="preserve">6. </w:t>
+      </w:r>
+      <w:r>
+        <w:rPr>
+          <w:rFonts w:ascii="Calibri" w:hAnsi="Calibri"/>
+          <w:b/>
+          <w:color w:val="2D3748"/>
+          <w:sz w:val="21"/>
+        </w:rPr>
+        <w:t xml:space="preserve">Exportar: </w:t>
+      </w:r>
+      <w:r>
+        <w:rPr>
+          <w:rFonts w:ascii="Calibri" w:hAnsi="Calibri"/>
+          <w:color w:val="2D3748"/>
+          <w:sz w:val="21"/>
+        </w:rPr>
+        <w:t>Na parte inferior da tela, clique no botão 'Exp. CSV'.</w:t>
+      </w:r>
+    </w:p>
+    <w:p>
+      <w:pPr>
+        <w:spacing w:before="40" w:after="60" w:line="276" w:lineRule="auto"/>
+      </w:pPr>
+      <w:r>
+        <w:rPr>
+          <w:rFonts w:ascii="Arial" w:hAnsi="Arial"/>
+          <w:b/>
+          <w:color w:val="007A87"/>
+          <w:sz w:val="20"/>
+        </w:rPr>
+        <w:t xml:space="preserve">7. </w:t>
+      </w:r>
+      <w:r>
+        <w:rPr>
+          <w:rFonts w:ascii="Calibri" w:hAnsi="Calibri"/>
+          <w:b/>
+          <w:color w:val="2D3748"/>
+          <w:sz w:val="21"/>
+        </w:rPr>
+        <w:t xml:space="preserve">Confirmação: </w:t>
+      </w:r>
+      <w:r>
+        <w:rPr>
+          <w:rFonts w:ascii="Calibri" w:hAnsi="Calibri"/>
+          <w:color w:val="2D3748"/>
+          <w:sz w:val="21"/>
+        </w:rPr>
+        <w:t>Não altere nenhuma configuração na janela que abrir e clique em 'Confirmar'. O arquivo será baixado no computador.</w:t>
+      </w:r>
+    </w:p>
+    <w:p>
+      <w:pPr>
+        <w:spacing w:before="40" w:after="60" w:line="276" w:lineRule="auto"/>
+      </w:pPr>
+      <w:r>
+        <w:rPr>
+          <w:rFonts w:ascii="Arial" w:hAnsi="Arial"/>
+          <w:b/>
+          <w:color w:val="007A87"/>
+          <w:sz w:val="20"/>
+        </w:rPr>
+        <w:t xml:space="preserve">8. </w:t>
+      </w:r>
+      <w:r>
+        <w:rPr>
+          <w:rFonts w:ascii="Calibri" w:hAnsi="Calibri"/>
+          <w:b/>
+          <w:color w:val="2D3748"/>
+          <w:sz w:val="21"/>
+        </w:rPr>
+        <w:t xml:space="preserve">Conversão Obrigatória: </w:t>
+      </w:r>
+      <w:r>
+        <w:rPr>
+          <w:rFonts w:ascii="Calibri" w:hAnsi="Calibri"/>
+          <w:color w:val="2D3748"/>
+          <w:sz w:val="21"/>
+        </w:rPr>
+        <w:t>Abra o arquivo baixado no Excel, vá em Arquivo &gt; Salvar Como e selecione o formato 'CSV UTF-8 (delimitado por vírgulas) (*.csv)'.</w:t>
+      </w:r>
+    </w:p>
+    <w:p>
+      <w:pPr>
+        <w:spacing w:before="40" w:after="60" w:line="276" w:lineRule="auto"/>
+      </w:pPr>
+      <w:r>
+        <w:rPr>
+          <w:rFonts w:ascii="Arial" w:hAnsi="Arial"/>
+          <w:b/>
+          <w:color w:val="007A87"/>
+          <w:sz w:val="20"/>
+        </w:rPr>
+        <w:t xml:space="preserve">9. </w:t>
+      </w:r>
+      <w:r>
+        <w:rPr>
+          <w:rFonts w:ascii="Calibri" w:hAnsi="Calibri"/>
+          <w:b/>
+          <w:color w:val="2D3748"/>
+          <w:sz w:val="21"/>
+        </w:rPr>
+        <w:t xml:space="preserve">Importação: </w:t>
+      </w:r>
+      <w:r>
+        <w:rPr>
+          <w:rFonts w:ascii="Calibri" w:hAnsi="Calibri"/>
+          <w:color w:val="2D3748"/>
+          <w:sz w:val="21"/>
+        </w:rPr>
+        <w:t>Pronto! O arquivo agora pode ser importado diretamente no Sistema de Análises Operacionais.</w:t>
+      </w:r>
+    </w:p>
+    <w:p>
+      <w:pPr>
+        <w:pStyle w:val="Heading3"/>
+        <w:keepNext/>
+        <w:spacing w:before="160" w:after="40"/>
+      </w:pPr>
+      <w:r>
+        <w:rPr>
+          <w:rFonts w:ascii="Calibri" w:hAnsi="Calibri"/>
+          <w:b/>
+          <w:color w:val="2D3748"/>
+          <w:sz w:val="23"/>
+        </w:rPr>
+        <w:t>B) Extração do Arquivo SRG (Termos de Rescisão / Turnover):</w:t>
+      </w:r>
+    </w:p>
+    <w:p>
+      <w:pPr>
+        <w:spacing w:before="40" w:after="60" w:line="276" w:lineRule="auto"/>
+      </w:pPr>
+      <w:r>
+        <w:rPr>
+          <w:rFonts w:ascii="Arial" w:hAnsi="Arial"/>
+          <w:b/>
+          <w:color w:val="007A87"/>
+          <w:sz w:val="20"/>
+        </w:rPr>
+        <w:t xml:space="preserve">1. </w:t>
+      </w:r>
+      <w:r>
+        <w:rPr>
+          <w:rFonts w:ascii="Calibri" w:hAnsi="Calibri"/>
+          <w:b/>
+          <w:color w:val="2D3748"/>
+          <w:sz w:val="21"/>
+        </w:rPr>
+        <w:t xml:space="preserve">Navegação: </w:t>
+      </w:r>
+      <w:r>
+        <w:rPr>
+          <w:rFonts w:ascii="Calibri" w:hAnsi="Calibri"/>
+          <w:color w:val="2D3748"/>
+          <w:sz w:val="21"/>
+        </w:rPr>
+        <w:t>Siga exatamente o mesmo caminho do SRA: Acesse TOTVS &gt; Consultas &gt; Genéricos.</w:t>
+      </w:r>
+    </w:p>
+    <w:p>
+      <w:pPr>
+        <w:spacing w:before="40" w:after="60" w:line="276" w:lineRule="auto"/>
+      </w:pPr>
+      <w:r>
+        <w:rPr>
+          <w:rFonts w:ascii="Arial" w:hAnsi="Arial"/>
+          <w:b/>
+          <w:color w:val="007A87"/>
+          <w:sz w:val="20"/>
+        </w:rPr>
+        <w:t xml:space="preserve">2. </w:t>
+      </w:r>
+      <w:r>
+        <w:rPr>
+          <w:rFonts w:ascii="Calibri" w:hAnsi="Calibri"/>
+          <w:b/>
+          <w:color w:val="2D3748"/>
+          <w:sz w:val="21"/>
+        </w:rPr>
+        <w:t xml:space="preserve">Pesquisa: </w:t>
+      </w:r>
+      <w:r>
+        <w:rPr>
+          <w:rFonts w:ascii="Calibri" w:hAnsi="Calibri"/>
+          <w:color w:val="2D3748"/>
+          <w:sz w:val="21"/>
+        </w:rPr>
+        <w:t>Ao invés de pesquisar por 'sra', pesquise por 'srg'.</w:t>
+      </w:r>
+    </w:p>
+    <w:p>
+      <w:pPr>
+        <w:spacing w:before="40" w:after="60" w:line="276" w:lineRule="auto"/>
+      </w:pPr>
+      <w:r>
+        <w:rPr>
+          <w:rFonts w:ascii="Arial" w:hAnsi="Arial"/>
+          <w:b/>
+          <w:color w:val="007A87"/>
+          <w:sz w:val="20"/>
+        </w:rPr>
+        <w:t xml:space="preserve">3. </w:t>
+      </w:r>
+      <w:r>
+        <w:rPr>
+          <w:rFonts w:ascii="Calibri" w:hAnsi="Calibri"/>
+          <w:b/>
+          <w:color w:val="2D3748"/>
+          <w:sz w:val="21"/>
+        </w:rPr>
+        <w:t xml:space="preserve">Seleção: </w:t>
+      </w:r>
+      <w:r>
+        <w:rPr>
+          <w:rFonts w:ascii="Calibri" w:hAnsi="Calibri"/>
+          <w:color w:val="2D3748"/>
+          <w:sz w:val="21"/>
+        </w:rPr>
+        <w:t>Dê 2 cliques no resultado 'SRG'.</w:t>
+      </w:r>
+    </w:p>
+    <w:p>
+      <w:pPr>
+        <w:spacing w:before="40" w:after="60" w:line="276" w:lineRule="auto"/>
+      </w:pPr>
+      <w:r>
+        <w:rPr>
+          <w:rFonts w:ascii="Arial" w:hAnsi="Arial"/>
+          <w:b/>
+          <w:color w:val="007A87"/>
+          <w:sz w:val="20"/>
+        </w:rPr>
+        <w:t xml:space="preserve">4. </w:t>
+      </w:r>
+      <w:r>
+        <w:rPr>
+          <w:rFonts w:ascii="Calibri" w:hAnsi="Calibri"/>
+          <w:b/>
+          <w:color w:val="2D3748"/>
+          <w:sz w:val="21"/>
+        </w:rPr>
+        <w:t xml:space="preserve">Exportar: </w:t>
+      </w:r>
+      <w:r>
+        <w:rPr>
+          <w:rFonts w:ascii="Calibri" w:hAnsi="Calibri"/>
+          <w:color w:val="2D3748"/>
+          <w:sz w:val="21"/>
+        </w:rPr>
+        <w:t>Na parte inferior da tela, clique no botão 'Exp. CSV', confirme sem alterar nada e baixe o arquivo.</w:t>
+      </w:r>
+    </w:p>
+    <w:p>
+      <w:pPr>
+        <w:spacing w:before="40" w:after="60" w:line="276" w:lineRule="auto"/>
+      </w:pPr>
+      <w:r>
+        <w:rPr>
+          <w:rFonts w:ascii="Arial" w:hAnsi="Arial"/>
+          <w:b/>
+          <w:color w:val="007A87"/>
+          <w:sz w:val="20"/>
+        </w:rPr>
+        <w:t xml:space="preserve">5. </w:t>
+      </w:r>
+      <w:r>
+        <w:rPr>
+          <w:rFonts w:ascii="Calibri" w:hAnsi="Calibri"/>
+          <w:b/>
+          <w:color w:val="2D3748"/>
+          <w:sz w:val="21"/>
+        </w:rPr>
+        <w:t xml:space="preserve">Importação Direta: </w:t>
+      </w:r>
+      <w:r>
+        <w:rPr>
+          <w:rFonts w:ascii="Calibri" w:hAnsi="Calibri"/>
+          <w:color w:val="2D3748"/>
+          <w:sz w:val="21"/>
+        </w:rPr>
+        <w:t>Diferente do SRA, o SRG não necessita de nenhuma conversão no Excel! Pode importar diretamente no sistema do jeito que foi baixado.</w:t>
+      </w:r>
+    </w:p>
+    <w:p>
+      <w:pPr>
+        <w:pStyle w:val="Heading3"/>
+        <w:keepNext/>
+        <w:spacing w:before="160" w:after="40"/>
+      </w:pPr>
+      <w:r>
+        <w:rPr>
+          <w:rFonts w:ascii="Calibri" w:hAnsi="Calibri"/>
+          <w:b/>
+          <w:color w:val="2D3748"/>
+          <w:sz w:val="23"/>
+        </w:rPr>
+        <w:t>C) Extração de Valores de Rescisão - TOTVS Líquidos (GPER020):</w:t>
+      </w:r>
+    </w:p>
+    <w:p>
+      <w:pPr>
+        <w:spacing w:before="40" w:after="60" w:line="276" w:lineRule="auto"/>
+      </w:pPr>
+      <w:r>
+        <w:rPr>
+          <w:rFonts w:ascii="Arial" w:hAnsi="Arial"/>
+          <w:b/>
+          <w:color w:val="007A87"/>
+          <w:sz w:val="20"/>
+        </w:rPr>
+        <w:t xml:space="preserve">1. </w:t>
+      </w:r>
+      <w:r>
+        <w:rPr>
+          <w:rFonts w:ascii="Calibri" w:hAnsi="Calibri"/>
+          <w:b/>
+          <w:color w:val="2D3748"/>
+          <w:sz w:val="21"/>
+        </w:rPr>
+        <w:t xml:space="preserve">Pesquisa: </w:t>
+      </w:r>
+      <w:r>
+        <w:rPr>
+          <w:rFonts w:ascii="Calibri" w:hAnsi="Calibri"/>
+          <w:color w:val="2D3748"/>
+          <w:sz w:val="21"/>
+        </w:rPr>
+        <w:t>Na página inicial do TOTVS, vá na barra de pesquisa localizada à esquerda e pesquise por 'liquido' (ou 'líquido').</w:t>
+      </w:r>
+    </w:p>
+    <w:p>
+      <w:pPr>
+        <w:spacing w:before="40" w:after="60" w:line="276" w:lineRule="auto"/>
+      </w:pPr>
+      <w:r>
+        <w:rPr>
+          <w:rFonts w:ascii="Arial" w:hAnsi="Arial"/>
+          <w:b/>
+          <w:color w:val="007A87"/>
+          <w:sz w:val="20"/>
+        </w:rPr>
+        <w:t xml:space="preserve">2. </w:t>
+      </w:r>
+      <w:r>
+        <w:rPr>
+          <w:rFonts w:ascii="Calibri" w:hAnsi="Calibri"/>
+          <w:b/>
+          <w:color w:val="2D3748"/>
+          <w:sz w:val="21"/>
+        </w:rPr>
+        <w:t xml:space="preserve">Módulo: </w:t>
+      </w:r>
+      <w:r>
+        <w:rPr>
+          <w:rFonts w:ascii="Calibri" w:hAnsi="Calibri"/>
+          <w:color w:val="2D3748"/>
+          <w:sz w:val="21"/>
+        </w:rPr>
+        <w:t>Na janela que abrir, vá em 'Gestão de Pessoal'.</w:t>
+      </w:r>
+    </w:p>
+    <w:p>
+      <w:pPr>
+        <w:spacing w:before="40" w:after="60" w:line="276" w:lineRule="auto"/>
+      </w:pPr>
+      <w:r>
+        <w:rPr>
+          <w:rFonts w:ascii="Arial" w:hAnsi="Arial"/>
+          <w:b/>
+          <w:color w:val="007A87"/>
+          <w:sz w:val="20"/>
+        </w:rPr>
+        <w:t xml:space="preserve">3. </w:t>
+      </w:r>
+      <w:r>
+        <w:rPr>
+          <w:rFonts w:ascii="Calibri" w:hAnsi="Calibri"/>
+          <w:b/>
+          <w:color w:val="2D3748"/>
+          <w:sz w:val="21"/>
+        </w:rPr>
+        <w:t xml:space="preserve">Rotina: </w:t>
+      </w:r>
+      <w:r>
+        <w:rPr>
+          <w:rFonts w:ascii="Calibri" w:hAnsi="Calibri"/>
+          <w:color w:val="2D3748"/>
+          <w:sz w:val="21"/>
+        </w:rPr>
+        <w:t>Na seção de 'Periódicos', clique na opção 'Líquidos'.</w:t>
+      </w:r>
+    </w:p>
+    <w:p>
+      <w:pPr>
+        <w:spacing w:before="40" w:after="60" w:line="276" w:lineRule="auto"/>
+      </w:pPr>
+      <w:r>
+        <w:rPr>
+          <w:rFonts w:ascii="Arial" w:hAnsi="Arial"/>
+          <w:b/>
+          <w:color w:val="007A87"/>
+          <w:sz w:val="20"/>
+        </w:rPr>
+        <w:t xml:space="preserve">4. </w:t>
+      </w:r>
+      <w:r>
+        <w:rPr>
+          <w:rFonts w:ascii="Calibri" w:hAnsi="Calibri"/>
+          <w:b/>
+          <w:color w:val="2D3748"/>
+          <w:sz w:val="21"/>
+        </w:rPr>
+        <w:t xml:space="preserve">Configuração de Parâmetros: </w:t>
+      </w:r>
+      <w:r>
+        <w:rPr>
+          <w:rFonts w:ascii="Calibri" w:hAnsi="Calibri"/>
+          <w:color w:val="2D3748"/>
+          <w:sz w:val="21"/>
+        </w:rPr>
+        <w:t>Na janela de parâmetros que se abrirá, configure exatamente os campos abaixo:</w:t>
+      </w:r>
+    </w:p>
+    <w:p>
+      <w:pPr>
+        <w:pStyle w:val="ListBullet"/>
+        <w:spacing w:before="20" w:after="40" w:line="276" w:lineRule="auto"/>
+      </w:pPr>
+      <w:r>
+        <w:rPr>
+          <w:rFonts w:ascii="Calibri" w:hAnsi="Calibri"/>
+          <w:b/>
+          <w:color w:val="2D3748"/>
+          <w:sz w:val="21"/>
+        </w:rPr>
+        <w:t xml:space="preserve">• À esquerda (Tipo de saída): </w:t>
+      </w:r>
+      <w:r>
+        <w:rPr>
+          <w:rFonts w:ascii="Calibri" w:hAnsi="Calibri"/>
+          <w:color w:val="2D3748"/>
+          <w:sz w:val="21"/>
+        </w:rPr>
+        <w:t>Selecione a opção 'Planilha'.</w:t>
+      </w:r>
+    </w:p>
+    <w:p>
+      <w:pPr>
+        <w:pStyle w:val="ListBullet"/>
+        <w:spacing w:before="20" w:after="40" w:line="276" w:lineRule="auto"/>
+      </w:pPr>
+      <w:r>
+        <w:rPr>
+          <w:rFonts w:ascii="Calibri" w:hAnsi="Calibri"/>
+          <w:b/>
+          <w:color w:val="2D3748"/>
+          <w:sz w:val="21"/>
+        </w:rPr>
+        <w:t xml:space="preserve">• À direita (Tipo de planilha): </w:t>
+      </w:r>
+      <w:r>
+        <w:rPr>
+          <w:rFonts w:ascii="Calibri" w:hAnsi="Calibri"/>
+          <w:color w:val="2D3748"/>
+          <w:sz w:val="21"/>
+        </w:rPr>
+        <w:t>Altere a opção 'Tipo de planilha' para 'Formato de tabela'.</w:t>
+      </w:r>
+    </w:p>
+    <w:p>
+      <w:pPr>
+        <w:pStyle w:val="ListBullet"/>
+        <w:spacing w:before="20" w:after="40" w:line="276" w:lineRule="auto"/>
+      </w:pPr>
+      <w:r>
+        <w:rPr>
+          <w:rFonts w:ascii="Calibri" w:hAnsi="Calibri"/>
+          <w:b/>
+          <w:color w:val="2D3748"/>
+          <w:sz w:val="21"/>
+        </w:rPr>
+        <w:t xml:space="preserve">• Configurações de Ordem: </w:t>
+      </w:r>
+      <w:r>
+        <w:rPr>
+          <w:rFonts w:ascii="Calibri" w:hAnsi="Calibri"/>
+          <w:color w:val="2D3748"/>
+          <w:sz w:val="21"/>
+        </w:rPr>
+        <w:t>Mude a opção 'Ordem' para 'Filial+Bco/Ag.+Cc+Mat'.</w:t>
+      </w:r>
+    </w:p>
+    <w:p>
+      <w:pPr>
+        <w:pStyle w:val="ListBullet"/>
+        <w:spacing w:before="20" w:after="40" w:line="276" w:lineRule="auto"/>
+      </w:pPr>
+      <w:r>
+        <w:rPr>
+          <w:rFonts w:ascii="Calibri" w:hAnsi="Calibri"/>
+          <w:b/>
+          <w:color w:val="2D3748"/>
+          <w:sz w:val="21"/>
+        </w:rPr>
+        <w:t xml:space="preserve">• Parâmetros de Filtro: </w:t>
+      </w:r>
+      <w:r>
+        <w:rPr>
+          <w:rFonts w:ascii="Calibri" w:hAnsi="Calibri"/>
+          <w:color w:val="2D3748"/>
+          <w:sz w:val="21"/>
+        </w:rPr>
+        <w:t>Na parte inferior, em 'Outras Ações', verifique se os parâmetros estão preenchidos como 'RES' (Rescisão).</w:t>
+      </w:r>
+    </w:p>
+    <w:p>
+      <w:pPr>
+        <w:spacing w:before="40" w:after="60" w:line="276" w:lineRule="auto"/>
+      </w:pPr>
+      <w:r>
+        <w:rPr>
+          <w:rFonts w:ascii="Arial" w:hAnsi="Arial"/>
+          <w:b/>
+          <w:color w:val="007A87"/>
+          <w:sz w:val="20"/>
+        </w:rPr>
+        <w:t xml:space="preserve">5. </w:t>
+      </w:r>
+      <w:r>
+        <w:rPr>
+          <w:rFonts w:ascii="Calibri" w:hAnsi="Calibri"/>
+          <w:b/>
+          <w:color w:val="2D3748"/>
+          <w:sz w:val="21"/>
+        </w:rPr>
+        <w:t xml:space="preserve">Gerar Relatório: </w:t>
+      </w:r>
+      <w:r>
+        <w:rPr>
+          <w:rFonts w:ascii="Calibri" w:hAnsi="Calibri"/>
+          <w:color w:val="2D3748"/>
+          <w:sz w:val="21"/>
+        </w:rPr>
+        <w:t>Clique em 'Imprimir'. O relatório em formato tabela (.xml ou .xlsx) será gerado.</w:t>
+      </w:r>
+    </w:p>
+    <w:p>
+      <w:pPr>
+        <w:spacing w:before="40" w:after="60" w:line="276" w:lineRule="auto"/>
+      </w:pPr>
+      <w:r>
+        <w:rPr>
+          <w:rFonts w:ascii="Arial" w:hAnsi="Arial"/>
+          <w:b/>
+          <w:color w:val="007A87"/>
+          <w:sz w:val="20"/>
+        </w:rPr>
+        <w:t xml:space="preserve">6. </w:t>
+      </w:r>
+      <w:r>
+        <w:rPr>
+          <w:rFonts w:ascii="Calibri" w:hAnsi="Calibri"/>
+          <w:b/>
+          <w:color w:val="2D3748"/>
+          <w:sz w:val="21"/>
+        </w:rPr>
+        <w:t xml:space="preserve">Importação: </w:t>
+      </w:r>
+      <w:r>
+        <w:rPr>
+          <w:rFonts w:ascii="Calibri" w:hAnsi="Calibri"/>
+          <w:color w:val="2D3748"/>
+          <w:sz w:val="21"/>
+        </w:rPr>
+        <w:t>Pode ser importado no sistema exatamente do jeito que for baixado!</w:t>
+      </w:r>
+    </w:p>
+    <w:p>
+      <w:pPr>
+        <w:pStyle w:val="Heading3"/>
+        <w:keepNext/>
+        <w:spacing w:before="160" w:after="40"/>
+      </w:pPr>
+      <w:r>
+        <w:rPr>
+          <w:rFonts w:ascii="Calibri" w:hAnsi="Calibri"/>
+          <w:b/>
+          <w:color w:val="2D3748"/>
+          <w:sz w:val="23"/>
+        </w:rPr>
+        <w:t>D) Extração do Arquivo SRD (Folha de Pagamento Sintética/Analítica):</w:t>
+      </w:r>
+    </w:p>
+    <w:p>
+      <w:pPr>
+        <w:spacing w:before="40" w:after="60" w:line="276" w:lineRule="auto"/>
+      </w:pPr>
+      <w:r>
+        <w:rPr>
+          <w:rFonts w:ascii="Arial" w:hAnsi="Arial"/>
+          <w:b/>
+          <w:color w:val="007A87"/>
+          <w:sz w:val="20"/>
+        </w:rPr>
+        <w:t xml:space="preserve">1. </w:t>
+      </w:r>
+      <w:r>
+        <w:rPr>
+          <w:rFonts w:ascii="Calibri" w:hAnsi="Calibri"/>
+          <w:b/>
+          <w:color w:val="2D3748"/>
+          <w:sz w:val="21"/>
+        </w:rPr>
+        <w:t xml:space="preserve">Navegação: </w:t>
+      </w:r>
+      <w:r>
+        <w:rPr>
+          <w:rFonts w:ascii="Calibri" w:hAnsi="Calibri"/>
+          <w:color w:val="2D3748"/>
+          <w:sz w:val="21"/>
+        </w:rPr>
+        <w:t>Acesse TOTVS &gt; Consultas &gt; Genéricos, pesquise por 'srd' e dê 2 cliques no 'SRD'.</w:t>
+      </w:r>
+    </w:p>
+    <w:p>
+      <w:pPr>
+        <w:spacing w:before="40" w:after="60" w:line="276" w:lineRule="auto"/>
+      </w:pPr>
+      <w:r>
+        <w:rPr>
+          <w:rFonts w:ascii="Arial" w:hAnsi="Arial"/>
+          <w:b/>
+          <w:color w:val="007A87"/>
+          <w:sz w:val="20"/>
+        </w:rPr>
+        <w:t xml:space="preserve">2. </w:t>
+      </w:r>
+      <w:r>
+        <w:rPr>
+          <w:rFonts w:ascii="Calibri" w:hAnsi="Calibri"/>
+          <w:b/>
+          <w:color w:val="2D3748"/>
+          <w:sz w:val="21"/>
+        </w:rPr>
+        <w:t xml:space="preserve">Abrir Filtro: </w:t>
+      </w:r>
+      <w:r>
+        <w:rPr>
+          <w:rFonts w:ascii="Calibri" w:hAnsi="Calibri"/>
+          <w:color w:val="2D3748"/>
+          <w:sz w:val="21"/>
+        </w:rPr>
+        <w:t>Na parte superior direita da janela (bem próximo ao botão 'X' de fechar a aba), clique na opção 'Filtrar'.</w:t>
+      </w:r>
+    </w:p>
+    <w:p>
+      <w:pPr>
+        <w:spacing w:before="40" w:after="60" w:line="276" w:lineRule="auto"/>
+      </w:pPr>
+      <w:r>
+        <w:rPr>
+          <w:rFonts w:ascii="Arial" w:hAnsi="Arial"/>
+          <w:b/>
+          <w:color w:val="007A87"/>
+          <w:sz w:val="20"/>
+        </w:rPr>
+        <w:t xml:space="preserve">3. </w:t>
+      </w:r>
+      <w:r>
+        <w:rPr>
+          <w:rFonts w:ascii="Calibri" w:hAnsi="Calibri"/>
+          <w:b/>
+          <w:color w:val="2D3748"/>
+          <w:sz w:val="21"/>
+        </w:rPr>
+        <w:t xml:space="preserve">Criação de Filtros Obrigatórios: </w:t>
+      </w:r>
+      <w:r>
+        <w:rPr>
+          <w:rFonts w:ascii="Calibri" w:hAnsi="Calibri"/>
+          <w:color w:val="2D3748"/>
+          <w:sz w:val="21"/>
+        </w:rPr>
+        <w:t>Crie 2 filtros SEPARADAMENTE:</w:t>
+      </w:r>
+    </w:p>
+    <w:p>
+      <w:pPr>
+        <w:pStyle w:val="ListBullet"/>
+        <w:spacing w:before="20" w:after="40" w:line="276" w:lineRule="auto"/>
+      </w:pPr>
+      <w:r>
+        <w:rPr>
+          <w:rFonts w:ascii="Calibri" w:hAnsi="Calibri"/>
+          <w:b/>
+          <w:color w:val="2D3748"/>
+          <w:sz w:val="21"/>
+        </w:rPr>
+        <w:t xml:space="preserve">• Filtro 1 (Data Inicial): </w:t>
+      </w:r>
+      <w:r>
+        <w:rPr>
+          <w:rFonts w:ascii="Calibri" w:hAnsi="Calibri"/>
+          <w:color w:val="2D3748"/>
+          <w:sz w:val="21"/>
+        </w:rPr>
+        <w:t>Campo: 'Dt. Pagamento'  |  Operador: 'Maior ou igual a'  |  Expressão: [Selecione a data inicial do período]</w:t>
+      </w:r>
+    </w:p>
+    <w:p>
+      <w:pPr>
+        <w:pStyle w:val="ListBullet"/>
+        <w:spacing w:before="20" w:after="40" w:line="276" w:lineRule="auto"/>
+      </w:pPr>
+      <w:r>
+        <w:rPr>
+          <w:rFonts w:ascii="Calibri" w:hAnsi="Calibri"/>
+          <w:b/>
+          <w:color w:val="2D3748"/>
+          <w:sz w:val="21"/>
+        </w:rPr>
+        <w:t xml:space="preserve">• Filtro 2 (Data Final): </w:t>
+      </w:r>
+      <w:r>
+        <w:rPr>
+          <w:rFonts w:ascii="Calibri" w:hAnsi="Calibri"/>
+          <w:color w:val="2D3748"/>
+          <w:sz w:val="21"/>
+        </w:rPr>
+        <w:t>Campo: 'Dt. Pagamento'  |  Operador: 'Menor ou igual a'  |  Expressão: [Selecione a data final do período]</w:t>
+      </w:r>
+    </w:p>
+    <w:p>
+      <w:pPr>
+        <w:spacing w:before="40" w:after="60" w:line="276" w:lineRule="auto"/>
+      </w:pPr>
+      <w:r>
+        <w:rPr>
+          <w:rFonts w:ascii="Arial" w:hAnsi="Arial"/>
+          <w:b/>
+          <w:color w:val="007A87"/>
+          <w:sz w:val="20"/>
+        </w:rPr>
+        <w:t xml:space="preserve">4. </w:t>
+      </w:r>
+      <w:r>
+        <w:rPr>
+          <w:rFonts w:ascii="Calibri" w:hAnsi="Calibri"/>
+          <w:b/>
+          <w:color w:val="2D3748"/>
+          <w:sz w:val="21"/>
+        </w:rPr>
+        <w:t xml:space="preserve">Exportar: </w:t>
+      </w:r>
+      <w:r>
+        <w:rPr>
+          <w:rFonts w:ascii="Calibri" w:hAnsi="Calibri"/>
+          <w:color w:val="2D3748"/>
+          <w:sz w:val="21"/>
+        </w:rPr>
+        <w:t>Após criar e aplicar ambos os filtros, clique no botão 'Exp. CSV' na parte inferior da tela.</w:t>
+      </w:r>
+    </w:p>
+    <w:p>
+      <w:pPr>
+        <w:spacing w:before="40" w:after="60" w:line="276" w:lineRule="auto"/>
+      </w:pPr>
+      <w:r>
+        <w:rPr>
+          <w:rFonts w:ascii="Arial" w:hAnsi="Arial"/>
+          <w:b/>
+          <w:color w:val="007A87"/>
+          <w:sz w:val="20"/>
+        </w:rPr>
+        <w:t xml:space="preserve">5. </w:t>
+      </w:r>
+      <w:r>
+        <w:rPr>
+          <w:rFonts w:ascii="Calibri" w:hAnsi="Calibri"/>
+          <w:b/>
+          <w:color w:val="2D3748"/>
+          <w:sz w:val="21"/>
+        </w:rPr>
+        <w:t xml:space="preserve">Importação Direta: </w:t>
+      </w:r>
+      <w:r>
+        <w:rPr>
+          <w:rFonts w:ascii="Calibri" w:hAnsi="Calibri"/>
+          <w:color w:val="2D3748"/>
+          <w:sz w:val="21"/>
+        </w:rPr>
+        <w:t>O arquivo pode ser importado no sistema diretamente, sem necessidade de edições.</w:t>
       </w:r>
     </w:p>
     <w:tbl>
@@ -2856,7 +3820,7 @@
         <w:tc>
           <w:tcPr>
             <w:tcW w:type="dxa" w:w="9936"/>
-            <w:shd w:fill="F0FFF4"/>
+            <w:shd w:fill="FFFAF0"/>
             <w:tcMar>
               <w:top w:w="120" w:type="dxa"/>
               <w:bottom w:w="120" w:type="dxa"/>
@@ -2865,7 +3829,7 @@
             </w:tcMar>
             <w:tcBorders>
               <w:top w:val="none"/>
-              <w:left w:val="single" w:sz="36" w:space="0" w:color="38A169"/>
+              <w:left w:val="single" w:sz="36" w:space="0" w:color="DD6B20"/>
               <w:bottom w:val="none"/>
               <w:right w:val="none"/>
             </w:tcBorders>
@@ -2878,10 +3842,10 @@
               <w:rPr>
                 <w:rFonts w:ascii="Calibri" w:hAnsi="Calibri"/>
                 <w:b/>
-                <w:color w:val="38A169"/>
+                <w:color w:val="DD6B20"/>
                 <w:sz w:val="21"/>
               </w:rPr>
-              <w:t xml:space="preserve">📌 DICA DE FORMATAÇÃO DO CSV: </w:t>
+              <w:t xml:space="preserve">📌 LEMBRETE FUNDAMENTAL SOBRE A DATA DA FOLHA (SRD): </w:t>
             </w:r>
             <w:r>
               <w:rPr>
@@ -2889,7 +3853,7 @@
                 <w:color w:val="2D3748"/>
                 <w:sz w:val="20"/>
               </w:rPr>
-              <w:t>Certifique-se de salvar o arquivo CSV com codificação UTF-8 ou ISO-8859-1 (Padrão Windows ANSI). Se o arquivo contiver acentos desformatados, o sistema possui decodificador inteligente integrado para corrigir automaticamente.</w:t>
+              <w:t>Os dados baixados no SRD com o filtro de 01/09/2026 a 30/09/2026 referem-se contabilmente à folha do MÊS 8 (Agosto)! Isso acontece porque o campo 'Dt. Pagamento' reflete a data em que o salário caiu na conta (5º dia útil do mês seguinte). Sempre selecione o mês correto de referência no sistema na hora da carga.</w:t>
             </w:r>
           </w:p>
         </w:tc>
@@ -2913,7 +3877,7 @@
           <w:color w:val="007A87"/>
           <w:sz w:val="26"/>
         </w:rPr>
-        <w:t>2.3 Ponto Eletrônico e Ausências (GeoVictoria)</w:t>
+        <w:t>2.4 Como Importar os Arquivos Dentro do Sistema</w:t>
       </w:r>
     </w:p>
     <w:p>
@@ -2928,22 +3892,37 @@
           <w:color w:val="2D3748"/>
           <w:sz w:val="21"/>
         </w:rPr>
-        <w:t>O sistema monitora absenteísmo (faltas não justificadas, atestados médicos e suspensões). Existem duas formas de atualizar:</w:t>
+        <w:t>Com os arquivos extraídos do TOTVS e salvos em seu computador, siga os passos de carga nas telas do sistema:</w:t>
       </w:r>
     </w:p>
     <w:p>
       <w:pPr>
-        <w:pStyle w:val="ListBullet"/>
-        <w:spacing w:before="20" w:after="40" w:line="276" w:lineRule="auto"/>
+        <w:pStyle w:val="Heading3"/>
+        <w:keepNext/>
+        <w:spacing w:before="160" w:after="40"/>
       </w:pPr>
       <w:r>
         <w:rPr>
           <w:rFonts w:ascii="Calibri" w:hAnsi="Calibri"/>
           <w:b/>
           <w:color w:val="2D3748"/>
-          <w:sz w:val="21"/>
-        </w:rPr>
-        <w:t xml:space="preserve">Opção A (Automática via API): </w:t>
+          <w:sz w:val="23"/>
+        </w:rPr>
+        <w:t>1. Importação de Headcount e Colaboradores:</w:t>
+      </w:r>
+    </w:p>
+    <w:p>
+      <w:pPr>
+        <w:spacing w:before="40" w:after="60" w:line="276" w:lineRule="auto"/>
+      </w:pPr>
+      <w:r>
+        <w:rPr>
+          <w:rFonts w:ascii="Arial" w:hAnsi="Arial"/>
+          <w:b/>
+          <w:color w:val="007A87"/>
+          <w:sz w:val="20"/>
+        </w:rPr>
+        <w:t xml:space="preserve">• </w:t>
       </w:r>
       <w:r>
         <w:rPr>
@@ -2951,22 +3930,37 @@
           <w:color w:val="2D3748"/>
           <w:sz w:val="21"/>
         </w:rPr>
-        <w:t>Na tela de Ausências ou Colaboradores, clique no botão 'Sincronizar GeoVictoria'. O sistema se conecta diretamente aos servidores da GeoVictoria via internet e baixa as ocorrências dos últimos 30 dias de forma 100% automática.</w:t>
+        <w:t>Acesse Menu &gt; Configurações ou Colaboradores &gt; Importar Colaboradores. Selecione o arquivo SRA (salvo como CSV UTF-8) e clique em Enviar. Uma barra de progresso em tempo real mostrará os registros inseridos e atualizados.</w:t>
       </w:r>
     </w:p>
     <w:p>
       <w:pPr>
-        <w:pStyle w:val="ListBullet"/>
-        <w:spacing w:before="20" w:after="40" w:line="276" w:lineRule="auto"/>
+        <w:pStyle w:val="Heading3"/>
+        <w:keepNext/>
+        <w:spacing w:before="160" w:after="40"/>
       </w:pPr>
       <w:r>
         <w:rPr>
           <w:rFonts w:ascii="Calibri" w:hAnsi="Calibri"/>
           <w:b/>
           <w:color w:val="2D3748"/>
-          <w:sz w:val="21"/>
-        </w:rPr>
-        <w:t xml:space="preserve">Opção B (Manual via Excel): </w:t>
+          <w:sz w:val="23"/>
+        </w:rPr>
+        <w:t>2. Ponto Eletrônico e Ausências (GeoVictoria):</w:t>
+      </w:r>
+    </w:p>
+    <w:p>
+      <w:pPr>
+        <w:spacing w:before="40" w:after="60" w:line="276" w:lineRule="auto"/>
+      </w:pPr>
+      <w:r>
+        <w:rPr>
+          <w:rFonts w:ascii="Arial" w:hAnsi="Arial"/>
+          <w:b/>
+          <w:color w:val="007A87"/>
+          <w:sz w:val="20"/>
+        </w:rPr>
+        <w:t xml:space="preserve">• </w:t>
       </w:r>
       <w:r>
         <w:rPr>
@@ -2974,53 +3968,59 @@
           <w:color w:val="2D3748"/>
           <w:sz w:val="21"/>
         </w:rPr>
-        <w:t>Caso a internet esteja instável ou precise de dados retroativos maiores que 30 dias, exporte a planilha de batidas/marcas da GeoVictoria em formato Excel (.xlsx) e faça o upload na opção 'Importar Relatório de Marcas'.</w:t>
+        <w:t>Opção A (Recomendada): Na tela de Ausências, clique em 'Sincronizar GeoVictoria'. O sistema baixa faltas e atestados dos últimos 30 dias diretamente via API.</w:t>
       </w:r>
     </w:p>
     <w:p>
       <w:pPr>
-        <w:pStyle w:val="Heading2"/>
-        <w:keepNext/>
-        <w:spacing w:before="240" w:after="80"/>
+        <w:spacing w:before="40" w:after="60" w:line="276" w:lineRule="auto"/>
       </w:pPr>
       <w:r>
         <w:rPr>
           <w:rFonts w:ascii="Arial" w:hAnsi="Arial"/>
           <w:b/>
           <w:color w:val="007A87"/>
-          <w:sz w:val="26"/>
-        </w:rPr>
-        <w:t>2.4 Turnover e Rescisões de Contrato</w:t>
+          <w:sz w:val="20"/>
+        </w:rPr>
+        <w:t xml:space="preserve">• </w:t>
+      </w:r>
+      <w:r>
+        <w:rPr>
+          <w:rFonts w:ascii="Calibri" w:hAnsi="Calibri"/>
+          <w:color w:val="2D3748"/>
+          <w:sz w:val="21"/>
+        </w:rPr>
+        <w:t>Opção B (Manual): Se a API estiver fora, exporte a planilha de batidas da GeoVictoria (.xlsx) e faça o upload na opção 'Importar Relatório de Marcas'.</w:t>
       </w:r>
     </w:p>
     <w:p>
       <w:pPr>
-        <w:spacing w:before="0" w:after="80" w:line="276" w:lineRule="auto"/>
-      </w:pPr>
-      <w:r>
-        <w:rPr>
-          <w:rFonts w:ascii="Calibri" w:hAnsi="Calibri"/>
-          <w:b w:val="0"/>
-          <w:i w:val="0"/>
-          <w:color w:val="2D3748"/>
-          <w:sz w:val="21"/>
-        </w:rPr>
-        <w:t>O módulo de Turnover analisa a rotatividade da empresa, motivos de desligamento e custos médios rescisórios.</w:t>
-      </w:r>
-    </w:p>
-    <w:p>
-      <w:pPr>
-        <w:pStyle w:val="ListBullet"/>
-        <w:spacing w:before="20" w:after="40" w:line="276" w:lineRule="auto"/>
+        <w:pStyle w:val="Heading3"/>
+        <w:keepNext/>
+        <w:spacing w:before="160" w:after="40"/>
       </w:pPr>
       <w:r>
         <w:rPr>
           <w:rFonts w:ascii="Calibri" w:hAnsi="Calibri"/>
           <w:b/>
           <w:color w:val="2D3748"/>
-          <w:sz w:val="21"/>
-        </w:rPr>
-        <w:t xml:space="preserve">Passo 1 (Motivos de Demissão): </w:t>
+          <w:sz w:val="23"/>
+        </w:rPr>
+        <w:t>3. Turnover e Rescisões:</w:t>
+      </w:r>
+    </w:p>
+    <w:p>
+      <w:pPr>
+        <w:spacing w:before="40" w:after="60" w:line="276" w:lineRule="auto"/>
+      </w:pPr>
+      <w:r>
+        <w:rPr>
+          <w:rFonts w:ascii="Arial" w:hAnsi="Arial"/>
+          <w:b/>
+          <w:color w:val="007A87"/>
+          <w:sz w:val="20"/>
+        </w:rPr>
+        <w:t xml:space="preserve">• </w:t>
       </w:r>
       <w:r>
         <w:rPr>
@@ -3028,22 +4028,59 @@
           <w:color w:val="2D3748"/>
           <w:sz w:val="21"/>
         </w:rPr>
-        <w:t>Suba a planilha CSV contendo a relação de termos de rescisão. O sistema lê as colunas de RE/CPF, data de desligamento e motivo amigável (ex.: 'Pedido de Demissão', 'Dispensa Sem Justa Causa', 'Término de Contrato').</w:t>
+        <w:t>Passo 1: Acesse Menu &gt; Turnover &gt; Importar Rescisões. Faça o upload do arquivo SRG (CSV). O sistema mapeará os motivos de desligamento.</w:t>
       </w:r>
     </w:p>
     <w:p>
       <w:pPr>
-        <w:pStyle w:val="ListBullet"/>
-        <w:spacing w:before="20" w:after="40" w:line="276" w:lineRule="auto"/>
+        <w:spacing w:before="40" w:after="60" w:line="276" w:lineRule="auto"/>
+      </w:pPr>
+      <w:r>
+        <w:rPr>
+          <w:rFonts w:ascii="Arial" w:hAnsi="Arial"/>
+          <w:b/>
+          <w:color w:val="007A87"/>
+          <w:sz w:val="20"/>
+        </w:rPr>
+        <w:t xml:space="preserve">• </w:t>
+      </w:r>
+      <w:r>
+        <w:rPr>
+          <w:rFonts w:ascii="Calibri" w:hAnsi="Calibri"/>
+          <w:color w:val="2D3748"/>
+          <w:sz w:val="21"/>
+        </w:rPr>
+        <w:t>Passo 2: Faça o upload do relatório de Líquidos (GPER020). O sistema extrairá os valores da Página 2 para calcular o custo rescisório.</w:t>
+      </w:r>
+    </w:p>
+    <w:p>
+      <w:pPr>
+        <w:pStyle w:val="Heading3"/>
+        <w:keepNext/>
+        <w:spacing w:before="160" w:after="40"/>
       </w:pPr>
       <w:r>
         <w:rPr>
           <w:rFonts w:ascii="Calibri" w:hAnsi="Calibri"/>
           <w:b/>
           <w:color w:val="2D3748"/>
-          <w:sz w:val="21"/>
-        </w:rPr>
-        <w:t xml:space="preserve">Passo 2 (Valores Financeiros - GPER020): </w:t>
+          <w:sz w:val="23"/>
+        </w:rPr>
+        <w:t>4. Folha de Pagamento e Raio-X de Verbas:</w:t>
+      </w:r>
+    </w:p>
+    <w:p>
+      <w:pPr>
+        <w:spacing w:before="40" w:after="60" w:line="276" w:lineRule="auto"/>
+      </w:pPr>
+      <w:r>
+        <w:rPr>
+          <w:rFonts w:ascii="Arial" w:hAnsi="Arial"/>
+          <w:b/>
+          <w:color w:val="007A87"/>
+          <w:sz w:val="20"/>
+        </w:rPr>
+        <w:t xml:space="preserve">• </w:t>
       </w:r>
       <w:r>
         <w:rPr>
@@ -3051,53 +4088,75 @@
           <w:color w:val="2D3748"/>
           <w:sz w:val="21"/>
         </w:rPr>
-        <w:t>Suba o arquivo XML ou Excel do relatório GPER020 gerado pelo Protheus. O sistema lê automaticamente a 'Página 2' do relatório, onde constam os valores líquidos e totais pagos na rescisão, vinculando o custo exato a cada demissão.</w:t>
+        <w:t>Acesse Menu &gt; Importações &gt; Folha de Pagamento (SRD). Selecione o mês de referência contábil, envie o arquivo SRD e clique em Processar. O sistema cruzará os códigos com a planilha DE_PARA_DE_VERBAS_2.xlsx e consolidará os custos por filial.</w:t>
       </w:r>
     </w:p>
     <w:p>
       <w:pPr>
-        <w:pStyle w:val="Heading2"/>
+        <w:pStyle w:val="Heading3"/>
         <w:keepNext/>
-        <w:spacing w:before="240" w:after="80"/>
+        <w:spacing w:before="160" w:after="40"/>
+      </w:pPr>
+      <w:r>
+        <w:rPr>
+          <w:rFonts w:ascii="Calibri" w:hAnsi="Calibri"/>
+          <w:b/>
+          <w:color w:val="2D3748"/>
+          <w:sz w:val="23"/>
+        </w:rPr>
+        <w:t>5. Diárias e Prêmios Operacionais:</w:t>
+      </w:r>
+    </w:p>
+    <w:p>
+      <w:pPr>
+        <w:spacing w:before="40" w:after="60" w:line="276" w:lineRule="auto"/>
       </w:pPr>
       <w:r>
         <w:rPr>
           <w:rFonts w:ascii="Arial" w:hAnsi="Arial"/>
           <w:b/>
           <w:color w:val="007A87"/>
-          <w:sz w:val="26"/>
-        </w:rPr>
-        <w:t>2.5 Folha de Pagamento e Raio-X de Verbas (TOTVS SRD)</w:t>
+          <w:sz w:val="20"/>
+        </w:rPr>
+        <w:t xml:space="preserve">• </w:t>
+      </w:r>
+      <w:r>
+        <w:rPr>
+          <w:rFonts w:ascii="Calibri" w:hAnsi="Calibri"/>
+          <w:color w:val="2D3748"/>
+          <w:sz w:val="21"/>
+        </w:rPr>
+        <w:t>Em Diárias e Prêmios, envie simultaneamente os dois arquivos: a Base do Sistema (CSV) e a Base Manual (Excel). O sistema unifica os lançamentos e abate dos orçamentos.</w:t>
       </w:r>
     </w:p>
     <w:p>
       <w:pPr>
-        <w:spacing w:before="0" w:after="80" w:line="276" w:lineRule="auto"/>
-      </w:pPr>
-      <w:r>
-        <w:rPr>
-          <w:rFonts w:ascii="Calibri" w:hAnsi="Calibri"/>
-          <w:b w:val="0"/>
-          <w:i w:val="0"/>
-          <w:color w:val="2D3748"/>
-          <w:sz w:val="21"/>
-        </w:rPr>
-        <w:t>O módulo de Raio-X da Folha cruza todos os proventos e descontos da folha de pagamento corporativa para identificar desvios e gastos extraordinários:</w:t>
-      </w:r>
-    </w:p>
-    <w:p>
-      <w:pPr>
-        <w:pStyle w:val="ListBullet"/>
-        <w:spacing w:before="20" w:after="40" w:line="276" w:lineRule="auto"/>
+        <w:pStyle w:val="Heading3"/>
+        <w:keepNext/>
+        <w:spacing w:before="160" w:after="40"/>
       </w:pPr>
       <w:r>
         <w:rPr>
           <w:rFonts w:ascii="Calibri" w:hAnsi="Calibri"/>
           <w:b/>
           <w:color w:val="2D3748"/>
-          <w:sz w:val="21"/>
-        </w:rPr>
-        <w:t xml:space="preserve">1. Mapeamento de Verbas (De-Para): </w:t>
+          <w:sz w:val="23"/>
+        </w:rPr>
+        <w:t>6. Escopos Mensais de Loja e DSR:</w:t>
+      </w:r>
+    </w:p>
+    <w:p>
+      <w:pPr>
+        <w:spacing w:before="40" w:after="60" w:line="276" w:lineRule="auto"/>
+      </w:pPr>
+      <w:r>
+        <w:rPr>
+          <w:rFonts w:ascii="Arial" w:hAnsi="Arial"/>
+          <w:b/>
+          <w:color w:val="007A87"/>
+          <w:sz w:val="20"/>
+        </w:rPr>
+        <w:t xml:space="preserve">• </w:t>
       </w:r>
       <w:r>
         <w:rPr>
@@ -3105,22 +4164,37 @@
           <w:color w:val="2D3748"/>
           <w:sz w:val="21"/>
         </w:rPr>
-        <w:t>O sistema utiliza o arquivo oficial localizado no servidor de rede em F:\05 - publica\TOTVS_PROTHEUS\DE_PARA_DE_VERBAS_2.xlsx. Cada código de verba (ex: '001', '005') é classificado como Provento, Desconto ou Verba Extraordinária.</w:t>
+        <w:t>Acesse Menu &gt; Escopos. Na virada de mês, use o botão 'Duplicar para o Próximo Mês' para clonar o quadro autorizado da equipe e ajuste os valores de DSR e insalubridade onde houver alteração.</w:t>
       </w:r>
     </w:p>
     <w:p>
       <w:pPr>
-        <w:pStyle w:val="ListBullet"/>
-        <w:spacing w:before="20" w:after="40" w:line="276" w:lineRule="auto"/>
+        <w:pStyle w:val="Heading3"/>
+        <w:keepNext/>
+        <w:spacing w:before="160" w:after="40"/>
       </w:pPr>
       <w:r>
         <w:rPr>
           <w:rFonts w:ascii="Calibri" w:hAnsi="Calibri"/>
           <w:b/>
           <w:color w:val="2D3748"/>
-          <w:sz w:val="21"/>
-        </w:rPr>
-        <w:t xml:space="preserve">2. Upload do Arquivo SRD: </w:t>
+          <w:sz w:val="23"/>
+        </w:rPr>
+        <w:t>7. Testes de Promoção:</w:t>
+      </w:r>
+    </w:p>
+    <w:p>
+      <w:pPr>
+        <w:spacing w:before="40" w:after="60" w:line="276" w:lineRule="auto"/>
+      </w:pPr>
+      <w:r>
+        <w:rPr>
+          <w:rFonts w:ascii="Arial" w:hAnsi="Arial"/>
+          <w:b/>
+          <w:color w:val="007A87"/>
+          <w:sz w:val="20"/>
+        </w:rPr>
+        <w:t xml:space="preserve">• </w:t>
       </w:r>
       <w:r>
         <w:rPr>
@@ -3128,307 +4202,7 @@
           <w:color w:val="2D3748"/>
           <w:sz w:val="21"/>
         </w:rPr>
-        <w:t>Acesse Menu &gt; Importações &gt; Folha de Pagamento (SRD). Envie o arquivo CSV da folha do mês fechado.</w:t>
-      </w:r>
-    </w:p>
-    <w:p>
-      <w:pPr>
-        <w:pStyle w:val="ListBullet"/>
-        <w:spacing w:before="20" w:after="40" w:line="276" w:lineRule="auto"/>
-      </w:pPr>
-      <w:r>
-        <w:rPr>
-          <w:rFonts w:ascii="Calibri" w:hAnsi="Calibri"/>
-          <w:b/>
-          <w:color w:val="2D3748"/>
-          <w:sz w:val="21"/>
-        </w:rPr>
-        <w:t xml:space="preserve">3. Consolidação Automática: </w:t>
-      </w:r>
-      <w:r>
-        <w:rPr>
-          <w:rFonts w:ascii="Calibri" w:hAnsi="Calibri"/>
-          <w:color w:val="2D3748"/>
-          <w:sz w:val="21"/>
-        </w:rPr>
-        <w:t>O sistema agrupa os custos por loja, calcula o total da folha e gera o indicador de 'Desvio de Folha' em relação ao quadro planejado no Escopo.</w:t>
-      </w:r>
-    </w:p>
-    <w:p>
-      <w:pPr>
-        <w:pStyle w:val="Heading2"/>
-        <w:keepNext/>
-        <w:spacing w:before="240" w:after="80"/>
-      </w:pPr>
-      <w:r>
-        <w:rPr>
-          <w:rFonts w:ascii="Arial" w:hAnsi="Arial"/>
-          <w:b/>
-          <w:color w:val="007A87"/>
-          <w:sz w:val="26"/>
-        </w:rPr>
-        <w:t>2.6 Diárias e Prêmios Operacionais</w:t>
-      </w:r>
-    </w:p>
-    <w:p>
-      <w:pPr>
-        <w:spacing w:before="0" w:after="80" w:line="276" w:lineRule="auto"/>
-      </w:pPr>
-      <w:r>
-        <w:rPr>
-          <w:rFonts w:ascii="Calibri" w:hAnsi="Calibri"/>
-          <w:b w:val="0"/>
-          <w:i w:val="0"/>
-          <w:color w:val="2D3748"/>
-          <w:sz w:val="21"/>
-        </w:rPr>
-        <w:t>Esses dois módulos utilizam um padrão de Unificação de Bases:</w:t>
-      </w:r>
-    </w:p>
-    <w:p>
-      <w:pPr>
-        <w:pStyle w:val="ListBullet"/>
-        <w:spacing w:before="20" w:after="40" w:line="276" w:lineRule="auto"/>
-      </w:pPr>
-      <w:r>
-        <w:rPr>
-          <w:rFonts w:ascii="Calibri" w:hAnsi="Calibri"/>
-          <w:b/>
-          <w:color w:val="2D3748"/>
-          <w:sz w:val="21"/>
-        </w:rPr>
-        <w:t xml:space="preserve">Base do Sistema: </w:t>
-      </w:r>
-      <w:r>
-        <w:rPr>
-          <w:rFonts w:ascii="Calibri" w:hAnsi="Calibri"/>
-          <w:color w:val="2D3748"/>
-          <w:sz w:val="21"/>
-        </w:rPr>
-        <w:t>Uma base gerada automaticamente pelo sistema com os valores pré-aprovados.</w:t>
-      </w:r>
-    </w:p>
-    <w:p>
-      <w:pPr>
-        <w:pStyle w:val="ListBullet"/>
-        <w:spacing w:before="20" w:after="40" w:line="276" w:lineRule="auto"/>
-      </w:pPr>
-      <w:r>
-        <w:rPr>
-          <w:rFonts w:ascii="Calibri" w:hAnsi="Calibri"/>
-          <w:b/>
-          <w:color w:val="2D3748"/>
-          <w:sz w:val="21"/>
-        </w:rPr>
-        <w:t xml:space="preserve">Base Manual: </w:t>
-      </w:r>
-      <w:r>
-        <w:rPr>
-          <w:rFonts w:ascii="Calibri" w:hAnsi="Calibri"/>
-          <w:color w:val="2D3748"/>
-          <w:sz w:val="21"/>
-        </w:rPr>
-        <w:t>Uma planilha Excel preenchida pela gestão com ajustes manuais, exceções ou pagamentos extras.</w:t>
-      </w:r>
-    </w:p>
-    <w:p>
-      <w:pPr>
-        <w:pStyle w:val="ListBullet"/>
-        <w:spacing w:before="20" w:after="40" w:line="276" w:lineRule="auto"/>
-      </w:pPr>
-      <w:r>
-        <w:rPr>
-          <w:rFonts w:ascii="Calibri" w:hAnsi="Calibri"/>
-          <w:b/>
-          <w:color w:val="2D3748"/>
-          <w:sz w:val="21"/>
-        </w:rPr>
-        <w:t xml:space="preserve">Procedimento de Carga: </w:t>
-      </w:r>
-      <w:r>
-        <w:rPr>
-          <w:rFonts w:ascii="Calibri" w:hAnsi="Calibri"/>
-          <w:color w:val="2D3748"/>
-          <w:sz w:val="21"/>
-        </w:rPr>
-        <w:t>Na tela de importação de Diárias e Prêmios, envie os dois arquivos simultaneamente. O sistema cruza os registros pelo CPF/RE, remove duplicidades e grava a visão unificada oficial.</w:t>
-      </w:r>
-    </w:p>
-    <w:p>
-      <w:pPr>
-        <w:pStyle w:val="Heading2"/>
-        <w:keepNext/>
-        <w:spacing w:before="240" w:after="80"/>
-      </w:pPr>
-      <w:r>
-        <w:rPr>
-          <w:rFonts w:ascii="Arial" w:hAnsi="Arial"/>
-          <w:b/>
-          <w:color w:val="007A87"/>
-          <w:sz w:val="26"/>
-        </w:rPr>
-        <w:t>2.7 Escopos Mensais de Loja e Cálculo de DSR</w:t>
-      </w:r>
-    </w:p>
-    <w:p>
-      <w:pPr>
-        <w:spacing w:before="0" w:after="80" w:line="276" w:lineRule="auto"/>
-      </w:pPr>
-      <w:r>
-        <w:rPr>
-          <w:rFonts w:ascii="Calibri" w:hAnsi="Calibri"/>
-          <w:b w:val="0"/>
-          <w:i w:val="0"/>
-          <w:color w:val="2D3748"/>
-          <w:sz w:val="21"/>
-        </w:rPr>
-        <w:t>O Escopo define o número ideal de colaboradores por função que cada loja tem autorização para manter. A cada virada de mês, a gestão deve configurar o escopo do novo mês:</w:t>
-      </w:r>
-    </w:p>
-    <w:p>
-      <w:pPr>
-        <w:pStyle w:val="ListBullet"/>
-        <w:spacing w:before="20" w:after="40" w:line="276" w:lineRule="auto"/>
-      </w:pPr>
-      <w:r>
-        <w:rPr>
-          <w:rFonts w:ascii="Calibri" w:hAnsi="Calibri"/>
-          <w:b/>
-          <w:color w:val="2D3748"/>
-          <w:sz w:val="21"/>
-        </w:rPr>
-        <w:t xml:space="preserve">Duplicação Inteligente: </w:t>
-      </w:r>
-      <w:r>
-        <w:rPr>
-          <w:rFonts w:ascii="Calibri" w:hAnsi="Calibri"/>
-          <w:color w:val="2D3748"/>
-          <w:sz w:val="21"/>
-        </w:rPr>
-        <w:t>Para não precisar recadastrar loja por loja todo mês, clique no botão 'Duplicar para o Próximo Mês'. O sistema clona automaticamente todos os cargos, quantidades autorizadas e valores de insalubridade do mês anterior para o novo mês selecionado.</w:t>
-      </w:r>
-    </w:p>
-    <w:p>
-      <w:pPr>
-        <w:pStyle w:val="ListBullet"/>
-        <w:spacing w:before="20" w:after="40" w:line="276" w:lineRule="auto"/>
-      </w:pPr>
-      <w:r>
-        <w:rPr>
-          <w:rFonts w:ascii="Calibri" w:hAnsi="Calibri"/>
-          <w:b/>
-          <w:color w:val="2D3748"/>
-          <w:sz w:val="21"/>
-        </w:rPr>
-        <w:t xml:space="preserve">Configuração de DSR: </w:t>
-      </w:r>
-      <w:r>
-        <w:rPr>
-          <w:rFonts w:ascii="Calibri" w:hAnsi="Calibri"/>
-          <w:color w:val="2D3748"/>
-          <w:sz w:val="21"/>
-        </w:rPr>
-        <w:t>O sistema permite definir valores fixos de DSR ou percentuais por estado (UF) e cargo diretamente na interface.</w:t>
-      </w:r>
-    </w:p>
-    <w:p>
-      <w:pPr>
-        <w:pStyle w:val="Heading2"/>
-        <w:keepNext/>
-        <w:spacing w:before="240" w:after="80"/>
-      </w:pPr>
-      <w:r>
-        <w:rPr>
-          <w:rFonts w:ascii="Arial" w:hAnsi="Arial"/>
-          <w:b/>
-          <w:color w:val="007A87"/>
-          <w:sz w:val="26"/>
-        </w:rPr>
-        <w:t>2.8 Gestão de Testes de Promoção</w:t>
-      </w:r>
-    </w:p>
-    <w:p>
-      <w:pPr>
-        <w:spacing w:before="0" w:after="80" w:line="276" w:lineRule="auto"/>
-      </w:pPr>
-      <w:r>
-        <w:rPr>
-          <w:rFonts w:ascii="Calibri" w:hAnsi="Calibri"/>
-          <w:b w:val="0"/>
-          <w:i w:val="0"/>
-          <w:color w:val="2D3748"/>
-          <w:sz w:val="21"/>
-        </w:rPr>
-        <w:t>Permite que supervisores coloquem colaboradores em período de experiência para promoção de cargo:</w:t>
-      </w:r>
-    </w:p>
-    <w:p>
-      <w:pPr>
-        <w:pStyle w:val="ListBullet"/>
-        <w:spacing w:before="20" w:after="40" w:line="276" w:lineRule="auto"/>
-      </w:pPr>
-      <w:r>
-        <w:rPr>
-          <w:rFonts w:ascii="Calibri" w:hAnsi="Calibri"/>
-          <w:b/>
-          <w:color w:val="2D3748"/>
-          <w:sz w:val="21"/>
-        </w:rPr>
-        <w:t xml:space="preserve">Abertura: </w:t>
-      </w:r>
-      <w:r>
-        <w:rPr>
-          <w:rFonts w:ascii="Calibri" w:hAnsi="Calibri"/>
-          <w:color w:val="2D3748"/>
-          <w:sz w:val="21"/>
-        </w:rPr>
-        <w:t>Abra o teste selecionando o colaborador, a data de início e o cargo pretendido.</w:t>
-      </w:r>
-    </w:p>
-    <w:p>
-      <w:pPr>
-        <w:pStyle w:val="ListBullet"/>
-        <w:spacing w:before="20" w:after="40" w:line="276" w:lineRule="auto"/>
-      </w:pPr>
-      <w:r>
-        <w:rPr>
-          <w:rFonts w:ascii="Calibri" w:hAnsi="Calibri"/>
-          <w:b/>
-          <w:color w:val="2D3748"/>
-          <w:sz w:val="21"/>
-        </w:rPr>
-        <w:t xml:space="preserve">Anexos: </w:t>
-      </w:r>
-      <w:r>
-        <w:rPr>
-          <w:rFonts w:ascii="Calibri" w:hAnsi="Calibri"/>
-          <w:color w:val="2D3748"/>
-          <w:sz w:val="21"/>
-        </w:rPr>
-        <w:t>Faça o upload do formulário assinado de avaliação. O arquivo é armazenado no diretório seguro de rede.</w:t>
-      </w:r>
-    </w:p>
-    <w:p>
-      <w:pPr>
-        <w:pStyle w:val="ListBullet"/>
-        <w:spacing w:before="20" w:after="40" w:line="276" w:lineRule="auto"/>
-      </w:pPr>
-      <w:r>
-        <w:rPr>
-          <w:rFonts w:ascii="Calibri" w:hAnsi="Calibri"/>
-          <w:b/>
-          <w:color w:val="2D3748"/>
-          <w:sz w:val="21"/>
-        </w:rPr>
-        <w:t xml:space="preserve">Conclusão: </w:t>
-      </w:r>
-      <w:r>
-        <w:rPr>
-          <w:rFonts w:ascii="Calibri" w:hAnsi="Calibri"/>
-          <w:color w:val="2D3748"/>
-          <w:sz w:val="21"/>
-        </w:rPr>
-        <w:t>O supervisor registra a aprovação ou reprovação do teste, atualizando automaticamente o histórico de carreira do colaborador.</w:t>
+        <w:t>Acesse Menu &gt; Testes de Promoção. Cadastre o colaborador em experiência e faça o upload do formulário assinado (PDF ou imagem) para comprovação.</w:t>
       </w:r>
     </w:p>
     <w:p>

</xml_diff>

<commit_message>
docs: detalha extracao de diarias, premios, marcas geovictoria e contatos operacionais
</commit_message>
<xml_diff>
--- a/DOCUMENTACAO_DO_SISTEMA.docx
+++ b/DOCUMENTACAO_DO_SISTEMA.docx
@@ -31,7 +31,7 @@
           <w:color w:val="007A87"/>
           <w:sz w:val="26"/>
         </w:rPr>
-        <w:t>Manual Técnico Completo, Guia de Extração no TOTVS, Atualização de Dados e Manutenção</w:t>
+        <w:t>Manual Técnico Completo, Guia de Extração no TOTVS, Central do Colaborador, GeoVictoria e Manutenção</w:t>
       </w:r>
     </w:p>
     <w:tbl>
@@ -237,7 +237,7 @@
                 <w:color w:val="2D3748"/>
                 <w:sz w:val="19"/>
               </w:rPr>
-              <w:t>Versão 2.1 - Edição com Guia de Usuários, Salários e Extrações TOTVS</w:t>
+              <w:t>Versão 2.2 - Edição com Roteiro Completo de Extrações e Contatos</w:t>
             </w:r>
           </w:p>
         </w:tc>
@@ -405,7 +405,7 @@
           <w:color w:val="2D3748"/>
           <w:sz w:val="21"/>
         </w:rPr>
-        <w:t>Criação de usuários, alteração de senhas, tabela salarial, cadastro de cargos, passo a passo exato de extração de relatórios no TOTVS Protheus e procedimentos de importação.</w:t>
+        <w:t>Criação de usuários, alteração de senhas, tabela salarial, cadastro de cargos, roteiro de extração de relatórios (TOTVS Protheus, Central do Colaborador, GeoVictoria e Tom) e procedimentos de importação.</w:t>
       </w:r>
     </w:p>
     <w:p>
@@ -477,7 +477,7 @@
                 <w:color w:val="2D3748"/>
                 <w:sz w:val="20"/>
               </w:rPr>
-              <w:t>Este manual contém o roteiro prático e exato de telas do TOTVS Protheus para extração dos arquivos SRA, SRG, Líquidos de Rescisão e SRD, além dos passos de administração de usuários e salários.</w:t>
+              <w:t>Este manual contém o roteiro prático e exato de telas de todos os sistemas de origem (TOTVS, Central do Colaborador e GeoVictoria) para que qualquer operador consiga atualizar os dados sem depender do desenvolvedor.</w:t>
             </w:r>
           </w:p>
         </w:tc>
@@ -1732,7 +1732,7 @@
           <w:color w:val="2D3748"/>
           <w:sz w:val="21"/>
         </w:rPr>
-        <w:t>Esta seção foi estruturada para ser a referência rápida do dia a dia da equipe operacional. Apresentamos primeiro a gestão de usuários, senhas e tabela de salários, seguida do roteiro exato de extração de relatórios no TOTVS Protheus.</w:t>
+        <w:t>Esta seção é a referência prática diária da equipe. Apresentamos a gestão de usuários e salários logo no início, seguida do passo a passo completo de como obter cada um dos arquivos nas fontes oficiais.</w:t>
       </w:r>
     </w:p>
     <w:p>
@@ -1763,7 +1763,7 @@
           <w:color w:val="2D3748"/>
           <w:sz w:val="21"/>
         </w:rPr>
-        <w:t>O controle de quem acessa o sistema e o que cada usuário pode visualizar ou editar é feito no Menu Lateral &gt; Usuários:</w:t>
+        <w:t>O controle de quem acessa o sistema e o nível de permissão é realizado no Menu Lateral &gt; Usuários:</w:t>
       </w:r>
     </w:p>
     <w:p>
@@ -2314,7 +2314,7 @@
           <w:color w:val="2D3748"/>
           <w:sz w:val="21"/>
         </w:rPr>
-        <w:t>A tabela de salários alimenta os cálculos de folha de pagamento projetada, custo médio de turnover e orçamentos de escopo. Ela fica localizada em Menu Lateral &gt; Salários:</w:t>
+        <w:t>A tabela de salários alimenta os cálculos de folha de pagamento projetada, custo médio de turnover e orçamentos de escopo. Fica localizada em Menu Lateral &gt; Salários:</w:t>
       </w:r>
     </w:p>
     <w:p>
@@ -2812,7 +2812,7 @@
           <w:color w:val="007A87"/>
           <w:sz w:val="26"/>
         </w:rPr>
-        <w:t>2.3 Guia Passo a Passo: Como Obter os Arquivos no TOTVS Protheus</w:t>
+        <w:t>2.3 Guia Passo a Passo: Como Obter os Arquivos nas Fontes Oficiais</w:t>
       </w:r>
     </w:p>
     <w:p>
@@ -2827,7 +2827,7 @@
           <w:color w:val="2D3748"/>
           <w:sz w:val="21"/>
         </w:rPr>
-        <w:t>Abaixo está o roteiro de cliques para extrair com exatidão cada um dos arquivos necessários no ERP TOTVS Protheus:</w:t>
+        <w:t>Abaixo está o roteiro detalhado de cliques para extrair cada um dos arquivos nas respectivas fontes (TOTVS Protheus, Central do Colaborador, GeoVictoria e equipe de apoio):</w:t>
       </w:r>
     </w:p>
     <w:p>
@@ -2843,7 +2843,22 @@
           <w:color w:val="2D3748"/>
           <w:sz w:val="23"/>
         </w:rPr>
-        <w:t>A) Extração do Arquivo SRA (Colaboradores e Headcount):</w:t>
+        <w:t>A) Extrações no TOTVS Protheus (SRA, SRG, Líquidos e SRD):</w:t>
+      </w:r>
+    </w:p>
+    <w:p>
+      <w:pPr>
+        <w:spacing w:before="0" w:after="80" w:line="276" w:lineRule="auto"/>
+      </w:pPr>
+      <w:r>
+        <w:rPr>
+          <w:rFonts w:ascii="Calibri" w:hAnsi="Calibri"/>
+          <w:b/>
+          <w:i w:val="0"/>
+          <w:color w:val="2D3748"/>
+          <w:sz w:val="21"/>
+        </w:rPr>
+        <w:t>1. Arquivo SRA (Colaboradores e Headcount):</w:t>
       </w:r>
     </w:p>
     <w:p>
@@ -2857,8 +2872,441 @@
           <w:color w:val="007A87"/>
           <w:sz w:val="20"/>
         </w:rPr>
-        <w:t xml:space="preserve">1. </w:t>
-      </w:r>
+        <w:t xml:space="preserve">• </w:t>
+      </w:r>
+      <w:r>
+        <w:rPr>
+          <w:rFonts w:ascii="Calibri" w:hAnsi="Calibri"/>
+          <w:color w:val="2D3748"/>
+          <w:sz w:val="21"/>
+        </w:rPr>
+        <w:t>Faça login no TOTVS Protheus.</w:t>
+      </w:r>
+    </w:p>
+    <w:p>
+      <w:pPr>
+        <w:spacing w:before="40" w:after="60" w:line="276" w:lineRule="auto"/>
+      </w:pPr>
+      <w:r>
+        <w:rPr>
+          <w:rFonts w:ascii="Arial" w:hAnsi="Arial"/>
+          <w:b/>
+          <w:color w:val="007A87"/>
+          <w:sz w:val="20"/>
+        </w:rPr>
+        <w:t xml:space="preserve">• </w:t>
+      </w:r>
+      <w:r>
+        <w:rPr>
+          <w:rFonts w:ascii="Calibri" w:hAnsi="Calibri"/>
+          <w:color w:val="2D3748"/>
+          <w:sz w:val="21"/>
+        </w:rPr>
+        <w:t>Na parte esquerda da tela, clique na aba 'Consultas' e selecione 'Genéricos'.</w:t>
+      </w:r>
+    </w:p>
+    <w:p>
+      <w:pPr>
+        <w:spacing w:before="40" w:after="60" w:line="276" w:lineRule="auto"/>
+      </w:pPr>
+      <w:r>
+        <w:rPr>
+          <w:rFonts w:ascii="Arial" w:hAnsi="Arial"/>
+          <w:b/>
+          <w:color w:val="007A87"/>
+          <w:sz w:val="20"/>
+        </w:rPr>
+        <w:t xml:space="preserve">• </w:t>
+      </w:r>
+      <w:r>
+        <w:rPr>
+          <w:rFonts w:ascii="Calibri" w:hAnsi="Calibri"/>
+          <w:color w:val="2D3748"/>
+          <w:sz w:val="21"/>
+        </w:rPr>
+        <w:t>Na barra de pesquisa, digite 'sra' e pressione Enter. Dê 2 cliques no resultado 'SRA'.</w:t>
+      </w:r>
+    </w:p>
+    <w:p>
+      <w:pPr>
+        <w:spacing w:before="40" w:after="60" w:line="276" w:lineRule="auto"/>
+      </w:pPr>
+      <w:r>
+        <w:rPr>
+          <w:rFonts w:ascii="Arial" w:hAnsi="Arial"/>
+          <w:b/>
+          <w:color w:val="007A87"/>
+          <w:sz w:val="20"/>
+        </w:rPr>
+        <w:t xml:space="preserve">• </w:t>
+      </w:r>
+      <w:r>
+        <w:rPr>
+          <w:rFonts w:ascii="Calibri" w:hAnsi="Calibri"/>
+          <w:color w:val="2D3748"/>
+          <w:sz w:val="21"/>
+        </w:rPr>
+        <w:t>Na parte inferior da tela, clique no botão 'Exp. CSV'. Não altere nenhuma configuração e confirme.</w:t>
+      </w:r>
+    </w:p>
+    <w:p>
+      <w:pPr>
+        <w:spacing w:before="40" w:after="60" w:line="276" w:lineRule="auto"/>
+      </w:pPr>
+      <w:r>
+        <w:rPr>
+          <w:rFonts w:ascii="Arial" w:hAnsi="Arial"/>
+          <w:b/>
+          <w:color w:val="007A87"/>
+          <w:sz w:val="20"/>
+        </w:rPr>
+        <w:t xml:space="preserve">• </w:t>
+      </w:r>
+      <w:r>
+        <w:rPr>
+          <w:rFonts w:ascii="Calibri" w:hAnsi="Calibri"/>
+          <w:color w:val="2D3748"/>
+          <w:sz w:val="21"/>
+        </w:rPr>
+        <w:t>ATENÇÃO OBRIGATÓRIA: Abra o arquivo baixado no Excel, vá em Arquivo &gt; Salvar Como e salve no formato 'CSV UTF-8 (delimitado por vírgulas) (*.csv)'. Pronto, pode importar para o sistema.</w:t>
+      </w:r>
+    </w:p>
+    <w:p>
+      <w:pPr>
+        <w:spacing w:before="0" w:after="80" w:line="276" w:lineRule="auto"/>
+      </w:pPr>
+      <w:r>
+        <w:rPr>
+          <w:rFonts w:ascii="Calibri" w:hAnsi="Calibri"/>
+          <w:b/>
+          <w:i w:val="0"/>
+          <w:color w:val="2D3748"/>
+          <w:sz w:val="21"/>
+        </w:rPr>
+        <w:t>2. Arquivo SRG (Termos de Rescisão / Turnover):</w:t>
+      </w:r>
+    </w:p>
+    <w:p>
+      <w:pPr>
+        <w:spacing w:before="40" w:after="60" w:line="276" w:lineRule="auto"/>
+      </w:pPr>
+      <w:r>
+        <w:rPr>
+          <w:rFonts w:ascii="Arial" w:hAnsi="Arial"/>
+          <w:b/>
+          <w:color w:val="007A87"/>
+          <w:sz w:val="20"/>
+        </w:rPr>
+        <w:t xml:space="preserve">• </w:t>
+      </w:r>
+      <w:r>
+        <w:rPr>
+          <w:rFonts w:ascii="Calibri" w:hAnsi="Calibri"/>
+          <w:color w:val="2D3748"/>
+          <w:sz w:val="21"/>
+        </w:rPr>
+        <w:t>Siga exatamente o mesmo processo do SRA até a pesquisa: Consultas &gt; Genéricos.</w:t>
+      </w:r>
+    </w:p>
+    <w:p>
+      <w:pPr>
+        <w:spacing w:before="40" w:after="60" w:line="276" w:lineRule="auto"/>
+      </w:pPr>
+      <w:r>
+        <w:rPr>
+          <w:rFonts w:ascii="Arial" w:hAnsi="Arial"/>
+          <w:b/>
+          <w:color w:val="007A87"/>
+          <w:sz w:val="20"/>
+        </w:rPr>
+        <w:t xml:space="preserve">• </w:t>
+      </w:r>
+      <w:r>
+        <w:rPr>
+          <w:rFonts w:ascii="Calibri" w:hAnsi="Calibri"/>
+          <w:color w:val="2D3748"/>
+          <w:sz w:val="21"/>
+        </w:rPr>
+        <w:t>Ao invés de 'sra', pesquise por 'srg' e dê 2 cliques no resultado.</w:t>
+      </w:r>
+    </w:p>
+    <w:p>
+      <w:pPr>
+        <w:spacing w:before="40" w:after="60" w:line="276" w:lineRule="auto"/>
+      </w:pPr>
+      <w:r>
+        <w:rPr>
+          <w:rFonts w:ascii="Arial" w:hAnsi="Arial"/>
+          <w:b/>
+          <w:color w:val="007A87"/>
+          <w:sz w:val="20"/>
+        </w:rPr>
+        <w:t xml:space="preserve">• </w:t>
+      </w:r>
+      <w:r>
+        <w:rPr>
+          <w:rFonts w:ascii="Calibri" w:hAnsi="Calibri"/>
+          <w:color w:val="2D3748"/>
+          <w:sz w:val="21"/>
+        </w:rPr>
+        <w:t>Clique em 'Exp. CSV' e baixe. Diferente do SRA, não precisa de nenhuma alteração no Excel: importe diretamente no sistema.</w:t>
+      </w:r>
+    </w:p>
+    <w:p>
+      <w:pPr>
+        <w:spacing w:before="0" w:after="80" w:line="276" w:lineRule="auto"/>
+      </w:pPr>
+      <w:r>
+        <w:rPr>
+          <w:rFonts w:ascii="Calibri" w:hAnsi="Calibri"/>
+          <w:b/>
+          <w:i w:val="0"/>
+          <w:color w:val="2D3748"/>
+          <w:sz w:val="21"/>
+        </w:rPr>
+        <w:t>3. Valores de Rescisão - TOTVS Líquidos (GPER020):</w:t>
+      </w:r>
+    </w:p>
+    <w:p>
+      <w:pPr>
+        <w:spacing w:before="40" w:after="60" w:line="276" w:lineRule="auto"/>
+      </w:pPr>
+      <w:r>
+        <w:rPr>
+          <w:rFonts w:ascii="Arial" w:hAnsi="Arial"/>
+          <w:b/>
+          <w:color w:val="007A87"/>
+          <w:sz w:val="20"/>
+        </w:rPr>
+        <w:t xml:space="preserve">• </w:t>
+      </w:r>
+      <w:r>
+        <w:rPr>
+          <w:rFonts w:ascii="Calibri" w:hAnsi="Calibri"/>
+          <w:color w:val="2D3748"/>
+          <w:sz w:val="21"/>
+        </w:rPr>
+        <w:t>Na página inicial da TOTVS, vá na barra de pesquisa à esquerda e pesquise por 'liquido'.</w:t>
+      </w:r>
+    </w:p>
+    <w:p>
+      <w:pPr>
+        <w:spacing w:before="40" w:after="60" w:line="276" w:lineRule="auto"/>
+      </w:pPr>
+      <w:r>
+        <w:rPr>
+          <w:rFonts w:ascii="Arial" w:hAnsi="Arial"/>
+          <w:b/>
+          <w:color w:val="007A87"/>
+          <w:sz w:val="20"/>
+        </w:rPr>
+        <w:t xml:space="preserve">• </w:t>
+      </w:r>
+      <w:r>
+        <w:rPr>
+          <w:rFonts w:ascii="Calibri" w:hAnsi="Calibri"/>
+          <w:color w:val="2D3748"/>
+          <w:sz w:val="21"/>
+        </w:rPr>
+        <w:t>Na janela que abrir, acesse Gestão de Pessoal &gt; Periódicos &gt; Líquidos.</w:t>
+      </w:r>
+    </w:p>
+    <w:p>
+      <w:pPr>
+        <w:spacing w:before="40" w:after="60" w:line="276" w:lineRule="auto"/>
+      </w:pPr>
+      <w:r>
+        <w:rPr>
+          <w:rFonts w:ascii="Arial" w:hAnsi="Arial"/>
+          <w:b/>
+          <w:color w:val="007A87"/>
+          <w:sz w:val="20"/>
+        </w:rPr>
+        <w:t xml:space="preserve">• </w:t>
+      </w:r>
+      <w:r>
+        <w:rPr>
+          <w:rFonts w:ascii="Calibri" w:hAnsi="Calibri"/>
+          <w:color w:val="2D3748"/>
+          <w:sz w:val="21"/>
+        </w:rPr>
+        <w:t>Na janela de parâmetros, selecione à esquerda o tipo: 'Planilha'.</w:t>
+      </w:r>
+    </w:p>
+    <w:p>
+      <w:pPr>
+        <w:spacing w:before="40" w:after="60" w:line="276" w:lineRule="auto"/>
+      </w:pPr>
+      <w:r>
+        <w:rPr>
+          <w:rFonts w:ascii="Arial" w:hAnsi="Arial"/>
+          <w:b/>
+          <w:color w:val="007A87"/>
+          <w:sz w:val="20"/>
+        </w:rPr>
+        <w:t xml:space="preserve">• </w:t>
+      </w:r>
+      <w:r>
+        <w:rPr>
+          <w:rFonts w:ascii="Calibri" w:hAnsi="Calibri"/>
+          <w:color w:val="2D3748"/>
+          <w:sz w:val="21"/>
+        </w:rPr>
+        <w:t>À direita, mude a opção 'Tipo de planilha' para: 'Formato de tabela'.</w:t>
+      </w:r>
+    </w:p>
+    <w:p>
+      <w:pPr>
+        <w:spacing w:before="40" w:after="60" w:line="276" w:lineRule="auto"/>
+      </w:pPr>
+      <w:r>
+        <w:rPr>
+          <w:rFonts w:ascii="Arial" w:hAnsi="Arial"/>
+          <w:b/>
+          <w:color w:val="007A87"/>
+          <w:sz w:val="20"/>
+        </w:rPr>
+        <w:t xml:space="preserve">• </w:t>
+      </w:r>
+      <w:r>
+        <w:rPr>
+          <w:rFonts w:ascii="Calibri" w:hAnsi="Calibri"/>
+          <w:color w:val="2D3748"/>
+          <w:sz w:val="21"/>
+        </w:rPr>
+        <w:t>Na parte de configurações, altere a opção 'Ordem' para: 'Filial+Bco/Ag.+Cc+Mat'.</w:t>
+      </w:r>
+    </w:p>
+    <w:p>
+      <w:pPr>
+        <w:spacing w:before="40" w:after="60" w:line="276" w:lineRule="auto"/>
+      </w:pPr>
+      <w:r>
+        <w:rPr>
+          <w:rFonts w:ascii="Arial" w:hAnsi="Arial"/>
+          <w:b/>
+          <w:color w:val="007A87"/>
+          <w:sz w:val="20"/>
+        </w:rPr>
+        <w:t xml:space="preserve">• </w:t>
+      </w:r>
+      <w:r>
+        <w:rPr>
+          <w:rFonts w:ascii="Calibri" w:hAnsi="Calibri"/>
+          <w:color w:val="2D3748"/>
+          <w:sz w:val="21"/>
+        </w:rPr>
+        <w:t>Embaixo, em 'Outras Ações', verifique se os parâmetros estão configurados como 'RES' (Rescisão).</w:t>
+      </w:r>
+    </w:p>
+    <w:p>
+      <w:pPr>
+        <w:spacing w:before="40" w:after="60" w:line="276" w:lineRule="auto"/>
+      </w:pPr>
+      <w:r>
+        <w:rPr>
+          <w:rFonts w:ascii="Arial" w:hAnsi="Arial"/>
+          <w:b/>
+          <w:color w:val="007A87"/>
+          <w:sz w:val="20"/>
+        </w:rPr>
+        <w:t xml:space="preserve">• </w:t>
+      </w:r>
+      <w:r>
+        <w:rPr>
+          <w:rFonts w:ascii="Calibri" w:hAnsi="Calibri"/>
+          <w:color w:val="2D3748"/>
+          <w:sz w:val="21"/>
+        </w:rPr>
+        <w:t>Clique em 'Imprimir'. O arquivo gerado (.xml ou .xlsx) pode ser importado diretamente no sistema do jeito que for baixado.</w:t>
+      </w:r>
+    </w:p>
+    <w:p>
+      <w:pPr>
+        <w:spacing w:before="0" w:after="80" w:line="276" w:lineRule="auto"/>
+      </w:pPr>
+      <w:r>
+        <w:rPr>
+          <w:rFonts w:ascii="Calibri" w:hAnsi="Calibri"/>
+          <w:b/>
+          <w:i w:val="0"/>
+          <w:color w:val="2D3748"/>
+          <w:sz w:val="21"/>
+        </w:rPr>
+        <w:t>4. Arquivo SRD (Folha de Pagamento Sintética/Analítica):</w:t>
+      </w:r>
+    </w:p>
+    <w:p>
+      <w:pPr>
+        <w:spacing w:before="40" w:after="60" w:line="276" w:lineRule="auto"/>
+      </w:pPr>
+      <w:r>
+        <w:rPr>
+          <w:rFonts w:ascii="Arial" w:hAnsi="Arial"/>
+          <w:b/>
+          <w:color w:val="007A87"/>
+          <w:sz w:val="20"/>
+        </w:rPr>
+        <w:t xml:space="preserve">• </w:t>
+      </w:r>
+      <w:r>
+        <w:rPr>
+          <w:rFonts w:ascii="Calibri" w:hAnsi="Calibri"/>
+          <w:color w:val="2D3748"/>
+          <w:sz w:val="21"/>
+        </w:rPr>
+        <w:t>Acesse Consultas &gt; Genéricos, pesquise por 'srd' e dê 2 cliques no 'SRD'.</w:t>
+      </w:r>
+    </w:p>
+    <w:p>
+      <w:pPr>
+        <w:spacing w:before="40" w:after="60" w:line="276" w:lineRule="auto"/>
+      </w:pPr>
+      <w:r>
+        <w:rPr>
+          <w:rFonts w:ascii="Arial" w:hAnsi="Arial"/>
+          <w:b/>
+          <w:color w:val="007A87"/>
+          <w:sz w:val="20"/>
+        </w:rPr>
+        <w:t xml:space="preserve">• </w:t>
+      </w:r>
+      <w:r>
+        <w:rPr>
+          <w:rFonts w:ascii="Calibri" w:hAnsi="Calibri"/>
+          <w:color w:val="2D3748"/>
+          <w:sz w:val="21"/>
+        </w:rPr>
+        <w:t>Na parte superior direita (perto do 'X' de fechar a aba), clique na opção 'Filtrar'.</w:t>
+      </w:r>
+    </w:p>
+    <w:p>
+      <w:pPr>
+        <w:spacing w:before="40" w:after="60" w:line="276" w:lineRule="auto"/>
+      </w:pPr>
+      <w:r>
+        <w:rPr>
+          <w:rFonts w:ascii="Arial" w:hAnsi="Arial"/>
+          <w:b/>
+          <w:color w:val="007A87"/>
+          <w:sz w:val="20"/>
+        </w:rPr>
+        <w:t xml:space="preserve">• </w:t>
+      </w:r>
+      <w:r>
+        <w:rPr>
+          <w:rFonts w:ascii="Calibri" w:hAnsi="Calibri"/>
+          <w:color w:val="2D3748"/>
+          <w:sz w:val="21"/>
+        </w:rPr>
+        <w:t>Crie 2 filtros SEPARADAMENTE:</w:t>
+      </w:r>
+    </w:p>
+    <w:p>
+      <w:pPr>
+        <w:pStyle w:val="ListBullet"/>
+        <w:spacing w:before="20" w:after="40" w:line="276" w:lineRule="auto"/>
+      </w:pPr>
       <w:r>
         <w:rPr>
           <w:rFonts w:ascii="Calibri" w:hAnsi="Calibri"/>
@@ -2866,7 +3314,7 @@
           <w:color w:val="2D3748"/>
           <w:sz w:val="21"/>
         </w:rPr>
-        <w:t xml:space="preserve">Acesso: </w:t>
+        <w:t xml:space="preserve">• Filtro 1: </w:t>
       </w:r>
       <w:r>
         <w:rPr>
@@ -2874,7 +3322,30 @@
           <w:color w:val="2D3748"/>
           <w:sz w:val="21"/>
         </w:rPr>
-        <w:t>Faça login no sistema TOTVS Protheus.</w:t>
+        <w:t>Campo: 'Dt. Pagamento'  |  Operador: 'Maior ou igual a'  |  Expressão: [Data inicial do período]</w:t>
+      </w:r>
+    </w:p>
+    <w:p>
+      <w:pPr>
+        <w:pStyle w:val="ListBullet"/>
+        <w:spacing w:before="20" w:after="40" w:line="276" w:lineRule="auto"/>
+      </w:pPr>
+      <w:r>
+        <w:rPr>
+          <w:rFonts w:ascii="Calibri" w:hAnsi="Calibri"/>
+          <w:b/>
+          <w:color w:val="2D3748"/>
+          <w:sz w:val="21"/>
+        </w:rPr>
+        <w:t xml:space="preserve">• Filtro 2: </w:t>
+      </w:r>
+      <w:r>
+        <w:rPr>
+          <w:rFonts w:ascii="Calibri" w:hAnsi="Calibri"/>
+          <w:color w:val="2D3748"/>
+          <w:sz w:val="21"/>
+        </w:rPr>
+        <w:t>Campo: 'Dt. Pagamento'  |  Operador: 'Menor ou igual a'  |  Expressão: [Data final do período]</w:t>
       </w:r>
     </w:p>
     <w:p>
@@ -2888,16 +3359,7 @@
           <w:color w:val="007A87"/>
           <w:sz w:val="20"/>
         </w:rPr>
-        <w:t xml:space="preserve">2. </w:t>
-      </w:r>
-      <w:r>
-        <w:rPr>
-          <w:rFonts w:ascii="Calibri" w:hAnsi="Calibri"/>
-          <w:b/>
-          <w:color w:val="2D3748"/>
-          <w:sz w:val="21"/>
-        </w:rPr>
-        <w:t xml:space="preserve">Menu: </w:t>
+        <w:t xml:space="preserve">• </w:t>
       </w:r>
       <w:r>
         <w:rPr>
@@ -2905,906 +3367,7 @@
           <w:color w:val="2D3748"/>
           <w:sz w:val="21"/>
         </w:rPr>
-        <w:t>Na parte esquerda da tela, localize e clique na aba de 'Consultas'.</w:t>
-      </w:r>
-    </w:p>
-    <w:p>
-      <w:pPr>
-        <w:spacing w:before="40" w:after="60" w:line="276" w:lineRule="auto"/>
-      </w:pPr>
-      <w:r>
-        <w:rPr>
-          <w:rFonts w:ascii="Arial" w:hAnsi="Arial"/>
-          <w:b/>
-          <w:color w:val="007A87"/>
-          <w:sz w:val="20"/>
-        </w:rPr>
-        <w:t xml:space="preserve">3. </w:t>
-      </w:r>
-      <w:r>
-        <w:rPr>
-          <w:rFonts w:ascii="Calibri" w:hAnsi="Calibri"/>
-          <w:b/>
-          <w:color w:val="2D3748"/>
-          <w:sz w:val="21"/>
-        </w:rPr>
-        <w:t xml:space="preserve">Submenu: </w:t>
-      </w:r>
-      <w:r>
-        <w:rPr>
-          <w:rFonts w:ascii="Calibri" w:hAnsi="Calibri"/>
-          <w:color w:val="2D3748"/>
-          <w:sz w:val="21"/>
-        </w:rPr>
-        <w:t>Clique na opção 'Genéricos'.</w:t>
-      </w:r>
-    </w:p>
-    <w:p>
-      <w:pPr>
-        <w:spacing w:before="40" w:after="60" w:line="276" w:lineRule="auto"/>
-      </w:pPr>
-      <w:r>
-        <w:rPr>
-          <w:rFonts w:ascii="Arial" w:hAnsi="Arial"/>
-          <w:b/>
-          <w:color w:val="007A87"/>
-          <w:sz w:val="20"/>
-        </w:rPr>
-        <w:t xml:space="preserve">4. </w:t>
-      </w:r>
-      <w:r>
-        <w:rPr>
-          <w:rFonts w:ascii="Calibri" w:hAnsi="Calibri"/>
-          <w:b/>
-          <w:color w:val="2D3748"/>
-          <w:sz w:val="21"/>
-        </w:rPr>
-        <w:t xml:space="preserve">Pesquisa: </w:t>
-      </w:r>
-      <w:r>
-        <w:rPr>
-          <w:rFonts w:ascii="Calibri" w:hAnsi="Calibri"/>
-          <w:color w:val="2D3748"/>
-          <w:sz w:val="21"/>
-        </w:rPr>
-        <w:t>Na barra de pesquisa, digite 'sra' e pressione Enter.</w:t>
-      </w:r>
-    </w:p>
-    <w:p>
-      <w:pPr>
-        <w:spacing w:before="40" w:after="60" w:line="276" w:lineRule="auto"/>
-      </w:pPr>
-      <w:r>
-        <w:rPr>
-          <w:rFonts w:ascii="Arial" w:hAnsi="Arial"/>
-          <w:b/>
-          <w:color w:val="007A87"/>
-          <w:sz w:val="20"/>
-        </w:rPr>
-        <w:t xml:space="preserve">5. </w:t>
-      </w:r>
-      <w:r>
-        <w:rPr>
-          <w:rFonts w:ascii="Calibri" w:hAnsi="Calibri"/>
-          <w:b/>
-          <w:color w:val="2D3748"/>
-          <w:sz w:val="21"/>
-        </w:rPr>
-        <w:t xml:space="preserve">Seleção: </w:t>
-      </w:r>
-      <w:r>
-        <w:rPr>
-          <w:rFonts w:ascii="Calibri" w:hAnsi="Calibri"/>
-          <w:color w:val="2D3748"/>
-          <w:sz w:val="21"/>
-        </w:rPr>
-        <w:t>Dê 2 cliques no resultado 'SRA'.</w:t>
-      </w:r>
-    </w:p>
-    <w:p>
-      <w:pPr>
-        <w:spacing w:before="40" w:after="60" w:line="276" w:lineRule="auto"/>
-      </w:pPr>
-      <w:r>
-        <w:rPr>
-          <w:rFonts w:ascii="Arial" w:hAnsi="Arial"/>
-          <w:b/>
-          <w:color w:val="007A87"/>
-          <w:sz w:val="20"/>
-        </w:rPr>
-        <w:t xml:space="preserve">6. </w:t>
-      </w:r>
-      <w:r>
-        <w:rPr>
-          <w:rFonts w:ascii="Calibri" w:hAnsi="Calibri"/>
-          <w:b/>
-          <w:color w:val="2D3748"/>
-          <w:sz w:val="21"/>
-        </w:rPr>
-        <w:t xml:space="preserve">Exportar: </w:t>
-      </w:r>
-      <w:r>
-        <w:rPr>
-          <w:rFonts w:ascii="Calibri" w:hAnsi="Calibri"/>
-          <w:color w:val="2D3748"/>
-          <w:sz w:val="21"/>
-        </w:rPr>
-        <w:t>Na parte inferior da tela, clique no botão 'Exp. CSV'.</w:t>
-      </w:r>
-    </w:p>
-    <w:p>
-      <w:pPr>
-        <w:spacing w:before="40" w:after="60" w:line="276" w:lineRule="auto"/>
-      </w:pPr>
-      <w:r>
-        <w:rPr>
-          <w:rFonts w:ascii="Arial" w:hAnsi="Arial"/>
-          <w:b/>
-          <w:color w:val="007A87"/>
-          <w:sz w:val="20"/>
-        </w:rPr>
-        <w:t xml:space="preserve">7. </w:t>
-      </w:r>
-      <w:r>
-        <w:rPr>
-          <w:rFonts w:ascii="Calibri" w:hAnsi="Calibri"/>
-          <w:b/>
-          <w:color w:val="2D3748"/>
-          <w:sz w:val="21"/>
-        </w:rPr>
-        <w:t xml:space="preserve">Confirmação: </w:t>
-      </w:r>
-      <w:r>
-        <w:rPr>
-          <w:rFonts w:ascii="Calibri" w:hAnsi="Calibri"/>
-          <w:color w:val="2D3748"/>
-          <w:sz w:val="21"/>
-        </w:rPr>
-        <w:t>Não altere nenhuma configuração na janela que abrir e clique em 'Confirmar'. O arquivo será baixado no computador.</w:t>
-      </w:r>
-    </w:p>
-    <w:p>
-      <w:pPr>
-        <w:spacing w:before="40" w:after="60" w:line="276" w:lineRule="auto"/>
-      </w:pPr>
-      <w:r>
-        <w:rPr>
-          <w:rFonts w:ascii="Arial" w:hAnsi="Arial"/>
-          <w:b/>
-          <w:color w:val="007A87"/>
-          <w:sz w:val="20"/>
-        </w:rPr>
-        <w:t xml:space="preserve">8. </w:t>
-      </w:r>
-      <w:r>
-        <w:rPr>
-          <w:rFonts w:ascii="Calibri" w:hAnsi="Calibri"/>
-          <w:b/>
-          <w:color w:val="2D3748"/>
-          <w:sz w:val="21"/>
-        </w:rPr>
-        <w:t xml:space="preserve">Conversão Obrigatória: </w:t>
-      </w:r>
-      <w:r>
-        <w:rPr>
-          <w:rFonts w:ascii="Calibri" w:hAnsi="Calibri"/>
-          <w:color w:val="2D3748"/>
-          <w:sz w:val="21"/>
-        </w:rPr>
-        <w:t>Abra o arquivo baixado no Excel, vá em Arquivo &gt; Salvar Como e selecione o formato 'CSV UTF-8 (delimitado por vírgulas) (*.csv)'.</w:t>
-      </w:r>
-    </w:p>
-    <w:p>
-      <w:pPr>
-        <w:spacing w:before="40" w:after="60" w:line="276" w:lineRule="auto"/>
-      </w:pPr>
-      <w:r>
-        <w:rPr>
-          <w:rFonts w:ascii="Arial" w:hAnsi="Arial"/>
-          <w:b/>
-          <w:color w:val="007A87"/>
-          <w:sz w:val="20"/>
-        </w:rPr>
-        <w:t xml:space="preserve">9. </w:t>
-      </w:r>
-      <w:r>
-        <w:rPr>
-          <w:rFonts w:ascii="Calibri" w:hAnsi="Calibri"/>
-          <w:b/>
-          <w:color w:val="2D3748"/>
-          <w:sz w:val="21"/>
-        </w:rPr>
-        <w:t xml:space="preserve">Importação: </w:t>
-      </w:r>
-      <w:r>
-        <w:rPr>
-          <w:rFonts w:ascii="Calibri" w:hAnsi="Calibri"/>
-          <w:color w:val="2D3748"/>
-          <w:sz w:val="21"/>
-        </w:rPr>
-        <w:t>Pronto! O arquivo agora pode ser importado diretamente no Sistema de Análises Operacionais.</w:t>
-      </w:r>
-    </w:p>
-    <w:p>
-      <w:pPr>
-        <w:pStyle w:val="Heading3"/>
-        <w:keepNext/>
-        <w:spacing w:before="160" w:after="40"/>
-      </w:pPr>
-      <w:r>
-        <w:rPr>
-          <w:rFonts w:ascii="Calibri" w:hAnsi="Calibri"/>
-          <w:b/>
-          <w:color w:val="2D3748"/>
-          <w:sz w:val="23"/>
-        </w:rPr>
-        <w:t>B) Extração do Arquivo SRG (Termos de Rescisão / Turnover):</w:t>
-      </w:r>
-    </w:p>
-    <w:p>
-      <w:pPr>
-        <w:spacing w:before="40" w:after="60" w:line="276" w:lineRule="auto"/>
-      </w:pPr>
-      <w:r>
-        <w:rPr>
-          <w:rFonts w:ascii="Arial" w:hAnsi="Arial"/>
-          <w:b/>
-          <w:color w:val="007A87"/>
-          <w:sz w:val="20"/>
-        </w:rPr>
-        <w:t xml:space="preserve">1. </w:t>
-      </w:r>
-      <w:r>
-        <w:rPr>
-          <w:rFonts w:ascii="Calibri" w:hAnsi="Calibri"/>
-          <w:b/>
-          <w:color w:val="2D3748"/>
-          <w:sz w:val="21"/>
-        </w:rPr>
-        <w:t xml:space="preserve">Navegação: </w:t>
-      </w:r>
-      <w:r>
-        <w:rPr>
-          <w:rFonts w:ascii="Calibri" w:hAnsi="Calibri"/>
-          <w:color w:val="2D3748"/>
-          <w:sz w:val="21"/>
-        </w:rPr>
-        <w:t>Siga exatamente o mesmo caminho do SRA: Acesse TOTVS &gt; Consultas &gt; Genéricos.</w:t>
-      </w:r>
-    </w:p>
-    <w:p>
-      <w:pPr>
-        <w:spacing w:before="40" w:after="60" w:line="276" w:lineRule="auto"/>
-      </w:pPr>
-      <w:r>
-        <w:rPr>
-          <w:rFonts w:ascii="Arial" w:hAnsi="Arial"/>
-          <w:b/>
-          <w:color w:val="007A87"/>
-          <w:sz w:val="20"/>
-        </w:rPr>
-        <w:t xml:space="preserve">2. </w:t>
-      </w:r>
-      <w:r>
-        <w:rPr>
-          <w:rFonts w:ascii="Calibri" w:hAnsi="Calibri"/>
-          <w:b/>
-          <w:color w:val="2D3748"/>
-          <w:sz w:val="21"/>
-        </w:rPr>
-        <w:t xml:space="preserve">Pesquisa: </w:t>
-      </w:r>
-      <w:r>
-        <w:rPr>
-          <w:rFonts w:ascii="Calibri" w:hAnsi="Calibri"/>
-          <w:color w:val="2D3748"/>
-          <w:sz w:val="21"/>
-        </w:rPr>
-        <w:t>Ao invés de pesquisar por 'sra', pesquise por 'srg'.</w:t>
-      </w:r>
-    </w:p>
-    <w:p>
-      <w:pPr>
-        <w:spacing w:before="40" w:after="60" w:line="276" w:lineRule="auto"/>
-      </w:pPr>
-      <w:r>
-        <w:rPr>
-          <w:rFonts w:ascii="Arial" w:hAnsi="Arial"/>
-          <w:b/>
-          <w:color w:val="007A87"/>
-          <w:sz w:val="20"/>
-        </w:rPr>
-        <w:t xml:space="preserve">3. </w:t>
-      </w:r>
-      <w:r>
-        <w:rPr>
-          <w:rFonts w:ascii="Calibri" w:hAnsi="Calibri"/>
-          <w:b/>
-          <w:color w:val="2D3748"/>
-          <w:sz w:val="21"/>
-        </w:rPr>
-        <w:t xml:space="preserve">Seleção: </w:t>
-      </w:r>
-      <w:r>
-        <w:rPr>
-          <w:rFonts w:ascii="Calibri" w:hAnsi="Calibri"/>
-          <w:color w:val="2D3748"/>
-          <w:sz w:val="21"/>
-        </w:rPr>
-        <w:t>Dê 2 cliques no resultado 'SRG'.</w:t>
-      </w:r>
-    </w:p>
-    <w:p>
-      <w:pPr>
-        <w:spacing w:before="40" w:after="60" w:line="276" w:lineRule="auto"/>
-      </w:pPr>
-      <w:r>
-        <w:rPr>
-          <w:rFonts w:ascii="Arial" w:hAnsi="Arial"/>
-          <w:b/>
-          <w:color w:val="007A87"/>
-          <w:sz w:val="20"/>
-        </w:rPr>
-        <w:t xml:space="preserve">4. </w:t>
-      </w:r>
-      <w:r>
-        <w:rPr>
-          <w:rFonts w:ascii="Calibri" w:hAnsi="Calibri"/>
-          <w:b/>
-          <w:color w:val="2D3748"/>
-          <w:sz w:val="21"/>
-        </w:rPr>
-        <w:t xml:space="preserve">Exportar: </w:t>
-      </w:r>
-      <w:r>
-        <w:rPr>
-          <w:rFonts w:ascii="Calibri" w:hAnsi="Calibri"/>
-          <w:color w:val="2D3748"/>
-          <w:sz w:val="21"/>
-        </w:rPr>
-        <w:t>Na parte inferior da tela, clique no botão 'Exp. CSV', confirme sem alterar nada e baixe o arquivo.</w:t>
-      </w:r>
-    </w:p>
-    <w:p>
-      <w:pPr>
-        <w:spacing w:before="40" w:after="60" w:line="276" w:lineRule="auto"/>
-      </w:pPr>
-      <w:r>
-        <w:rPr>
-          <w:rFonts w:ascii="Arial" w:hAnsi="Arial"/>
-          <w:b/>
-          <w:color w:val="007A87"/>
-          <w:sz w:val="20"/>
-        </w:rPr>
-        <w:t xml:space="preserve">5. </w:t>
-      </w:r>
-      <w:r>
-        <w:rPr>
-          <w:rFonts w:ascii="Calibri" w:hAnsi="Calibri"/>
-          <w:b/>
-          <w:color w:val="2D3748"/>
-          <w:sz w:val="21"/>
-        </w:rPr>
-        <w:t xml:space="preserve">Importação Direta: </w:t>
-      </w:r>
-      <w:r>
-        <w:rPr>
-          <w:rFonts w:ascii="Calibri" w:hAnsi="Calibri"/>
-          <w:color w:val="2D3748"/>
-          <w:sz w:val="21"/>
-        </w:rPr>
-        <w:t>Diferente do SRA, o SRG não necessita de nenhuma conversão no Excel! Pode importar diretamente no sistema do jeito que foi baixado.</w:t>
-      </w:r>
-    </w:p>
-    <w:p>
-      <w:pPr>
-        <w:pStyle w:val="Heading3"/>
-        <w:keepNext/>
-        <w:spacing w:before="160" w:after="40"/>
-      </w:pPr>
-      <w:r>
-        <w:rPr>
-          <w:rFonts w:ascii="Calibri" w:hAnsi="Calibri"/>
-          <w:b/>
-          <w:color w:val="2D3748"/>
-          <w:sz w:val="23"/>
-        </w:rPr>
-        <w:t>C) Extração de Valores de Rescisão - TOTVS Líquidos (GPER020):</w:t>
-      </w:r>
-    </w:p>
-    <w:p>
-      <w:pPr>
-        <w:spacing w:before="40" w:after="60" w:line="276" w:lineRule="auto"/>
-      </w:pPr>
-      <w:r>
-        <w:rPr>
-          <w:rFonts w:ascii="Arial" w:hAnsi="Arial"/>
-          <w:b/>
-          <w:color w:val="007A87"/>
-          <w:sz w:val="20"/>
-        </w:rPr>
-        <w:t xml:space="preserve">1. </w:t>
-      </w:r>
-      <w:r>
-        <w:rPr>
-          <w:rFonts w:ascii="Calibri" w:hAnsi="Calibri"/>
-          <w:b/>
-          <w:color w:val="2D3748"/>
-          <w:sz w:val="21"/>
-        </w:rPr>
-        <w:t xml:space="preserve">Pesquisa: </w:t>
-      </w:r>
-      <w:r>
-        <w:rPr>
-          <w:rFonts w:ascii="Calibri" w:hAnsi="Calibri"/>
-          <w:color w:val="2D3748"/>
-          <w:sz w:val="21"/>
-        </w:rPr>
-        <w:t>Na página inicial do TOTVS, vá na barra de pesquisa localizada à esquerda e pesquise por 'liquido' (ou 'líquido').</w:t>
-      </w:r>
-    </w:p>
-    <w:p>
-      <w:pPr>
-        <w:spacing w:before="40" w:after="60" w:line="276" w:lineRule="auto"/>
-      </w:pPr>
-      <w:r>
-        <w:rPr>
-          <w:rFonts w:ascii="Arial" w:hAnsi="Arial"/>
-          <w:b/>
-          <w:color w:val="007A87"/>
-          <w:sz w:val="20"/>
-        </w:rPr>
-        <w:t xml:space="preserve">2. </w:t>
-      </w:r>
-      <w:r>
-        <w:rPr>
-          <w:rFonts w:ascii="Calibri" w:hAnsi="Calibri"/>
-          <w:b/>
-          <w:color w:val="2D3748"/>
-          <w:sz w:val="21"/>
-        </w:rPr>
-        <w:t xml:space="preserve">Módulo: </w:t>
-      </w:r>
-      <w:r>
-        <w:rPr>
-          <w:rFonts w:ascii="Calibri" w:hAnsi="Calibri"/>
-          <w:color w:val="2D3748"/>
-          <w:sz w:val="21"/>
-        </w:rPr>
-        <w:t>Na janela que abrir, vá em 'Gestão de Pessoal'.</w:t>
-      </w:r>
-    </w:p>
-    <w:p>
-      <w:pPr>
-        <w:spacing w:before="40" w:after="60" w:line="276" w:lineRule="auto"/>
-      </w:pPr>
-      <w:r>
-        <w:rPr>
-          <w:rFonts w:ascii="Arial" w:hAnsi="Arial"/>
-          <w:b/>
-          <w:color w:val="007A87"/>
-          <w:sz w:val="20"/>
-        </w:rPr>
-        <w:t xml:space="preserve">3. </w:t>
-      </w:r>
-      <w:r>
-        <w:rPr>
-          <w:rFonts w:ascii="Calibri" w:hAnsi="Calibri"/>
-          <w:b/>
-          <w:color w:val="2D3748"/>
-          <w:sz w:val="21"/>
-        </w:rPr>
-        <w:t xml:space="preserve">Rotina: </w:t>
-      </w:r>
-      <w:r>
-        <w:rPr>
-          <w:rFonts w:ascii="Calibri" w:hAnsi="Calibri"/>
-          <w:color w:val="2D3748"/>
-          <w:sz w:val="21"/>
-        </w:rPr>
-        <w:t>Na seção de 'Periódicos', clique na opção 'Líquidos'.</w:t>
-      </w:r>
-    </w:p>
-    <w:p>
-      <w:pPr>
-        <w:spacing w:before="40" w:after="60" w:line="276" w:lineRule="auto"/>
-      </w:pPr>
-      <w:r>
-        <w:rPr>
-          <w:rFonts w:ascii="Arial" w:hAnsi="Arial"/>
-          <w:b/>
-          <w:color w:val="007A87"/>
-          <w:sz w:val="20"/>
-        </w:rPr>
-        <w:t xml:space="preserve">4. </w:t>
-      </w:r>
-      <w:r>
-        <w:rPr>
-          <w:rFonts w:ascii="Calibri" w:hAnsi="Calibri"/>
-          <w:b/>
-          <w:color w:val="2D3748"/>
-          <w:sz w:val="21"/>
-        </w:rPr>
-        <w:t xml:space="preserve">Configuração de Parâmetros: </w:t>
-      </w:r>
-      <w:r>
-        <w:rPr>
-          <w:rFonts w:ascii="Calibri" w:hAnsi="Calibri"/>
-          <w:color w:val="2D3748"/>
-          <w:sz w:val="21"/>
-        </w:rPr>
-        <w:t>Na janela de parâmetros que se abrirá, configure exatamente os campos abaixo:</w:t>
-      </w:r>
-    </w:p>
-    <w:p>
-      <w:pPr>
-        <w:pStyle w:val="ListBullet"/>
-        <w:spacing w:before="20" w:after="40" w:line="276" w:lineRule="auto"/>
-      </w:pPr>
-      <w:r>
-        <w:rPr>
-          <w:rFonts w:ascii="Calibri" w:hAnsi="Calibri"/>
-          <w:b/>
-          <w:color w:val="2D3748"/>
-          <w:sz w:val="21"/>
-        </w:rPr>
-        <w:t xml:space="preserve">• À esquerda (Tipo de saída): </w:t>
-      </w:r>
-      <w:r>
-        <w:rPr>
-          <w:rFonts w:ascii="Calibri" w:hAnsi="Calibri"/>
-          <w:color w:val="2D3748"/>
-          <w:sz w:val="21"/>
-        </w:rPr>
-        <w:t>Selecione a opção 'Planilha'.</w:t>
-      </w:r>
-    </w:p>
-    <w:p>
-      <w:pPr>
-        <w:pStyle w:val="ListBullet"/>
-        <w:spacing w:before="20" w:after="40" w:line="276" w:lineRule="auto"/>
-      </w:pPr>
-      <w:r>
-        <w:rPr>
-          <w:rFonts w:ascii="Calibri" w:hAnsi="Calibri"/>
-          <w:b/>
-          <w:color w:val="2D3748"/>
-          <w:sz w:val="21"/>
-        </w:rPr>
-        <w:t xml:space="preserve">• À direita (Tipo de planilha): </w:t>
-      </w:r>
-      <w:r>
-        <w:rPr>
-          <w:rFonts w:ascii="Calibri" w:hAnsi="Calibri"/>
-          <w:color w:val="2D3748"/>
-          <w:sz w:val="21"/>
-        </w:rPr>
-        <w:t>Altere a opção 'Tipo de planilha' para 'Formato de tabela'.</w:t>
-      </w:r>
-    </w:p>
-    <w:p>
-      <w:pPr>
-        <w:pStyle w:val="ListBullet"/>
-        <w:spacing w:before="20" w:after="40" w:line="276" w:lineRule="auto"/>
-      </w:pPr>
-      <w:r>
-        <w:rPr>
-          <w:rFonts w:ascii="Calibri" w:hAnsi="Calibri"/>
-          <w:b/>
-          <w:color w:val="2D3748"/>
-          <w:sz w:val="21"/>
-        </w:rPr>
-        <w:t xml:space="preserve">• Configurações de Ordem: </w:t>
-      </w:r>
-      <w:r>
-        <w:rPr>
-          <w:rFonts w:ascii="Calibri" w:hAnsi="Calibri"/>
-          <w:color w:val="2D3748"/>
-          <w:sz w:val="21"/>
-        </w:rPr>
-        <w:t>Mude a opção 'Ordem' para 'Filial+Bco/Ag.+Cc+Mat'.</w:t>
-      </w:r>
-    </w:p>
-    <w:p>
-      <w:pPr>
-        <w:pStyle w:val="ListBullet"/>
-        <w:spacing w:before="20" w:after="40" w:line="276" w:lineRule="auto"/>
-      </w:pPr>
-      <w:r>
-        <w:rPr>
-          <w:rFonts w:ascii="Calibri" w:hAnsi="Calibri"/>
-          <w:b/>
-          <w:color w:val="2D3748"/>
-          <w:sz w:val="21"/>
-        </w:rPr>
-        <w:t xml:space="preserve">• Parâmetros de Filtro: </w:t>
-      </w:r>
-      <w:r>
-        <w:rPr>
-          <w:rFonts w:ascii="Calibri" w:hAnsi="Calibri"/>
-          <w:color w:val="2D3748"/>
-          <w:sz w:val="21"/>
-        </w:rPr>
-        <w:t>Na parte inferior, em 'Outras Ações', verifique se os parâmetros estão preenchidos como 'RES' (Rescisão).</w:t>
-      </w:r>
-    </w:p>
-    <w:p>
-      <w:pPr>
-        <w:spacing w:before="40" w:after="60" w:line="276" w:lineRule="auto"/>
-      </w:pPr>
-      <w:r>
-        <w:rPr>
-          <w:rFonts w:ascii="Arial" w:hAnsi="Arial"/>
-          <w:b/>
-          <w:color w:val="007A87"/>
-          <w:sz w:val="20"/>
-        </w:rPr>
-        <w:t xml:space="preserve">5. </w:t>
-      </w:r>
-      <w:r>
-        <w:rPr>
-          <w:rFonts w:ascii="Calibri" w:hAnsi="Calibri"/>
-          <w:b/>
-          <w:color w:val="2D3748"/>
-          <w:sz w:val="21"/>
-        </w:rPr>
-        <w:t xml:space="preserve">Gerar Relatório: </w:t>
-      </w:r>
-      <w:r>
-        <w:rPr>
-          <w:rFonts w:ascii="Calibri" w:hAnsi="Calibri"/>
-          <w:color w:val="2D3748"/>
-          <w:sz w:val="21"/>
-        </w:rPr>
-        <w:t>Clique em 'Imprimir'. O relatório em formato tabela (.xml ou .xlsx) será gerado.</w:t>
-      </w:r>
-    </w:p>
-    <w:p>
-      <w:pPr>
-        <w:spacing w:before="40" w:after="60" w:line="276" w:lineRule="auto"/>
-      </w:pPr>
-      <w:r>
-        <w:rPr>
-          <w:rFonts w:ascii="Arial" w:hAnsi="Arial"/>
-          <w:b/>
-          <w:color w:val="007A87"/>
-          <w:sz w:val="20"/>
-        </w:rPr>
-        <w:t xml:space="preserve">6. </w:t>
-      </w:r>
-      <w:r>
-        <w:rPr>
-          <w:rFonts w:ascii="Calibri" w:hAnsi="Calibri"/>
-          <w:b/>
-          <w:color w:val="2D3748"/>
-          <w:sz w:val="21"/>
-        </w:rPr>
-        <w:t xml:space="preserve">Importação: </w:t>
-      </w:r>
-      <w:r>
-        <w:rPr>
-          <w:rFonts w:ascii="Calibri" w:hAnsi="Calibri"/>
-          <w:color w:val="2D3748"/>
-          <w:sz w:val="21"/>
-        </w:rPr>
-        <w:t>Pode ser importado no sistema exatamente do jeito que for baixado!</w:t>
-      </w:r>
-    </w:p>
-    <w:p>
-      <w:pPr>
-        <w:pStyle w:val="Heading3"/>
-        <w:keepNext/>
-        <w:spacing w:before="160" w:after="40"/>
-      </w:pPr>
-      <w:r>
-        <w:rPr>
-          <w:rFonts w:ascii="Calibri" w:hAnsi="Calibri"/>
-          <w:b/>
-          <w:color w:val="2D3748"/>
-          <w:sz w:val="23"/>
-        </w:rPr>
-        <w:t>D) Extração do Arquivo SRD (Folha de Pagamento Sintética/Analítica):</w:t>
-      </w:r>
-    </w:p>
-    <w:p>
-      <w:pPr>
-        <w:spacing w:before="40" w:after="60" w:line="276" w:lineRule="auto"/>
-      </w:pPr>
-      <w:r>
-        <w:rPr>
-          <w:rFonts w:ascii="Arial" w:hAnsi="Arial"/>
-          <w:b/>
-          <w:color w:val="007A87"/>
-          <w:sz w:val="20"/>
-        </w:rPr>
-        <w:t xml:space="preserve">1. </w:t>
-      </w:r>
-      <w:r>
-        <w:rPr>
-          <w:rFonts w:ascii="Calibri" w:hAnsi="Calibri"/>
-          <w:b/>
-          <w:color w:val="2D3748"/>
-          <w:sz w:val="21"/>
-        </w:rPr>
-        <w:t xml:space="preserve">Navegação: </w:t>
-      </w:r>
-      <w:r>
-        <w:rPr>
-          <w:rFonts w:ascii="Calibri" w:hAnsi="Calibri"/>
-          <w:color w:val="2D3748"/>
-          <w:sz w:val="21"/>
-        </w:rPr>
-        <w:t>Acesse TOTVS &gt; Consultas &gt; Genéricos, pesquise por 'srd' e dê 2 cliques no 'SRD'.</w:t>
-      </w:r>
-    </w:p>
-    <w:p>
-      <w:pPr>
-        <w:spacing w:before="40" w:after="60" w:line="276" w:lineRule="auto"/>
-      </w:pPr>
-      <w:r>
-        <w:rPr>
-          <w:rFonts w:ascii="Arial" w:hAnsi="Arial"/>
-          <w:b/>
-          <w:color w:val="007A87"/>
-          <w:sz w:val="20"/>
-        </w:rPr>
-        <w:t xml:space="preserve">2. </w:t>
-      </w:r>
-      <w:r>
-        <w:rPr>
-          <w:rFonts w:ascii="Calibri" w:hAnsi="Calibri"/>
-          <w:b/>
-          <w:color w:val="2D3748"/>
-          <w:sz w:val="21"/>
-        </w:rPr>
-        <w:t xml:space="preserve">Abrir Filtro: </w:t>
-      </w:r>
-      <w:r>
-        <w:rPr>
-          <w:rFonts w:ascii="Calibri" w:hAnsi="Calibri"/>
-          <w:color w:val="2D3748"/>
-          <w:sz w:val="21"/>
-        </w:rPr>
-        <w:t>Na parte superior direita da janela (bem próximo ao botão 'X' de fechar a aba), clique na opção 'Filtrar'.</w:t>
-      </w:r>
-    </w:p>
-    <w:p>
-      <w:pPr>
-        <w:spacing w:before="40" w:after="60" w:line="276" w:lineRule="auto"/>
-      </w:pPr>
-      <w:r>
-        <w:rPr>
-          <w:rFonts w:ascii="Arial" w:hAnsi="Arial"/>
-          <w:b/>
-          <w:color w:val="007A87"/>
-          <w:sz w:val="20"/>
-        </w:rPr>
-        <w:t xml:space="preserve">3. </w:t>
-      </w:r>
-      <w:r>
-        <w:rPr>
-          <w:rFonts w:ascii="Calibri" w:hAnsi="Calibri"/>
-          <w:b/>
-          <w:color w:val="2D3748"/>
-          <w:sz w:val="21"/>
-        </w:rPr>
-        <w:t xml:space="preserve">Criação de Filtros Obrigatórios: </w:t>
-      </w:r>
-      <w:r>
-        <w:rPr>
-          <w:rFonts w:ascii="Calibri" w:hAnsi="Calibri"/>
-          <w:color w:val="2D3748"/>
-          <w:sz w:val="21"/>
-        </w:rPr>
-        <w:t>Crie 2 filtros SEPARADAMENTE:</w:t>
-      </w:r>
-    </w:p>
-    <w:p>
-      <w:pPr>
-        <w:pStyle w:val="ListBullet"/>
-        <w:spacing w:before="20" w:after="40" w:line="276" w:lineRule="auto"/>
-      </w:pPr>
-      <w:r>
-        <w:rPr>
-          <w:rFonts w:ascii="Calibri" w:hAnsi="Calibri"/>
-          <w:b/>
-          <w:color w:val="2D3748"/>
-          <w:sz w:val="21"/>
-        </w:rPr>
-        <w:t xml:space="preserve">• Filtro 1 (Data Inicial): </w:t>
-      </w:r>
-      <w:r>
-        <w:rPr>
-          <w:rFonts w:ascii="Calibri" w:hAnsi="Calibri"/>
-          <w:color w:val="2D3748"/>
-          <w:sz w:val="21"/>
-        </w:rPr>
-        <w:t>Campo: 'Dt. Pagamento'  |  Operador: 'Maior ou igual a'  |  Expressão: [Selecione a data inicial do período]</w:t>
-      </w:r>
-    </w:p>
-    <w:p>
-      <w:pPr>
-        <w:pStyle w:val="ListBullet"/>
-        <w:spacing w:before="20" w:after="40" w:line="276" w:lineRule="auto"/>
-      </w:pPr>
-      <w:r>
-        <w:rPr>
-          <w:rFonts w:ascii="Calibri" w:hAnsi="Calibri"/>
-          <w:b/>
-          <w:color w:val="2D3748"/>
-          <w:sz w:val="21"/>
-        </w:rPr>
-        <w:t xml:space="preserve">• Filtro 2 (Data Final): </w:t>
-      </w:r>
-      <w:r>
-        <w:rPr>
-          <w:rFonts w:ascii="Calibri" w:hAnsi="Calibri"/>
-          <w:color w:val="2D3748"/>
-          <w:sz w:val="21"/>
-        </w:rPr>
-        <w:t>Campo: 'Dt. Pagamento'  |  Operador: 'Menor ou igual a'  |  Expressão: [Selecione a data final do período]</w:t>
-      </w:r>
-    </w:p>
-    <w:p>
-      <w:pPr>
-        <w:spacing w:before="40" w:after="60" w:line="276" w:lineRule="auto"/>
-      </w:pPr>
-      <w:r>
-        <w:rPr>
-          <w:rFonts w:ascii="Arial" w:hAnsi="Arial"/>
-          <w:b/>
-          <w:color w:val="007A87"/>
-          <w:sz w:val="20"/>
-        </w:rPr>
-        <w:t xml:space="preserve">4. </w:t>
-      </w:r>
-      <w:r>
-        <w:rPr>
-          <w:rFonts w:ascii="Calibri" w:hAnsi="Calibri"/>
-          <w:b/>
-          <w:color w:val="2D3748"/>
-          <w:sz w:val="21"/>
-        </w:rPr>
-        <w:t xml:space="preserve">Exportar: </w:t>
-      </w:r>
-      <w:r>
-        <w:rPr>
-          <w:rFonts w:ascii="Calibri" w:hAnsi="Calibri"/>
-          <w:color w:val="2D3748"/>
-          <w:sz w:val="21"/>
-        </w:rPr>
-        <w:t>Após criar e aplicar ambos os filtros, clique no botão 'Exp. CSV' na parte inferior da tela.</w:t>
-      </w:r>
-    </w:p>
-    <w:p>
-      <w:pPr>
-        <w:spacing w:before="40" w:after="60" w:line="276" w:lineRule="auto"/>
-      </w:pPr>
-      <w:r>
-        <w:rPr>
-          <w:rFonts w:ascii="Arial" w:hAnsi="Arial"/>
-          <w:b/>
-          <w:color w:val="007A87"/>
-          <w:sz w:val="20"/>
-        </w:rPr>
-        <w:t xml:space="preserve">5. </w:t>
-      </w:r>
-      <w:r>
-        <w:rPr>
-          <w:rFonts w:ascii="Calibri" w:hAnsi="Calibri"/>
-          <w:b/>
-          <w:color w:val="2D3748"/>
-          <w:sz w:val="21"/>
-        </w:rPr>
-        <w:t xml:space="preserve">Importação Direta: </w:t>
-      </w:r>
-      <w:r>
-        <w:rPr>
-          <w:rFonts w:ascii="Calibri" w:hAnsi="Calibri"/>
-          <w:color w:val="2D3748"/>
-          <w:sz w:val="21"/>
-        </w:rPr>
-        <w:t>O arquivo pode ser importado no sistema diretamente, sem necessidade de edições.</w:t>
+        <w:t>Após aplicar ambos os filtros, clique no botão 'Exp. CSV'. O arquivo pode ser importado diretamente do jeito que for baixado.</w:t>
       </w:r>
     </w:p>
     <w:tbl>
@@ -3845,7 +3408,7 @@
                 <w:color w:val="DD6B20"/>
                 <w:sz w:val="21"/>
               </w:rPr>
-              <w:t xml:space="preserve">📌 LEMBRETE FUNDAMENTAL SOBRE A DATA DA FOLHA (SRD): </w:t>
+              <w:t xml:space="preserve">📌 LEMBRETE DA FOLHA SRD: </w:t>
             </w:r>
             <w:r>
               <w:rPr>
@@ -3853,7 +3416,7 @@
                 <w:color w:val="2D3748"/>
                 <w:sz w:val="20"/>
               </w:rPr>
-              <w:t>Os dados baixados no SRD com o filtro de 01/09/2026 a 30/09/2026 referem-se contabilmente à folha do MÊS 8 (Agosto)! Isso acontece porque o campo 'Dt. Pagamento' reflete a data em que o salário caiu na conta (5º dia útil do mês seguinte). Sempre selecione o mês correto de referência no sistema na hora da carga.</w:t>
+              <w:t>Os dados baixados no SRD com o filtro de 01/09/2026 a 30/09/2026 referem-se contabilmente à folha do MÊS 8 (Agosto)! Isso acontece porque o campo 'Dt. Pagamento' reflete a data em que o salário foi creditado (5º dia útil do mês seguinte). Sempre selecione o mês 8 no sistema ao realizar a carga desse arquivo.</w:t>
             </w:r>
           </w:p>
         </w:tc>
@@ -3866,6 +3429,410 @@
     </w:p>
     <w:p>
       <w:pPr>
+        <w:pStyle w:val="Heading3"/>
+        <w:keepNext/>
+        <w:spacing w:before="160" w:after="40"/>
+      </w:pPr>
+      <w:r>
+        <w:rPr>
+          <w:rFonts w:ascii="Calibri" w:hAnsi="Calibri"/>
+          <w:b/>
+          <w:color w:val="2D3748"/>
+          <w:sz w:val="23"/>
+        </w:rPr>
+        <w:t>B) Extração da Base de Diárias (Sistema + Manual do Tom):</w:t>
+      </w:r>
+    </w:p>
+    <w:p>
+      <w:pPr>
+        <w:spacing w:before="0" w:after="80" w:line="276" w:lineRule="auto"/>
+      </w:pPr>
+      <w:r>
+        <w:rPr>
+          <w:rFonts w:ascii="Calibri" w:hAnsi="Calibri"/>
+          <w:b/>
+          <w:i w:val="0"/>
+          <w:color w:val="2D3748"/>
+          <w:sz w:val="21"/>
+        </w:rPr>
+        <w:t>Para o módulo de Diárias, são necessárias duas bases para cruzamento e unificação:</w:t>
+      </w:r>
+    </w:p>
+    <w:p>
+      <w:pPr>
+        <w:pStyle w:val="ListBullet"/>
+        <w:spacing w:before="20" w:after="40" w:line="276" w:lineRule="auto"/>
+      </w:pPr>
+      <w:r>
+        <w:rPr>
+          <w:rFonts w:ascii="Calibri" w:hAnsi="Calibri"/>
+          <w:b/>
+          <w:color w:val="2D3748"/>
+          <w:sz w:val="21"/>
+        </w:rPr>
+        <w:t xml:space="preserve">1. Base Manual: </w:t>
+      </w:r>
+      <w:r>
+        <w:rPr>
+          <w:rFonts w:ascii="Calibri" w:hAnsi="Calibri"/>
+          <w:color w:val="2D3748"/>
+          <w:sz w:val="21"/>
+        </w:rPr>
+        <w:t>Peça a planilha de diárias manuais atualizada diretamente ao Tom.</w:t>
+      </w:r>
+    </w:p>
+    <w:p>
+      <w:pPr>
+        <w:pStyle w:val="ListBullet"/>
+        <w:spacing w:before="20" w:after="40" w:line="276" w:lineRule="auto"/>
+      </w:pPr>
+      <w:r>
+        <w:rPr>
+          <w:rFonts w:ascii="Calibri" w:hAnsi="Calibri"/>
+          <w:b/>
+          <w:color w:val="2D3748"/>
+          <w:sz w:val="21"/>
+        </w:rPr>
+        <w:t xml:space="preserve">2. Base do Sistema: </w:t>
+      </w:r>
+      <w:r>
+        <w:rPr>
+          <w:rFonts w:ascii="Calibri" w:hAnsi="Calibri"/>
+          <w:color w:val="2D3748"/>
+          <w:sz w:val="21"/>
+        </w:rPr>
+        <w:t>Acesse o sistema interno da empresa (Central do Colaborador). Na aba da esquerda, selecione: Operacional &gt; Diárias &gt; Histórico. Na parte superior direita da tela, clique em 'Exportar CSV'. Selecione o período: desde 01 de abril de 2026 até o dia atual. Baixe o arquivo.</w:t>
+      </w:r>
+    </w:p>
+    <w:p>
+      <w:pPr>
+        <w:pStyle w:val="ListBullet"/>
+        <w:spacing w:before="20" w:after="40" w:line="276" w:lineRule="auto"/>
+      </w:pPr>
+      <w:r>
+        <w:rPr>
+          <w:rFonts w:ascii="Calibri" w:hAnsi="Calibri"/>
+          <w:b/>
+          <w:color w:val="2D3748"/>
+          <w:sz w:val="21"/>
+        </w:rPr>
+        <w:t xml:space="preserve">3. Como Importar: </w:t>
+      </w:r>
+      <w:r>
+        <w:rPr>
+          <w:rFonts w:ascii="Calibri" w:hAnsi="Calibri"/>
+          <w:color w:val="2D3748"/>
+          <w:sz w:val="21"/>
+        </w:rPr>
+        <w:t>No Sistema de Análises Operacionais, acesse o menu de Diárias, selecione o CSV baixado do sistema e o arquivo manual enviado pelo Tom, e suba os dois juntos.</w:t>
+      </w:r>
+    </w:p>
+    <w:p>
+      <w:pPr>
+        <w:pStyle w:val="Heading3"/>
+        <w:keepNext/>
+        <w:spacing w:before="160" w:after="40"/>
+      </w:pPr>
+      <w:r>
+        <w:rPr>
+          <w:rFonts w:ascii="Calibri" w:hAnsi="Calibri"/>
+          <w:b/>
+          <w:color w:val="2D3748"/>
+          <w:sz w:val="23"/>
+        </w:rPr>
+        <w:t>C) Extração da Base de Prêmios (Sistema + Planilha de Controle F:\):</w:t>
+      </w:r>
+    </w:p>
+    <w:p>
+      <w:pPr>
+        <w:spacing w:before="0" w:after="80" w:line="276" w:lineRule="auto"/>
+      </w:pPr>
+      <w:r>
+        <w:rPr>
+          <w:rFonts w:ascii="Calibri" w:hAnsi="Calibri"/>
+          <w:b/>
+          <w:i w:val="0"/>
+          <w:color w:val="2D3748"/>
+          <w:sz w:val="21"/>
+        </w:rPr>
+        <w:t>Para o módulo de Prêmios, a unificação também requer as duas fontes:</w:t>
+      </w:r>
+    </w:p>
+    <w:p>
+      <w:pPr>
+        <w:pStyle w:val="ListBullet"/>
+        <w:spacing w:before="20" w:after="40" w:line="276" w:lineRule="auto"/>
+      </w:pPr>
+      <w:r>
+        <w:rPr>
+          <w:rFonts w:ascii="Calibri" w:hAnsi="Calibri"/>
+          <w:b/>
+          <w:color w:val="2D3748"/>
+          <w:sz w:val="21"/>
+        </w:rPr>
+        <w:t xml:space="preserve">1. Base do Sistema: </w:t>
+      </w:r>
+      <w:r>
+        <w:rPr>
+          <w:rFonts w:ascii="Calibri" w:hAnsi="Calibri"/>
+          <w:color w:val="2D3748"/>
+          <w:sz w:val="21"/>
+        </w:rPr>
+        <w:t>Acesse a Central do Colaborador. Na aba da esquerda, vá em Configurações &gt; Relatórios, selecione o período desejado e clique em 'Exportar CSV'.</w:t>
+      </w:r>
+    </w:p>
+    <w:p>
+      <w:pPr>
+        <w:pStyle w:val="ListBullet"/>
+        <w:spacing w:before="20" w:after="40" w:line="276" w:lineRule="auto"/>
+      </w:pPr>
+      <w:r>
+        <w:rPr>
+          <w:rFonts w:ascii="Calibri" w:hAnsi="Calibri"/>
+          <w:b/>
+          <w:color w:val="2D3748"/>
+          <w:sz w:val="21"/>
+        </w:rPr>
+        <w:t xml:space="preserve">2. Base Manual (Rede F:\): </w:t>
+      </w:r>
+      <w:r>
+        <w:rPr>
+          <w:rFonts w:ascii="Calibri" w:hAnsi="Calibri"/>
+          <w:color w:val="2D3748"/>
+          <w:sz w:val="21"/>
+        </w:rPr>
+        <w:t>Suba a planilha oficial de prêmios manuais (que é preenchida conforme as solicitações durante o mês), localizada na rede interna da empresa no caminho exato:</w:t>
+        <w:br/>
+        <w:t>F:\04 - Operacional\Operacional\SUPORTE OPERACIONAL\Prêmios\Controle_Premios V9.6 nova_x.xlsm</w:t>
+      </w:r>
+    </w:p>
+    <w:p>
+      <w:pPr>
+        <w:pStyle w:val="ListBullet"/>
+        <w:spacing w:before="20" w:after="40" w:line="276" w:lineRule="auto"/>
+      </w:pPr>
+      <w:r>
+        <w:rPr>
+          <w:rFonts w:ascii="Calibri" w:hAnsi="Calibri"/>
+          <w:b/>
+          <w:color w:val="2D3748"/>
+          <w:sz w:val="21"/>
+        </w:rPr>
+        <w:t xml:space="preserve">3. Como Importar: </w:t>
+      </w:r>
+      <w:r>
+        <w:rPr>
+          <w:rFonts w:ascii="Calibri" w:hAnsi="Calibri"/>
+          <w:color w:val="2D3748"/>
+          <w:sz w:val="21"/>
+        </w:rPr>
+        <w:t>No Sistema de Análises Operacionais, suba as duas bases juntas, selecionando o período de referência correspondente no modal de importação.</w:t>
+      </w:r>
+    </w:p>
+    <w:p>
+      <w:pPr>
+        <w:pStyle w:val="Heading3"/>
+        <w:keepNext/>
+        <w:spacing w:before="160" w:after="40"/>
+      </w:pPr>
+      <w:r>
+        <w:rPr>
+          <w:rFonts w:ascii="Calibri" w:hAnsi="Calibri"/>
+          <w:b/>
+          <w:color w:val="2D3748"/>
+          <w:sz w:val="23"/>
+        </w:rPr>
+        <w:t>D) Extração do Relatório de Marcas/Batidas (GeoVictoria):</w:t>
+      </w:r>
+    </w:p>
+    <w:p>
+      <w:pPr>
+        <w:spacing w:before="40" w:after="60" w:line="276" w:lineRule="auto"/>
+      </w:pPr>
+      <w:r>
+        <w:rPr>
+          <w:rFonts w:ascii="Arial" w:hAnsi="Arial"/>
+          <w:b/>
+          <w:color w:val="007A87"/>
+          <w:sz w:val="20"/>
+        </w:rPr>
+        <w:t xml:space="preserve">1. </w:t>
+      </w:r>
+      <w:r>
+        <w:rPr>
+          <w:rFonts w:ascii="Calibri" w:hAnsi="Calibri"/>
+          <w:b/>
+          <w:color w:val="2D3748"/>
+          <w:sz w:val="21"/>
+        </w:rPr>
+        <w:t xml:space="preserve">Acesso: </w:t>
+      </w:r>
+      <w:r>
+        <w:rPr>
+          <w:rFonts w:ascii="Calibri" w:hAnsi="Calibri"/>
+          <w:color w:val="2D3748"/>
+          <w:sz w:val="21"/>
+        </w:rPr>
+        <w:t>Faça login no portal da GeoVictoria.</w:t>
+      </w:r>
+    </w:p>
+    <w:p>
+      <w:pPr>
+        <w:spacing w:before="40" w:after="60" w:line="276" w:lineRule="auto"/>
+      </w:pPr>
+      <w:r>
+        <w:rPr>
+          <w:rFonts w:ascii="Arial" w:hAnsi="Arial"/>
+          <w:b/>
+          <w:color w:val="007A87"/>
+          <w:sz w:val="20"/>
+        </w:rPr>
+        <w:t xml:space="preserve">2. </w:t>
+      </w:r>
+      <w:r>
+        <w:rPr>
+          <w:rFonts w:ascii="Calibri" w:hAnsi="Calibri"/>
+          <w:b/>
+          <w:color w:val="2D3748"/>
+          <w:sz w:val="21"/>
+        </w:rPr>
+        <w:t xml:space="preserve">Navegação: </w:t>
+      </w:r>
+      <w:r>
+        <w:rPr>
+          <w:rFonts w:ascii="Calibri" w:hAnsi="Calibri"/>
+          <w:color w:val="2D3748"/>
+          <w:sz w:val="21"/>
+        </w:rPr>
+        <w:t>Na aba lateral esquerda, clique em: Relatórios &gt; Marca.</w:t>
+      </w:r>
+    </w:p>
+    <w:p>
+      <w:pPr>
+        <w:spacing w:before="40" w:after="60" w:line="276" w:lineRule="auto"/>
+      </w:pPr>
+      <w:r>
+        <w:rPr>
+          <w:rFonts w:ascii="Arial" w:hAnsi="Arial"/>
+          <w:b/>
+          <w:color w:val="007A87"/>
+          <w:sz w:val="20"/>
+        </w:rPr>
+        <w:t xml:space="preserve">3. </w:t>
+      </w:r>
+      <w:r>
+        <w:rPr>
+          <w:rFonts w:ascii="Calibri" w:hAnsi="Calibri"/>
+          <w:b/>
+          <w:color w:val="2D3748"/>
+          <w:sz w:val="21"/>
+        </w:rPr>
+        <w:t xml:space="preserve">Período: </w:t>
+      </w:r>
+      <w:r>
+        <w:rPr>
+          <w:rFonts w:ascii="Calibri" w:hAnsi="Calibri"/>
+          <w:color w:val="2D3748"/>
+          <w:sz w:val="21"/>
+        </w:rPr>
+        <w:t>Selecione o período de apuração no campo superior da página.</w:t>
+      </w:r>
+    </w:p>
+    <w:p>
+      <w:pPr>
+        <w:spacing w:before="40" w:after="60" w:line="276" w:lineRule="auto"/>
+      </w:pPr>
+      <w:r>
+        <w:rPr>
+          <w:rFonts w:ascii="Arial" w:hAnsi="Arial"/>
+          <w:b/>
+          <w:color w:val="007A87"/>
+          <w:sz w:val="20"/>
+        </w:rPr>
+        <w:t xml:space="preserve">4. </w:t>
+      </w:r>
+      <w:r>
+        <w:rPr>
+          <w:rFonts w:ascii="Calibri" w:hAnsi="Calibri"/>
+          <w:b/>
+          <w:color w:val="2D3748"/>
+          <w:sz w:val="21"/>
+        </w:rPr>
+        <w:t xml:space="preserve">Gerar: </w:t>
+      </w:r>
+      <w:r>
+        <w:rPr>
+          <w:rFonts w:ascii="Calibri" w:hAnsi="Calibri"/>
+          <w:color w:val="2D3748"/>
+          <w:sz w:val="21"/>
+        </w:rPr>
+        <w:t>Clique no botão 'Gerar o relatório' e selecione a opção de baixar como Excel.</w:t>
+      </w:r>
+    </w:p>
+    <w:p>
+      <w:pPr>
+        <w:spacing w:before="40" w:after="60" w:line="276" w:lineRule="auto"/>
+      </w:pPr>
+      <w:r>
+        <w:rPr>
+          <w:rFonts w:ascii="Arial" w:hAnsi="Arial"/>
+          <w:b/>
+          <w:color w:val="007A87"/>
+          <w:sz w:val="20"/>
+        </w:rPr>
+        <w:t xml:space="preserve">5. </w:t>
+      </w:r>
+      <w:r>
+        <w:rPr>
+          <w:rFonts w:ascii="Calibri" w:hAnsi="Calibri"/>
+          <w:b/>
+          <w:color w:val="2D3748"/>
+          <w:sz w:val="21"/>
+        </w:rPr>
+        <w:t xml:space="preserve">Aguardar Processamento: </w:t>
+      </w:r>
+      <w:r>
+        <w:rPr>
+          <w:rFonts w:ascii="Calibri" w:hAnsi="Calibri"/>
+          <w:color w:val="2D3748"/>
+          <w:sz w:val="21"/>
+        </w:rPr>
+        <w:t>IMPORTANTE: Como o relatório de marcas reúne milhares de batidas de todos os funcionários, ele é muito pesado e NÃO é baixado automaticamente na hora. Você deve aguardar alguns minutos e acompanhar na mesma página na seção 'Relatórios gerados'. Assim que o status mudar para concluído, faça o download.</w:t>
+      </w:r>
+    </w:p>
+    <w:p>
+      <w:pPr>
+        <w:spacing w:before="40" w:after="60" w:line="276" w:lineRule="auto"/>
+      </w:pPr>
+      <w:r>
+        <w:rPr>
+          <w:rFonts w:ascii="Arial" w:hAnsi="Arial"/>
+          <w:b/>
+          <w:color w:val="007A87"/>
+          <w:sz w:val="20"/>
+        </w:rPr>
+        <w:t xml:space="preserve">6. </w:t>
+      </w:r>
+      <w:r>
+        <w:rPr>
+          <w:rFonts w:ascii="Calibri" w:hAnsi="Calibri"/>
+          <w:b/>
+          <w:color w:val="2D3748"/>
+          <w:sz w:val="21"/>
+        </w:rPr>
+        <w:t xml:space="preserve">Importação: </w:t>
+      </w:r>
+      <w:r>
+        <w:rPr>
+          <w:rFonts w:ascii="Calibri" w:hAnsi="Calibri"/>
+          <w:color w:val="2D3748"/>
+          <w:sz w:val="21"/>
+        </w:rPr>
+        <w:t>Assim que baixar a planilha Excel, importe-a diretamente no sistema na opção 'Importar Relatório de Marcas'.</w:t>
+      </w:r>
+    </w:p>
+    <w:p>
+      <w:pPr>
         <w:pStyle w:val="Heading2"/>
         <w:keepNext/>
         <w:spacing w:before="240" w:after="80"/>
@@ -3877,7 +3844,7 @@
           <w:color w:val="007A87"/>
           <w:sz w:val="26"/>
         </w:rPr>
-        <w:t>2.4 Como Importar os Arquivos Dentro do Sistema</w:t>
+        <w:t>2.4 Telas de Carga no Sistema de Análises Operacionais</w:t>
       </w:r>
     </w:p>
     <w:p>
@@ -3892,37 +3859,22 @@
           <w:color w:val="2D3748"/>
           <w:sz w:val="21"/>
         </w:rPr>
-        <w:t>Com os arquivos extraídos do TOTVS e salvos em seu computador, siga os passos de carga nas telas do sistema:</w:t>
+        <w:t>Com os arquivos extraídos em mãos, siga os passos nas telas do sistema:</w:t>
       </w:r>
     </w:p>
     <w:p>
       <w:pPr>
-        <w:pStyle w:val="Heading3"/>
-        <w:keepNext/>
-        <w:spacing w:before="160" w:after="40"/>
+        <w:pStyle w:val="ListBullet"/>
+        <w:spacing w:before="20" w:after="40" w:line="276" w:lineRule="auto"/>
       </w:pPr>
       <w:r>
         <w:rPr>
           <w:rFonts w:ascii="Calibri" w:hAnsi="Calibri"/>
           <w:b/>
           <w:color w:val="2D3748"/>
-          <w:sz w:val="23"/>
+          <w:sz w:val="21"/>
         </w:rPr>
-        <w:t>1. Importação de Headcount e Colaboradores:</w:t>
-      </w:r>
-    </w:p>
-    <w:p>
-      <w:pPr>
-        <w:spacing w:before="40" w:after="60" w:line="276" w:lineRule="auto"/>
-      </w:pPr>
-      <w:r>
-        <w:rPr>
-          <w:rFonts w:ascii="Arial" w:hAnsi="Arial"/>
-          <w:b/>
-          <w:color w:val="007A87"/>
-          <w:sz w:val="20"/>
-        </w:rPr>
-        <w:t xml:space="preserve">• </w:t>
+        <w:t xml:space="preserve">Headcount / Colaboradores: </w:t>
       </w:r>
       <w:r>
         <w:rPr>
@@ -3930,37 +3882,22 @@
           <w:color w:val="2D3748"/>
           <w:sz w:val="21"/>
         </w:rPr>
-        <w:t>Acesse Menu &gt; Configurações ou Colaboradores &gt; Importar Colaboradores. Selecione o arquivo SRA (salvo como CSV UTF-8) e clique em Enviar. Uma barra de progresso em tempo real mostrará os registros inseridos e atualizados.</w:t>
+        <w:t>Menu &gt; Configurações &gt; Importar Colaboradores. Envie o SRA salvo como CSV UTF-8.</w:t>
       </w:r>
     </w:p>
     <w:p>
       <w:pPr>
-        <w:pStyle w:val="Heading3"/>
-        <w:keepNext/>
-        <w:spacing w:before="160" w:after="40"/>
+        <w:pStyle w:val="ListBullet"/>
+        <w:spacing w:before="20" w:after="40" w:line="276" w:lineRule="auto"/>
       </w:pPr>
       <w:r>
         <w:rPr>
           <w:rFonts w:ascii="Calibri" w:hAnsi="Calibri"/>
           <w:b/>
           <w:color w:val="2D3748"/>
-          <w:sz w:val="23"/>
+          <w:sz w:val="21"/>
         </w:rPr>
-        <w:t>2. Ponto Eletrônico e Ausências (GeoVictoria):</w:t>
-      </w:r>
-    </w:p>
-    <w:p>
-      <w:pPr>
-        <w:spacing w:before="40" w:after="60" w:line="276" w:lineRule="auto"/>
-      </w:pPr>
-      <w:r>
-        <w:rPr>
-          <w:rFonts w:ascii="Arial" w:hAnsi="Arial"/>
-          <w:b/>
-          <w:color w:val="007A87"/>
-          <w:sz w:val="20"/>
-        </w:rPr>
-        <w:t xml:space="preserve">• </w:t>
+        <w:t xml:space="preserve">Ponto e Ausências: </w:t>
       </w:r>
       <w:r>
         <w:rPr>
@@ -3968,21 +3905,22 @@
           <w:color w:val="2D3748"/>
           <w:sz w:val="21"/>
         </w:rPr>
-        <w:t>Opção A (Recomendada): Na tela de Ausências, clique em 'Sincronizar GeoVictoria'. O sistema baixa faltas e atestados dos últimos 30 dias diretamente via API.</w:t>
+        <w:t>Opção A: Botão 'Sincronizar GeoVictoria' (automático via API). Opção B: Envie a planilha de marcas baixada do portal GeoVictoria.</w:t>
       </w:r>
     </w:p>
     <w:p>
       <w:pPr>
-        <w:spacing w:before="40" w:after="60" w:line="276" w:lineRule="auto"/>
+        <w:pStyle w:val="ListBullet"/>
+        <w:spacing w:before="20" w:after="40" w:line="276" w:lineRule="auto"/>
       </w:pPr>
       <w:r>
         <w:rPr>
-          <w:rFonts w:ascii="Arial" w:hAnsi="Arial"/>
+          <w:rFonts w:ascii="Calibri" w:hAnsi="Calibri"/>
           <w:b/>
-          <w:color w:val="007A87"/>
-          <w:sz w:val="20"/>
+          <w:color w:val="2D3748"/>
+          <w:sz w:val="21"/>
         </w:rPr>
-        <w:t xml:space="preserve">• </w:t>
+        <w:t xml:space="preserve">Turnover e Rescisões: </w:t>
       </w:r>
       <w:r>
         <w:rPr>
@@ -3990,37 +3928,22 @@
           <w:color w:val="2D3748"/>
           <w:sz w:val="21"/>
         </w:rPr>
-        <w:t>Opção B (Manual): Se a API estiver fora, exporte a planilha de batidas da GeoVictoria (.xlsx) e faça o upload na opção 'Importar Relatório de Marcas'.</w:t>
+        <w:t>Passo 1: Suba o CSV do SRG para motivos de demissão. Passo 2: Suba o XML/Excel do GPER020 Líquidos para os custos.</w:t>
       </w:r>
     </w:p>
     <w:p>
       <w:pPr>
-        <w:pStyle w:val="Heading3"/>
-        <w:keepNext/>
-        <w:spacing w:before="160" w:after="40"/>
+        <w:pStyle w:val="ListBullet"/>
+        <w:spacing w:before="20" w:after="40" w:line="276" w:lineRule="auto"/>
       </w:pPr>
       <w:r>
         <w:rPr>
           <w:rFonts w:ascii="Calibri" w:hAnsi="Calibri"/>
           <w:b/>
           <w:color w:val="2D3748"/>
-          <w:sz w:val="23"/>
+          <w:sz w:val="21"/>
         </w:rPr>
-        <w:t>3. Turnover e Rescisões:</w:t>
-      </w:r>
-    </w:p>
-    <w:p>
-      <w:pPr>
-        <w:spacing w:before="40" w:after="60" w:line="276" w:lineRule="auto"/>
-      </w:pPr>
-      <w:r>
-        <w:rPr>
-          <w:rFonts w:ascii="Arial" w:hAnsi="Arial"/>
-          <w:b/>
-          <w:color w:val="007A87"/>
-          <w:sz w:val="20"/>
-        </w:rPr>
-        <w:t xml:space="preserve">• </w:t>
+        <w:t xml:space="preserve">Folha de Pagamento (SRD): </w:t>
       </w:r>
       <w:r>
         <w:rPr>
@@ -4028,21 +3951,22 @@
           <w:color w:val="2D3748"/>
           <w:sz w:val="21"/>
         </w:rPr>
-        <w:t>Passo 1: Acesse Menu &gt; Turnover &gt; Importar Rescisões. Faça o upload do arquivo SRG (CSV). O sistema mapeará os motivos de desligamento.</w:t>
+        <w:t>Menu &gt; Importações &gt; Folha de Pagamento. Selecione o mês correto e envie o CSV do SRD.</w:t>
       </w:r>
     </w:p>
     <w:p>
       <w:pPr>
-        <w:spacing w:before="40" w:after="60" w:line="276" w:lineRule="auto"/>
+        <w:pStyle w:val="ListBullet"/>
+        <w:spacing w:before="20" w:after="40" w:line="276" w:lineRule="auto"/>
       </w:pPr>
       <w:r>
         <w:rPr>
-          <w:rFonts w:ascii="Arial" w:hAnsi="Arial"/>
+          <w:rFonts w:ascii="Calibri" w:hAnsi="Calibri"/>
           <w:b/>
-          <w:color w:val="007A87"/>
-          <w:sz w:val="20"/>
+          <w:color w:val="2D3748"/>
+          <w:sz w:val="21"/>
         </w:rPr>
-        <w:t xml:space="preserve">• </w:t>
+        <w:t xml:space="preserve">Diárias: </w:t>
       </w:r>
       <w:r>
         <w:rPr>
@@ -4050,37 +3974,22 @@
           <w:color w:val="2D3748"/>
           <w:sz w:val="21"/>
         </w:rPr>
-        <w:t>Passo 2: Faça o upload do relatório de Líquidos (GPER020). O sistema extrairá os valores da Página 2 para calcular o custo rescisório.</w:t>
+        <w:t>Envie o CSV da Central do Colaborador (desde 01/04/2026 até hoje) + a Base Manual enviada pelo Tom.</w:t>
       </w:r>
     </w:p>
     <w:p>
       <w:pPr>
-        <w:pStyle w:val="Heading3"/>
-        <w:keepNext/>
-        <w:spacing w:before="160" w:after="40"/>
+        <w:pStyle w:val="ListBullet"/>
+        <w:spacing w:before="20" w:after="40" w:line="276" w:lineRule="auto"/>
       </w:pPr>
       <w:r>
         <w:rPr>
           <w:rFonts w:ascii="Calibri" w:hAnsi="Calibri"/>
           <w:b/>
           <w:color w:val="2D3748"/>
-          <w:sz w:val="23"/>
+          <w:sz w:val="21"/>
         </w:rPr>
-        <w:t>4. Folha de Pagamento e Raio-X de Verbas:</w:t>
-      </w:r>
-    </w:p>
-    <w:p>
-      <w:pPr>
-        <w:spacing w:before="40" w:after="60" w:line="276" w:lineRule="auto"/>
-      </w:pPr>
-      <w:r>
-        <w:rPr>
-          <w:rFonts w:ascii="Arial" w:hAnsi="Arial"/>
-          <w:b/>
-          <w:color w:val="007A87"/>
-          <w:sz w:val="20"/>
-        </w:rPr>
-        <w:t xml:space="preserve">• </w:t>
+        <w:t xml:space="preserve">Prêmios: </w:t>
       </w:r>
       <w:r>
         <w:rPr>
@@ -4088,37 +3997,22 @@
           <w:color w:val="2D3748"/>
           <w:sz w:val="21"/>
         </w:rPr>
-        <w:t>Acesse Menu &gt; Importações &gt; Folha de Pagamento (SRD). Selecione o mês de referência contábil, envie o arquivo SRD e clique em Processar. O sistema cruzará os códigos com a planilha DE_PARA_DE_VERBAS_2.xlsx e consolidará os custos por filial.</w:t>
+        <w:t>Envie o CSV da Central do Colaborador + a planilha Controle_Premios V9.6 da rede F:\.</w:t>
       </w:r>
     </w:p>
     <w:p>
       <w:pPr>
-        <w:pStyle w:val="Heading3"/>
-        <w:keepNext/>
-        <w:spacing w:before="160" w:after="40"/>
+        <w:pStyle w:val="ListBullet"/>
+        <w:spacing w:before="20" w:after="40" w:line="276" w:lineRule="auto"/>
       </w:pPr>
       <w:r>
         <w:rPr>
           <w:rFonts w:ascii="Calibri" w:hAnsi="Calibri"/>
           <w:b/>
           <w:color w:val="2D3748"/>
-          <w:sz w:val="23"/>
+          <w:sz w:val="21"/>
         </w:rPr>
-        <w:t>5. Diárias e Prêmios Operacionais:</w:t>
-      </w:r>
-    </w:p>
-    <w:p>
-      <w:pPr>
-        <w:spacing w:before="40" w:after="60" w:line="276" w:lineRule="auto"/>
-      </w:pPr>
-      <w:r>
-        <w:rPr>
-          <w:rFonts w:ascii="Arial" w:hAnsi="Arial"/>
-          <w:b/>
-          <w:color w:val="007A87"/>
-          <w:sz w:val="20"/>
-        </w:rPr>
-        <w:t xml:space="preserve">• </w:t>
+        <w:t xml:space="preserve">Escopos Mensais de Loja: </w:t>
       </w:r>
       <w:r>
         <w:rPr>
@@ -4126,37 +4020,22 @@
           <w:color w:val="2D3748"/>
           <w:sz w:val="21"/>
         </w:rPr>
-        <w:t>Em Diárias e Prêmios, envie simultaneamente os dois arquivos: a Base do Sistema (CSV) e a Base Manual (Excel). O sistema unifica os lançamentos e abate dos orçamentos.</w:t>
+        <w:t>Menu &gt; Escopos &gt; Botão 'Duplicar para o Próximo Mês' na virada de competência.</w:t>
       </w:r>
     </w:p>
     <w:p>
       <w:pPr>
-        <w:pStyle w:val="Heading3"/>
-        <w:keepNext/>
-        <w:spacing w:before="160" w:after="40"/>
+        <w:pStyle w:val="ListBullet"/>
+        <w:spacing w:before="20" w:after="40" w:line="276" w:lineRule="auto"/>
       </w:pPr>
       <w:r>
         <w:rPr>
           <w:rFonts w:ascii="Calibri" w:hAnsi="Calibri"/>
           <w:b/>
           <w:color w:val="2D3748"/>
-          <w:sz w:val="23"/>
+          <w:sz w:val="21"/>
         </w:rPr>
-        <w:t>6. Escopos Mensais de Loja e DSR:</w:t>
-      </w:r>
-    </w:p>
-    <w:p>
-      <w:pPr>
-        <w:spacing w:before="40" w:after="60" w:line="276" w:lineRule="auto"/>
-      </w:pPr>
-      <w:r>
-        <w:rPr>
-          <w:rFonts w:ascii="Arial" w:hAnsi="Arial"/>
-          <w:b/>
-          <w:color w:val="007A87"/>
-          <w:sz w:val="20"/>
-        </w:rPr>
-        <w:t xml:space="preserve">• </w:t>
+        <w:t xml:space="preserve">Testes de Promoção: </w:t>
       </w:r>
       <w:r>
         <w:rPr>
@@ -4164,45 +4043,7 @@
           <w:color w:val="2D3748"/>
           <w:sz w:val="21"/>
         </w:rPr>
-        <w:t>Acesse Menu &gt; Escopos. Na virada de mês, use o botão 'Duplicar para o Próximo Mês' para clonar o quadro autorizado da equipe e ajuste os valores de DSR e insalubridade onde houver alteração.</w:t>
-      </w:r>
-    </w:p>
-    <w:p>
-      <w:pPr>
-        <w:pStyle w:val="Heading3"/>
-        <w:keepNext/>
-        <w:spacing w:before="160" w:after="40"/>
-      </w:pPr>
-      <w:r>
-        <w:rPr>
-          <w:rFonts w:ascii="Calibri" w:hAnsi="Calibri"/>
-          <w:b/>
-          <w:color w:val="2D3748"/>
-          <w:sz w:val="23"/>
-        </w:rPr>
-        <w:t>7. Testes de Promoção:</w:t>
-      </w:r>
-    </w:p>
-    <w:p>
-      <w:pPr>
-        <w:spacing w:before="40" w:after="60" w:line="276" w:lineRule="auto"/>
-      </w:pPr>
-      <w:r>
-        <w:rPr>
-          <w:rFonts w:ascii="Arial" w:hAnsi="Arial"/>
-          <w:b/>
-          <w:color w:val="007A87"/>
-          <w:sz w:val="20"/>
-        </w:rPr>
-        <w:t xml:space="preserve">• </w:t>
-      </w:r>
-      <w:r>
-        <w:rPr>
-          <w:rFonts w:ascii="Calibri" w:hAnsi="Calibri"/>
-          <w:color w:val="2D3748"/>
-          <w:sz w:val="21"/>
-        </w:rPr>
-        <w:t>Acesse Menu &gt; Testes de Promoção. Cadastre o colaborador em experiência e faça o upload do formulário assinado (PDF ou imagem) para comprovação.</w:t>
+        <w:t>Menu &gt; Testes de Promoção &gt; Cadastrar colaborador em experiência e anexar folha assinada.</w:t>
       </w:r>
     </w:p>
     <w:p>
@@ -5132,7 +4973,7 @@
                 <w:color w:val="FFFFFF"/>
                 <w:sz w:val="19"/>
               </w:rPr>
-              <w:t>Serviço / Fornecedor</w:t>
+              <w:t>Serviço / Pessoa / Fornecedor</w:t>
             </w:r>
           </w:p>
         </w:tc>
@@ -5152,7 +4993,7 @@
                 <w:color w:val="FFFFFF"/>
                 <w:sz w:val="19"/>
               </w:rPr>
-              <w:t>Contato / Canal</w:t>
+              <w:t>Contato / Localização</w:t>
             </w:r>
           </w:p>
         </w:tc>
@@ -5172,7 +5013,7 @@
                 <w:color w:val="FFFFFF"/>
                 <w:sz w:val="19"/>
               </w:rPr>
-              <w:t>Finalidade</w:t>
+              <w:t>Finalidade Operacional</w:t>
             </w:r>
           </w:p>
         </w:tc>
@@ -5192,6 +5033,178 @@
                 <w:color w:val="2D3748"/>
                 <w:sz w:val="19"/>
               </w:rPr>
+              <w:t>Tom (Equipe Operacional)</w:t>
+            </w:r>
+          </w:p>
+        </w:tc>
+        <w:tc>
+          <w:tcPr>
+            <w:tcW w:type="dxa" w:w="3312"/>
+          </w:tcPr>
+          <w:p>
+            <w:pPr>
+              <w:spacing w:before="60" w:after="60" w:line="264" w:lineRule="auto"/>
+            </w:pPr>
+            <w:r>
+              <w:rPr>
+                <w:rFonts w:ascii="Calibri" w:hAnsi="Calibri"/>
+                <w:color w:val="2D3748"/>
+                <w:sz w:val="19"/>
+              </w:rPr>
+              <w:t>Contato Interno</w:t>
+            </w:r>
+          </w:p>
+        </w:tc>
+        <w:tc>
+          <w:tcPr>
+            <w:tcW w:type="dxa" w:w="3312"/>
+          </w:tcPr>
+          <w:p>
+            <w:pPr>
+              <w:spacing w:before="60" w:after="60" w:line="264" w:lineRule="auto"/>
+            </w:pPr>
+            <w:r>
+              <w:rPr>
+                <w:rFonts w:ascii="Calibri" w:hAnsi="Calibri"/>
+                <w:color w:val="2D3748"/>
+                <w:sz w:val="19"/>
+              </w:rPr>
+              <w:t>Envio da Base Manual de Diárias Operacionais.</w:t>
+            </w:r>
+          </w:p>
+        </w:tc>
+      </w:tr>
+      <w:tr>
+        <w:tc>
+          <w:tcPr>
+            <w:tcW w:type="dxa" w:w="3312"/>
+            <w:shd w:fill="F7FAFC"/>
+          </w:tcPr>
+          <w:p>
+            <w:pPr>
+              <w:spacing w:before="60" w:after="60" w:line="264" w:lineRule="auto"/>
+            </w:pPr>
+            <w:r>
+              <w:rPr>
+                <w:rFonts w:ascii="Calibri" w:hAnsi="Calibri"/>
+                <w:color w:val="2D3748"/>
+                <w:sz w:val="19"/>
+              </w:rPr>
+              <w:t>Rede Interna F:\ (Prêmios Manuais)</w:t>
+            </w:r>
+          </w:p>
+        </w:tc>
+        <w:tc>
+          <w:tcPr>
+            <w:tcW w:type="dxa" w:w="3312"/>
+            <w:shd w:fill="F7FAFC"/>
+          </w:tcPr>
+          <w:p>
+            <w:pPr>
+              <w:spacing w:before="60" w:after="60" w:line="264" w:lineRule="auto"/>
+            </w:pPr>
+            <w:r>
+              <w:rPr>
+                <w:rFonts w:ascii="Calibri" w:hAnsi="Calibri"/>
+                <w:color w:val="2D3748"/>
+                <w:sz w:val="19"/>
+              </w:rPr>
+              <w:t>F:\04 - Operacional\...\Controle_Premios V9.6 nova_x.xlsm</w:t>
+            </w:r>
+          </w:p>
+        </w:tc>
+        <w:tc>
+          <w:tcPr>
+            <w:tcW w:type="dxa" w:w="3312"/>
+            <w:shd w:fill="F7FAFC"/>
+          </w:tcPr>
+          <w:p>
+            <w:pPr>
+              <w:spacing w:before="60" w:after="60" w:line="264" w:lineRule="auto"/>
+            </w:pPr>
+            <w:r>
+              <w:rPr>
+                <w:rFonts w:ascii="Calibri" w:hAnsi="Calibri"/>
+                <w:color w:val="2D3748"/>
+                <w:sz w:val="19"/>
+              </w:rPr>
+              <w:t>Planilha de controle de prêmios manuais para upload.</w:t>
+            </w:r>
+          </w:p>
+        </w:tc>
+      </w:tr>
+      <w:tr>
+        <w:tc>
+          <w:tcPr>
+            <w:tcW w:type="dxa" w:w="3312"/>
+          </w:tcPr>
+          <w:p>
+            <w:pPr>
+              <w:spacing w:before="60" w:after="60" w:line="264" w:lineRule="auto"/>
+            </w:pPr>
+            <w:r>
+              <w:rPr>
+                <w:rFonts w:ascii="Calibri" w:hAnsi="Calibri"/>
+                <w:color w:val="2D3748"/>
+                <w:sz w:val="19"/>
+              </w:rPr>
+              <w:t>Central do Colaborador</w:t>
+            </w:r>
+          </w:p>
+        </w:tc>
+        <w:tc>
+          <w:tcPr>
+            <w:tcW w:type="dxa" w:w="3312"/>
+          </w:tcPr>
+          <w:p>
+            <w:pPr>
+              <w:spacing w:before="60" w:after="60" w:line="264" w:lineRule="auto"/>
+            </w:pPr>
+            <w:r>
+              <w:rPr>
+                <w:rFonts w:ascii="Calibri" w:hAnsi="Calibri"/>
+                <w:color w:val="2D3748"/>
+                <w:sz w:val="19"/>
+              </w:rPr>
+              <w:t>Sistema Interno Web</w:t>
+            </w:r>
+          </w:p>
+        </w:tc>
+        <w:tc>
+          <w:tcPr>
+            <w:tcW w:type="dxa" w:w="3312"/>
+          </w:tcPr>
+          <w:p>
+            <w:pPr>
+              <w:spacing w:before="60" w:after="60" w:line="264" w:lineRule="auto"/>
+            </w:pPr>
+            <w:r>
+              <w:rPr>
+                <w:rFonts w:ascii="Calibri" w:hAnsi="Calibri"/>
+                <w:color w:val="2D3748"/>
+                <w:sz w:val="19"/>
+              </w:rPr>
+              <w:t>Exportação do histórico de Diárias (desde 01/04/2026) e Prêmios.</w:t>
+            </w:r>
+          </w:p>
+        </w:tc>
+      </w:tr>
+      <w:tr>
+        <w:tc>
+          <w:tcPr>
+            <w:tcW w:type="dxa" w:w="3312"/>
+            <w:shd w:fill="F7FAFC"/>
+          </w:tcPr>
+          <w:p>
+            <w:pPr>
+              <w:spacing w:before="60" w:after="60" w:line="264" w:lineRule="auto"/>
+            </w:pPr>
+            <w:r>
+              <w:rPr>
+                <w:rFonts w:ascii="Calibri" w:hAnsi="Calibri"/>
+                <w:color w:val="2D3748"/>
+                <w:sz w:val="19"/>
+              </w:rPr>
               <w:t>TI Corporativo / Infraestrutura</w:t>
             </w:r>
           </w:p>
@@ -5199,6 +5212,7 @@
         <w:tc>
           <w:tcPr>
             <w:tcW w:type="dxa" w:w="3312"/>
+            <w:shd w:fill="F7FAFC"/>
           </w:tcPr>
           <w:p>
             <w:pPr>
@@ -5217,6 +5231,7 @@
         <w:tc>
           <w:tcPr>
             <w:tcW w:type="dxa" w:w="3312"/>
+            <w:shd w:fill="F7FAFC"/>
           </w:tcPr>
           <w:p>
             <w:pPr>
@@ -5237,7 +5252,6 @@
         <w:tc>
           <w:tcPr>
             <w:tcW w:type="dxa" w:w="3312"/>
-            <w:shd w:fill="F7FAFC"/>
           </w:tcPr>
           <w:p>
             <w:pPr>
@@ -5256,7 +5270,6 @@
         <w:tc>
           <w:tcPr>
             <w:tcW w:type="dxa" w:w="3312"/>
-            <w:shd w:fill="F7FAFC"/>
           </w:tcPr>
           <w:p>
             <w:pPr>
@@ -5275,7 +5288,6 @@
         <w:tc>
           <w:tcPr>
             <w:tcW w:type="dxa" w:w="3312"/>
-            <w:shd w:fill="F7FAFC"/>
           </w:tcPr>
           <w:p>
             <w:pPr>
@@ -5287,63 +5299,7 @@
                 <w:color w:val="2D3748"/>
                 <w:sz w:val="19"/>
               </w:rPr>
-              <w:t>API de Ponto Eletrônico, suporte de credenciais e tokens.</w:t>
-            </w:r>
-          </w:p>
-        </w:tc>
-      </w:tr>
-      <w:tr>
-        <w:tc>
-          <w:tcPr>
-            <w:tcW w:type="dxa" w:w="3312"/>
-          </w:tcPr>
-          <w:p>
-            <w:pPr>
-              <w:spacing w:before="60" w:after="60" w:line="264" w:lineRule="auto"/>
-            </w:pPr>
-            <w:r>
-              <w:rPr>
-                <w:rFonts w:ascii="Calibri" w:hAnsi="Calibri"/>
-                <w:color w:val="2D3748"/>
-                <w:sz w:val="19"/>
-              </w:rPr>
-              <w:t>TOTVS Protheus</w:t>
-            </w:r>
-          </w:p>
-        </w:tc>
-        <w:tc>
-          <w:tcPr>
-            <w:tcW w:type="dxa" w:w="3312"/>
-          </w:tcPr>
-          <w:p>
-            <w:pPr>
-              <w:spacing w:before="60" w:after="60" w:line="264" w:lineRule="auto"/>
-            </w:pPr>
-            <w:r>
-              <w:rPr>
-                <w:rFonts w:ascii="Calibri" w:hAnsi="Calibri"/>
-                <w:color w:val="2D3748"/>
-                <w:sz w:val="19"/>
-              </w:rPr>
-              <w:t>Equipe Interna Protheus / RH</w:t>
-            </w:r>
-          </w:p>
-        </w:tc>
-        <w:tc>
-          <w:tcPr>
-            <w:tcW w:type="dxa" w:w="3312"/>
-          </w:tcPr>
-          <w:p>
-            <w:pPr>
-              <w:spacing w:before="60" w:after="60" w:line="264" w:lineRule="auto"/>
-            </w:pPr>
-            <w:r>
-              <w:rPr>
-                <w:rFonts w:ascii="Calibri" w:hAnsi="Calibri"/>
-                <w:color w:val="2D3748"/>
-                <w:sz w:val="19"/>
-              </w:rPr>
-              <w:t>Geração de relatórios SRA010, SRD de folha e GPER020.</w:t>
+              <w:t>Portal de batidas (Relatório de Marca) e API de ponto.</w:t>
             </w:r>
           </w:p>
         </w:tc>
@@ -5364,7 +5320,7 @@
                 <w:color w:val="2D3748"/>
                 <w:sz w:val="19"/>
               </w:rPr>
-              <w:t>Repositório de Código</w:t>
+              <w:t>TOTVS Protheus</w:t>
             </w:r>
           </w:p>
         </w:tc>
@@ -5383,6 +5339,63 @@
                 <w:color w:val="2D3748"/>
                 <w:sz w:val="19"/>
               </w:rPr>
+              <w:t>Equipe Interna Protheus / RH</w:t>
+            </w:r>
+          </w:p>
+        </w:tc>
+        <w:tc>
+          <w:tcPr>
+            <w:tcW w:type="dxa" w:w="3312"/>
+            <w:shd w:fill="F7FAFC"/>
+          </w:tcPr>
+          <w:p>
+            <w:pPr>
+              <w:spacing w:before="60" w:after="60" w:line="264" w:lineRule="auto"/>
+            </w:pPr>
+            <w:r>
+              <w:rPr>
+                <w:rFonts w:ascii="Calibri" w:hAnsi="Calibri"/>
+                <w:color w:val="2D3748"/>
+                <w:sz w:val="19"/>
+              </w:rPr>
+              <w:t>Consultas Genéricas SRA, SRG, SRD e Líquidos de Rescisão.</w:t>
+            </w:r>
+          </w:p>
+        </w:tc>
+      </w:tr>
+      <w:tr>
+        <w:tc>
+          <w:tcPr>
+            <w:tcW w:type="dxa" w:w="3312"/>
+          </w:tcPr>
+          <w:p>
+            <w:pPr>
+              <w:spacing w:before="60" w:after="60" w:line="264" w:lineRule="auto"/>
+            </w:pPr>
+            <w:r>
+              <w:rPr>
+                <w:rFonts w:ascii="Calibri" w:hAnsi="Calibri"/>
+                <w:color w:val="2D3748"/>
+                <w:sz w:val="19"/>
+              </w:rPr>
+              <w:t>Repositório de Código</w:t>
+            </w:r>
+          </w:p>
+        </w:tc>
+        <w:tc>
+          <w:tcPr>
+            <w:tcW w:type="dxa" w:w="3312"/>
+          </w:tcPr>
+          <w:p>
+            <w:pPr>
+              <w:spacing w:before="60" w:after="60" w:line="264" w:lineRule="auto"/>
+            </w:pPr>
+            <w:r>
+              <w:rPr>
+                <w:rFonts w:ascii="Calibri" w:hAnsi="Calibri"/>
+                <w:color w:val="2D3748"/>
+                <w:sz w:val="19"/>
+              </w:rPr>
               <w:t>github.com/RyMont/analises-operacionais</w:t>
             </w:r>
           </w:p>
@@ -5390,7 +5403,6 @@
         <w:tc>
           <w:tcPr>
             <w:tcW w:type="dxa" w:w="3312"/>
-            <w:shd w:fill="F7FAFC"/>
           </w:tcPr>
           <w:p>
             <w:pPr>

</xml_diff>

<commit_message>
docs: adiciona instrucoes de como obter o link de acesso ao sistema
</commit_message>
<xml_diff>
--- a/DOCUMENTACAO_DO_SISTEMA.docx
+++ b/DOCUMENTACAO_DO_SISTEMA.docx
@@ -31,7 +31,7 @@
           <w:color w:val="007A87"/>
           <w:sz w:val="26"/>
         </w:rPr>
-        <w:t>Manual Técnico Completo, Guia de Extração no TOTVS, Central do Colaborador, GeoVictoria e Manutenção</w:t>
+        <w:t>Manual Técnico Completo, Como Obter o Link de Acesso, Guia de Extração no TOTVS, Central do Colaborador, GeoVictoria e Manutenção</w:t>
       </w:r>
     </w:p>
     <w:tbl>
@@ -237,7 +237,7 @@
                 <w:color w:val="2D3748"/>
                 <w:sz w:val="19"/>
               </w:rPr>
-              <w:t>Versão 2.2 - Edição com Roteiro Completo de Extrações e Contatos</w:t>
+              <w:t>Versão 2.3 - Edição com Instruções de Acesso, Roteiro Completo de Extrações e Contatos</w:t>
             </w:r>
           </w:p>
         </w:tc>
@@ -397,7 +397,7 @@
           <w:color w:val="2D3748"/>
           <w:sz w:val="21"/>
         </w:rPr>
-        <w:t xml:space="preserve">PARTE 2: GUIA PRÁTICO DE ATUALIZAÇÃO DE DADOS — </w:t>
+        <w:t xml:space="preserve">PARTE 2: GUIA PRÁTICO DE ACESSO E ATUALIZAÇÃO DE DADOS — </w:t>
       </w:r>
       <w:r>
         <w:rPr>
@@ -405,7 +405,7 @@
           <w:color w:val="2D3748"/>
           <w:sz w:val="21"/>
         </w:rPr>
-        <w:t>Criação de usuários, alteração de senhas, tabela salarial, cadastro de cargos, roteiro de extração de relatórios (TOTVS Protheus, Central do Colaborador, GeoVictoria e Tom) e procedimentos de importação.</w:t>
+        <w:t>Onde e como obter o link de acesso ao sistema (IP e Hostname), criação de usuários, alteração de senhas, tabela salarial, cadastro de cargos, roteiro de extração de relatórios (TOTVS Protheus, Central do Colaborador, GeoVictoria e Tom) e procedimentos de importação.</w:t>
       </w:r>
     </w:p>
     <w:p>
@@ -1125,7 +1125,7 @@
           <w:color w:val="2D3748"/>
           <w:sz w:val="21"/>
         </w:rPr>
-        <w:t>Porta 8000 (Backend Waitress) e Porta 5173 (Frontend React). O acesso pelos usuários da rede ocorre em: http://[IP_DO_SERVIDOR]:5173 ou http://[IP_DO_SERVIDOR]:8000.</w:t>
+        <w:t>Porta 8000 (Backend Waitress) e Porta 5173 (Frontend React). O acesso pelos usuários da rede ocorre principalmente em: http://[IP_DO_SERVIDOR]:5173 ou http://[NOME_DO_COMPUTADOR]:5173 (consulte a Seção 2.1 para o passo a passo detalhado de obtenção do link).</w:t>
       </w:r>
     </w:p>
     <w:p>
@@ -1717,7 +1717,7 @@
           <w:color w:val="1B365D"/>
           <w:sz w:val="32"/>
         </w:rPr>
-        <w:t>PARTE 2: Guia Prático de Atualização de Dados e Importações</w:t>
+        <w:t>PARTE 2: Guia Prático de Acesso e Atualização de Dados</w:t>
       </w:r>
     </w:p>
     <w:p>
@@ -1732,7 +1732,7 @@
           <w:color w:val="2D3748"/>
           <w:sz w:val="21"/>
         </w:rPr>
-        <w:t>Esta seção é a referência prática diária da equipe. Apresentamos a gestão de usuários e salários logo no início, seguida do passo a passo completo de como obter cada um dos arquivos nas fontes oficiais.</w:t>
+        <w:t>Esta seção é a referência prática diária da equipe. Apresentamos inicialmente onde e como obter o link de acesso ao sistema para compartilhar com os colaboradores, seguido da gestão de usuários, senhas e salários, finalizando com o passo a passo completo de como obter cada um dos arquivos nas fontes oficiais.</w:t>
       </w:r>
     </w:p>
     <w:p>
@@ -1748,7 +1748,7 @@
           <w:color w:val="007A87"/>
           <w:sz w:val="26"/>
         </w:rPr>
-        <w:t>2.1 Gestão de Usuários, Senhas e Permissões</w:t>
+        <w:t>2.1 Como Obter o Link de Acesso ao Sistema e Compartilhar com a Equipe</w:t>
       </w:r>
     </w:p>
     <w:p>
@@ -1763,7 +1763,7 @@
           <w:color w:val="2D3748"/>
           <w:sz w:val="21"/>
         </w:rPr>
-        <w:t>O controle de quem acessa o sistema e o nível de permissão é realizado no Menu Lateral &gt; Usuários:</w:t>
+        <w:t>Para que os colaboradores, gestores e analistas consigam utilizar o sistema nos seus próprios computadores, é necessário fornecer a eles o link (endereço web) correto de acesso na rede local da empresa. Abaixo estão detalhados os links disponíveis e os métodos mais simples para descobrir o link exato a qualquer momento:</w:t>
       </w:r>
     </w:p>
     <w:p>
@@ -1779,7 +1779,516 @@
           <w:color w:val="2D3748"/>
           <w:sz w:val="23"/>
         </w:rPr>
-        <w:t>A) Como Criar um Novo Usuário:</w:t>
+        <w:t>A) Endereços de Acesso Disponíveis:</w:t>
+      </w:r>
+    </w:p>
+    <w:tbl>
+      <w:tblPr>
+        <w:tblW w:type="auto" w:w="0"/>
+        <w:jc w:val="center"/>
+        <w:tblLook w:firstColumn="1" w:firstRow="1" w:lastColumn="0" w:lastRow="0" w:noHBand="0" w:noVBand="1" w:val="04A0"/>
+      </w:tblPr>
+      <w:tblGrid>
+        <w:gridCol w:w="2484"/>
+        <w:gridCol w:w="2484"/>
+        <w:gridCol w:w="2484"/>
+        <w:gridCol w:w="2484"/>
+      </w:tblGrid>
+      <w:tr>
+        <w:tc>
+          <w:tcPr>
+            <w:tcW w:type="dxa" w:w="2484"/>
+            <w:shd w:fill="1B365D"/>
+          </w:tcPr>
+          <w:p>
+            <w:pPr>
+              <w:spacing w:before="80" w:after="80"/>
+            </w:pPr>
+            <w:r>
+              <w:rPr>
+                <w:rFonts w:ascii="Arial" w:hAnsi="Arial"/>
+                <w:b/>
+                <w:color w:val="FFFFFF"/>
+                <w:sz w:val="19"/>
+              </w:rPr>
+              <w:t>Tipo de Acesso</w:t>
+            </w:r>
+          </w:p>
+        </w:tc>
+        <w:tc>
+          <w:tcPr>
+            <w:tcW w:type="dxa" w:w="2484"/>
+            <w:shd w:fill="1B365D"/>
+          </w:tcPr>
+          <w:p>
+            <w:pPr>
+              <w:spacing w:before="80" w:after="80"/>
+            </w:pPr>
+            <w:r>
+              <w:rPr>
+                <w:rFonts w:ascii="Arial" w:hAnsi="Arial"/>
+                <w:b/>
+                <w:color w:val="FFFFFF"/>
+                <w:sz w:val="19"/>
+              </w:rPr>
+              <w:t>Onde Utilizar</w:t>
+            </w:r>
+          </w:p>
+        </w:tc>
+        <w:tc>
+          <w:tcPr>
+            <w:tcW w:type="dxa" w:w="2484"/>
+            <w:shd w:fill="1B365D"/>
+          </w:tcPr>
+          <w:p>
+            <w:pPr>
+              <w:spacing w:before="80" w:after="80"/>
+            </w:pPr>
+            <w:r>
+              <w:rPr>
+                <w:rFonts w:ascii="Arial" w:hAnsi="Arial"/>
+                <w:b/>
+                <w:color w:val="FFFFFF"/>
+                <w:sz w:val="19"/>
+              </w:rPr>
+              <w:t>Link / Endereço URL</w:t>
+            </w:r>
+          </w:p>
+        </w:tc>
+        <w:tc>
+          <w:tcPr>
+            <w:tcW w:type="dxa" w:w="2484"/>
+            <w:shd w:fill="1B365D"/>
+          </w:tcPr>
+          <w:p>
+            <w:pPr>
+              <w:spacing w:before="80" w:after="80"/>
+            </w:pPr>
+            <w:r>
+              <w:rPr>
+                <w:rFonts w:ascii="Arial" w:hAnsi="Arial"/>
+                <w:b/>
+                <w:color w:val="FFFFFF"/>
+                <w:sz w:val="19"/>
+              </w:rPr>
+              <w:t>Finalidade Operacional</w:t>
+            </w:r>
+          </w:p>
+        </w:tc>
+      </w:tr>
+      <w:tr>
+        <w:tc>
+          <w:tcPr>
+            <w:tcW w:type="dxa" w:w="2484"/>
+          </w:tcPr>
+          <w:p>
+            <w:pPr>
+              <w:spacing w:before="60" w:after="60" w:line="264" w:lineRule="auto"/>
+            </w:pPr>
+            <w:r>
+              <w:rPr>
+                <w:rFonts w:ascii="Calibri" w:hAnsi="Calibri"/>
+                <w:color w:val="2D3748"/>
+                <w:sz w:val="19"/>
+              </w:rPr>
+              <w:t>Acesso Local (Servidor)</w:t>
+            </w:r>
+          </w:p>
+        </w:tc>
+        <w:tc>
+          <w:tcPr>
+            <w:tcW w:type="dxa" w:w="2484"/>
+          </w:tcPr>
+          <w:p>
+            <w:pPr>
+              <w:spacing w:before="60" w:after="60" w:line="264" w:lineRule="auto"/>
+            </w:pPr>
+            <w:r>
+              <w:rPr>
+                <w:rFonts w:ascii="Calibri" w:hAnsi="Calibri"/>
+                <w:color w:val="2D3748"/>
+                <w:sz w:val="19"/>
+              </w:rPr>
+              <w:t>No computador onde o sistema roda</w:t>
+            </w:r>
+          </w:p>
+        </w:tc>
+        <w:tc>
+          <w:tcPr>
+            <w:tcW w:type="dxa" w:w="2484"/>
+          </w:tcPr>
+          <w:p>
+            <w:pPr>
+              <w:spacing w:before="60" w:after="60" w:line="264" w:lineRule="auto"/>
+            </w:pPr>
+            <w:r>
+              <w:rPr>
+                <w:rFonts w:ascii="Calibri" w:hAnsi="Calibri"/>
+                <w:color w:val="2D3748"/>
+                <w:sz w:val="19"/>
+              </w:rPr>
+              <w:t>http://localhost:5173/ ou :8000/</w:t>
+            </w:r>
+          </w:p>
+        </w:tc>
+        <w:tc>
+          <w:tcPr>
+            <w:tcW w:type="dxa" w:w="2484"/>
+          </w:tcPr>
+          <w:p>
+            <w:pPr>
+              <w:spacing w:before="60" w:after="60" w:line="264" w:lineRule="auto"/>
+            </w:pPr>
+            <w:r>
+              <w:rPr>
+                <w:rFonts w:ascii="Calibri" w:hAnsi="Calibri"/>
+                <w:color w:val="2D3748"/>
+                <w:sz w:val="19"/>
+              </w:rPr>
+              <w:t>Acesso direto na máquina principal para operação local.</w:t>
+            </w:r>
+          </w:p>
+        </w:tc>
+      </w:tr>
+      <w:tr>
+        <w:tc>
+          <w:tcPr>
+            <w:tcW w:type="dxa" w:w="2484"/>
+            <w:shd w:fill="F7FAFC"/>
+          </w:tcPr>
+          <w:p>
+            <w:pPr>
+              <w:spacing w:before="60" w:after="60" w:line="264" w:lineRule="auto"/>
+            </w:pPr>
+            <w:r>
+              <w:rPr>
+                <w:rFonts w:ascii="Calibri" w:hAnsi="Calibri"/>
+                <w:color w:val="2D3748"/>
+                <w:sz w:val="19"/>
+              </w:rPr>
+              <w:t>Rede Local (Recomendado)</w:t>
+            </w:r>
+          </w:p>
+        </w:tc>
+        <w:tc>
+          <w:tcPr>
+            <w:tcW w:type="dxa" w:w="2484"/>
+            <w:shd w:fill="F7FAFC"/>
+          </w:tcPr>
+          <w:p>
+            <w:pPr>
+              <w:spacing w:before="60" w:after="60" w:line="264" w:lineRule="auto"/>
+            </w:pPr>
+            <w:r>
+              <w:rPr>
+                <w:rFonts w:ascii="Calibri" w:hAnsi="Calibri"/>
+                <w:color w:val="2D3748"/>
+                <w:sz w:val="19"/>
+              </w:rPr>
+              <w:t>Em qualquer PC da empresa</w:t>
+            </w:r>
+          </w:p>
+        </w:tc>
+        <w:tc>
+          <w:tcPr>
+            <w:tcW w:type="dxa" w:w="2484"/>
+            <w:shd w:fill="F7FAFC"/>
+          </w:tcPr>
+          <w:p>
+            <w:pPr>
+              <w:spacing w:before="60" w:after="60" w:line="264" w:lineRule="auto"/>
+            </w:pPr>
+            <w:r>
+              <w:rPr>
+                <w:rFonts w:ascii="Calibri" w:hAnsi="Calibri"/>
+                <w:color w:val="2D3748"/>
+                <w:sz w:val="19"/>
+              </w:rPr>
+              <w:t>http://10.1.1.111:5173/ (IP da máquina)</w:t>
+            </w:r>
+          </w:p>
+        </w:tc>
+        <w:tc>
+          <w:tcPr>
+            <w:tcW w:type="dxa" w:w="2484"/>
+            <w:shd w:fill="F7FAFC"/>
+          </w:tcPr>
+          <w:p>
+            <w:pPr>
+              <w:spacing w:before="60" w:after="60" w:line="264" w:lineRule="auto"/>
+            </w:pPr>
+            <w:r>
+              <w:rPr>
+                <w:rFonts w:ascii="Calibri" w:hAnsi="Calibri"/>
+                <w:color w:val="2D3748"/>
+                <w:sz w:val="19"/>
+              </w:rPr>
+              <w:t>Acesso diário dos colaboradores à interface visual do sistema.</w:t>
+            </w:r>
+          </w:p>
+        </w:tc>
+      </w:tr>
+      <w:tr>
+        <w:tc>
+          <w:tcPr>
+            <w:tcW w:type="dxa" w:w="2484"/>
+          </w:tcPr>
+          <w:p>
+            <w:pPr>
+              <w:spacing w:before="60" w:after="60" w:line="264" w:lineRule="auto"/>
+            </w:pPr>
+            <w:r>
+              <w:rPr>
+                <w:rFonts w:ascii="Calibri" w:hAnsi="Calibri"/>
+                <w:color w:val="2D3748"/>
+                <w:sz w:val="19"/>
+              </w:rPr>
+              <w:t>Rede Local via Nome (Fixo)</w:t>
+            </w:r>
+          </w:p>
+        </w:tc>
+        <w:tc>
+          <w:tcPr>
+            <w:tcW w:type="dxa" w:w="2484"/>
+          </w:tcPr>
+          <w:p>
+            <w:pPr>
+              <w:spacing w:before="60" w:after="60" w:line="264" w:lineRule="auto"/>
+            </w:pPr>
+            <w:r>
+              <w:rPr>
+                <w:rFonts w:ascii="Calibri" w:hAnsi="Calibri"/>
+                <w:color w:val="2D3748"/>
+                <w:sz w:val="19"/>
+              </w:rPr>
+              <w:t>Em qualquer PC da empresa</w:t>
+            </w:r>
+          </w:p>
+        </w:tc>
+        <w:tc>
+          <w:tcPr>
+            <w:tcW w:type="dxa" w:w="2484"/>
+          </w:tcPr>
+          <w:p>
+            <w:pPr>
+              <w:spacing w:before="60" w:after="60" w:line="264" w:lineRule="auto"/>
+            </w:pPr>
+            <w:r>
+              <w:rPr>
+                <w:rFonts w:ascii="Calibri" w:hAnsi="Calibri"/>
+                <w:color w:val="2D3748"/>
+                <w:sz w:val="19"/>
+              </w:rPr>
+              <w:t>http://INOVACAO-TMG64:5173/</w:t>
+            </w:r>
+          </w:p>
+        </w:tc>
+        <w:tc>
+          <w:tcPr>
+            <w:tcW w:type="dxa" w:w="2484"/>
+          </w:tcPr>
+          <w:p>
+            <w:pPr>
+              <w:spacing w:before="60" w:after="60" w:line="264" w:lineRule="auto"/>
+            </w:pPr>
+            <w:r>
+              <w:rPr>
+                <w:rFonts w:ascii="Calibri" w:hAnsi="Calibri"/>
+                <w:color w:val="2D3748"/>
+                <w:sz w:val="19"/>
+              </w:rPr>
+              <w:t>Acesso pelo nome do servidor (funciona mesmo se o IP mudar).</w:t>
+            </w:r>
+          </w:p>
+        </w:tc>
+      </w:tr>
+      <w:tr>
+        <w:tc>
+          <w:tcPr>
+            <w:tcW w:type="dxa" w:w="2484"/>
+            <w:shd w:fill="F7FAFC"/>
+          </w:tcPr>
+          <w:p>
+            <w:pPr>
+              <w:spacing w:before="60" w:after="60" w:line="264" w:lineRule="auto"/>
+            </w:pPr>
+            <w:r>
+              <w:rPr>
+                <w:rFonts w:ascii="Calibri" w:hAnsi="Calibri"/>
+                <w:color w:val="2D3748"/>
+                <w:sz w:val="19"/>
+              </w:rPr>
+              <w:t>Painel Django Admin</w:t>
+            </w:r>
+          </w:p>
+        </w:tc>
+        <w:tc>
+          <w:tcPr>
+            <w:tcW w:type="dxa" w:w="2484"/>
+            <w:shd w:fill="F7FAFC"/>
+          </w:tcPr>
+          <w:p>
+            <w:pPr>
+              <w:spacing w:before="60" w:after="60" w:line="264" w:lineRule="auto"/>
+            </w:pPr>
+            <w:r>
+              <w:rPr>
+                <w:rFonts w:ascii="Calibri" w:hAnsi="Calibri"/>
+                <w:color w:val="2D3748"/>
+                <w:sz w:val="19"/>
+              </w:rPr>
+              <w:t>Em qualquer PC da empresa</w:t>
+            </w:r>
+          </w:p>
+        </w:tc>
+        <w:tc>
+          <w:tcPr>
+            <w:tcW w:type="dxa" w:w="2484"/>
+            <w:shd w:fill="F7FAFC"/>
+          </w:tcPr>
+          <w:p>
+            <w:pPr>
+              <w:spacing w:before="60" w:after="60" w:line="264" w:lineRule="auto"/>
+            </w:pPr>
+            <w:r>
+              <w:rPr>
+                <w:rFonts w:ascii="Calibri" w:hAnsi="Calibri"/>
+                <w:color w:val="2D3748"/>
+                <w:sz w:val="19"/>
+              </w:rPr>
+              <w:t>http://10.1.1.111:8000/admin/</w:t>
+            </w:r>
+          </w:p>
+        </w:tc>
+        <w:tc>
+          <w:tcPr>
+            <w:tcW w:type="dxa" w:w="2484"/>
+            <w:shd w:fill="F7FAFC"/>
+          </w:tcPr>
+          <w:p>
+            <w:pPr>
+              <w:spacing w:before="60" w:after="60" w:line="264" w:lineRule="auto"/>
+            </w:pPr>
+            <w:r>
+              <w:rPr>
+                <w:rFonts w:ascii="Calibri" w:hAnsi="Calibri"/>
+                <w:color w:val="2D3748"/>
+                <w:sz w:val="19"/>
+              </w:rPr>
+              <w:t>Gestão técnica avançada de tabelas do banco de dados.</w:t>
+            </w:r>
+          </w:p>
+        </w:tc>
+      </w:tr>
+      <w:tr>
+        <w:tc>
+          <w:tcPr>
+            <w:tcW w:type="dxa" w:w="2484"/>
+          </w:tcPr>
+          <w:p>
+            <w:pPr>
+              <w:spacing w:before="60" w:after="60" w:line="264" w:lineRule="auto"/>
+            </w:pPr>
+            <w:r>
+              <w:rPr>
+                <w:rFonts w:ascii="Calibri" w:hAnsi="Calibri"/>
+                <w:color w:val="2D3748"/>
+                <w:sz w:val="19"/>
+              </w:rPr>
+              <w:t>Ambiente de Homologação</w:t>
+            </w:r>
+          </w:p>
+        </w:tc>
+        <w:tc>
+          <w:tcPr>
+            <w:tcW w:type="dxa" w:w="2484"/>
+          </w:tcPr>
+          <w:p>
+            <w:pPr>
+              <w:spacing w:before="60" w:after="60" w:line="264" w:lineRule="auto"/>
+            </w:pPr>
+            <w:r>
+              <w:rPr>
+                <w:rFonts w:ascii="Calibri" w:hAnsi="Calibri"/>
+                <w:color w:val="2D3748"/>
+                <w:sz w:val="19"/>
+              </w:rPr>
+              <w:t>Em qualquer PC da empresa</w:t>
+            </w:r>
+          </w:p>
+        </w:tc>
+        <w:tc>
+          <w:tcPr>
+            <w:tcW w:type="dxa" w:w="2484"/>
+          </w:tcPr>
+          <w:p>
+            <w:pPr>
+              <w:spacing w:before="60" w:after="60" w:line="264" w:lineRule="auto"/>
+            </w:pPr>
+            <w:r>
+              <w:rPr>
+                <w:rFonts w:ascii="Calibri" w:hAnsi="Calibri"/>
+                <w:color w:val="2D3748"/>
+                <w:sz w:val="19"/>
+              </w:rPr>
+              <w:t>http://10.1.1.111:5174/ (Porta 5174)</w:t>
+            </w:r>
+          </w:p>
+        </w:tc>
+        <w:tc>
+          <w:tcPr>
+            <w:tcW w:type="dxa" w:w="2484"/>
+          </w:tcPr>
+          <w:p>
+            <w:pPr>
+              <w:spacing w:before="60" w:after="60" w:line="264" w:lineRule="auto"/>
+            </w:pPr>
+            <w:r>
+              <w:rPr>
+                <w:rFonts w:ascii="Calibri" w:hAnsi="Calibri"/>
+                <w:color w:val="2D3748"/>
+                <w:sz w:val="19"/>
+              </w:rPr>
+              <w:t>Ambiente de testes para validar novas funções antes de subir.</w:t>
+            </w:r>
+          </w:p>
+        </w:tc>
+      </w:tr>
+    </w:tbl>
+    <w:p>
+      <w:pPr>
+        <w:spacing w:before="0" w:after="80"/>
+      </w:pPr>
+    </w:p>
+    <w:p>
+      <w:pPr>
+        <w:pStyle w:val="Heading3"/>
+        <w:keepNext/>
+        <w:spacing w:before="160" w:after="40"/>
+      </w:pPr>
+      <w:r>
+        <w:rPr>
+          <w:rFonts w:ascii="Calibri" w:hAnsi="Calibri"/>
+          <w:b/>
+          <w:color w:val="2D3748"/>
+          <w:sz w:val="23"/>
+        </w:rPr>
+        <w:t>B) Como Descobrir ou Confirmar o Link Atual (3 Métodos Práticos):</w:t>
+      </w:r>
+    </w:p>
+    <w:p>
+      <w:pPr>
+        <w:spacing w:before="0" w:after="80" w:line="276" w:lineRule="auto"/>
+      </w:pPr>
+      <w:r>
+        <w:rPr>
+          <w:rFonts w:ascii="Calibri" w:hAnsi="Calibri"/>
+          <w:b/>
+          <w:i w:val="0"/>
+          <w:color w:val="2D3748"/>
+          <w:sz w:val="21"/>
+        </w:rPr>
+        <w:t>Método 1: Diagnóstico Automático em 1 Clique (O Mais Rápido e Fácil):</w:t>
       </w:r>
     </w:p>
     <w:p>
@@ -1802,7 +2311,7 @@
           <w:color w:val="2D3748"/>
           <w:sz w:val="21"/>
         </w:rPr>
-        <w:t xml:space="preserve">Navegação: </w:t>
+        <w:t xml:space="preserve">Localizar: </w:t>
       </w:r>
       <w:r>
         <w:rPr>
@@ -1810,7 +2319,7 @@
           <w:color w:val="2D3748"/>
           <w:sz w:val="21"/>
         </w:rPr>
-        <w:t>Acesse o menu lateral esquerdo e clique em 'Usuários'.</w:t>
+        <w:t>No computador servidor, abra a pasta do sistema ou a Área de Trabalho.</w:t>
       </w:r>
     </w:p>
     <w:p>
@@ -1833,7 +2342,7 @@
           <w:color w:val="2D3748"/>
           <w:sz w:val="21"/>
         </w:rPr>
-        <w:t xml:space="preserve">Abrir Modal: </w:t>
+        <w:t xml:space="preserve">Executar: </w:t>
       </w:r>
       <w:r>
         <w:rPr>
@@ -1841,7 +2350,7 @@
           <w:color w:val="2D3748"/>
           <w:sz w:val="21"/>
         </w:rPr>
-        <w:t>No canto superior direito da tela, clique no botão azul 'Novo Usuário'.</w:t>
+        <w:t>Dê um duplo clique no arquivo 'diagnostico.bat' (ou abra 'menu_emergencia.bat' e escolha a opção [6]).</w:t>
       </w:r>
     </w:p>
     <w:p>
@@ -1864,7 +2373,7 @@
           <w:color w:val="2D3748"/>
           <w:sz w:val="21"/>
         </w:rPr>
-        <w:t xml:space="preserve">Preenchimento: </w:t>
+        <w:t xml:space="preserve">Abertura: </w:t>
       </w:r>
       <w:r>
         <w:rPr>
@@ -1872,7 +2381,7 @@
           <w:color w:val="2D3748"/>
           <w:sz w:val="21"/>
         </w:rPr>
-        <w:t>Preencha o Nome de Usuário (login único), Nome Completo, E-mail corporativo e a Senha inicial de acesso.</w:t>
+        <w:t>Em menos de 2 segundos, o Bloco de Notas abrirá automaticamente o arquivo 'diagnostico.txt'.</w:t>
       </w:r>
     </w:p>
     <w:p>
@@ -1895,7 +2404,7 @@
           <w:color w:val="2D3748"/>
           <w:sz w:val="21"/>
         </w:rPr>
-        <w:t xml:space="preserve">Perfil: </w:t>
+        <w:t xml:space="preserve">Identificar: </w:t>
       </w:r>
       <w:r>
         <w:rPr>
@@ -1903,14 +2412,22 @@
           <w:color w:val="2D3748"/>
           <w:sz w:val="21"/>
         </w:rPr>
-        <w:t>Selecione o Grupo de Acesso (Função):</w:t>
+        <w:t>Verifique as primeiras linhas onde constam o 'Nome do Computador' e 'Endereço IPv4' (ex: 10.1.1.111).</w:t>
       </w:r>
     </w:p>
     <w:p>
       <w:pPr>
-        <w:pStyle w:val="ListBullet"/>
-        <w:spacing w:before="20" w:after="40" w:line="276" w:lineRule="auto"/>
-      </w:pPr>
+        <w:spacing w:before="40" w:after="60" w:line="276" w:lineRule="auto"/>
+      </w:pPr>
+      <w:r>
+        <w:rPr>
+          <w:rFonts w:ascii="Arial" w:hAnsi="Arial"/>
+          <w:b/>
+          <w:color w:val="007A87"/>
+          <w:sz w:val="20"/>
+        </w:rPr>
+        <w:t xml:space="preserve">5. </w:t>
+      </w:r>
       <w:r>
         <w:rPr>
           <w:rFonts w:ascii="Calibri" w:hAnsi="Calibri"/>
@@ -1918,7 +2435,7 @@
           <w:color w:val="2D3748"/>
           <w:sz w:val="21"/>
         </w:rPr>
-        <w:t xml:space="preserve">• Administrador: </w:t>
+        <w:t xml:space="preserve">Compartilhar: </w:t>
       </w:r>
       <w:r>
         <w:rPr>
@@ -1926,14 +2443,37 @@
           <w:color w:val="2D3748"/>
           <w:sz w:val="21"/>
         </w:rPr>
-        <w:t>Acesso irrestrito a todas as telas, configurações e gerenciamento de contas.</w:t>
+        <w:t>O link pronto para enviar aos colegas será: http://[NUMERO_DO_IP]:5173/ ou http://[NOME_DO_COMPUTADOR]:5173/.</w:t>
       </w:r>
     </w:p>
     <w:p>
       <w:pPr>
-        <w:pStyle w:val="ListBullet"/>
-        <w:spacing w:before="20" w:after="40" w:line="276" w:lineRule="auto"/>
-      </w:pPr>
+        <w:spacing w:before="0" w:after="80" w:line="276" w:lineRule="auto"/>
+      </w:pPr>
+      <w:r>
+        <w:rPr>
+          <w:rFonts w:ascii="Calibri" w:hAnsi="Calibri"/>
+          <w:b/>
+          <w:i w:val="0"/>
+          <w:color w:val="2D3748"/>
+          <w:sz w:val="21"/>
+        </w:rPr>
+        <w:t>Método 2: Pelo Prompt de Comando do Windows (CMD ou PowerShell):</w:t>
+      </w:r>
+    </w:p>
+    <w:p>
+      <w:pPr>
+        <w:spacing w:before="40" w:after="60" w:line="276" w:lineRule="auto"/>
+      </w:pPr>
+      <w:r>
+        <w:rPr>
+          <w:rFonts w:ascii="Arial" w:hAnsi="Arial"/>
+          <w:b/>
+          <w:color w:val="007A87"/>
+          <w:sz w:val="20"/>
+        </w:rPr>
+        <w:t xml:space="preserve">1. </w:t>
+      </w:r>
       <w:r>
         <w:rPr>
           <w:rFonts w:ascii="Calibri" w:hAnsi="Calibri"/>
@@ -1941,7 +2481,7 @@
           <w:color w:val="2D3748"/>
           <w:sz w:val="21"/>
         </w:rPr>
-        <w:t xml:space="preserve">• Gestão: </w:t>
+        <w:t xml:space="preserve">Abrir Terminal: </w:t>
       </w:r>
       <w:r>
         <w:rPr>
@@ -1949,14 +2489,22 @@
           <w:color w:val="2D3748"/>
           <w:sz w:val="21"/>
         </w:rPr>
-        <w:t>Acesso para visualização de relatórios, lançamentos e importações de dados, sem acesso ao cadastro de novos administradores.</w:t>
+        <w:t>No computador servidor, pressione as teclas [Windows + R], digite 'cmd' e tecle Enter.</w:t>
       </w:r>
     </w:p>
     <w:p>
       <w:pPr>
-        <w:pStyle w:val="ListBullet"/>
-        <w:spacing w:before="20" w:after="40" w:line="276" w:lineRule="auto"/>
-      </w:pPr>
+        <w:spacing w:before="40" w:after="60" w:line="276" w:lineRule="auto"/>
+      </w:pPr>
+      <w:r>
+        <w:rPr>
+          <w:rFonts w:ascii="Arial" w:hAnsi="Arial"/>
+          <w:b/>
+          <w:color w:val="007A87"/>
+          <w:sz w:val="20"/>
+        </w:rPr>
+        <w:t xml:space="preserve">2. </w:t>
+      </w:r>
       <w:r>
         <w:rPr>
           <w:rFonts w:ascii="Calibri" w:hAnsi="Calibri"/>
@@ -1964,7 +2512,7 @@
           <w:color w:val="2D3748"/>
           <w:sz w:val="21"/>
         </w:rPr>
-        <w:t xml:space="preserve">• Aprendiz: </w:t>
+        <w:t xml:space="preserve">Comando: </w:t>
       </w:r>
       <w:r>
         <w:rPr>
@@ -1972,7 +2520,7 @@
           <w:color w:val="2D3748"/>
           <w:sz w:val="21"/>
         </w:rPr>
-        <w:t>Perfil restrito para consulta operacional e apoio.</w:t>
+        <w:t>Na tela preta que abrir, digite: ipconfig e pressione Enter.</w:t>
       </w:r>
     </w:p>
     <w:p>
@@ -1986,7 +2534,7 @@
           <w:color w:val="007A87"/>
           <w:sz w:val="20"/>
         </w:rPr>
-        <w:t xml:space="preserve">5. </w:t>
+        <w:t xml:space="preserve">3. </w:t>
       </w:r>
       <w:r>
         <w:rPr>
@@ -1995,7 +2543,7 @@
           <w:color w:val="2D3748"/>
           <w:sz w:val="21"/>
         </w:rPr>
-        <w:t xml:space="preserve">Concluir: </w:t>
+        <w:t xml:space="preserve">Leitura: </w:t>
       </w:r>
       <w:r>
         <w:rPr>
@@ -2003,23 +2551,7 @@
           <w:color w:val="2D3748"/>
           <w:sz w:val="21"/>
         </w:rPr>
-        <w:t>Clique em 'Salvar Usuário'. Se houver e-mail cadastrado, o sistema enviará uma mensagem de boas-vindas com as credenciais.</w:t>
-      </w:r>
-    </w:p>
-    <w:p>
-      <w:pPr>
-        <w:pStyle w:val="Heading3"/>
-        <w:keepNext/>
-        <w:spacing w:before="160" w:after="40"/>
-      </w:pPr>
-      <w:r>
-        <w:rPr>
-          <w:rFonts w:ascii="Calibri" w:hAnsi="Calibri"/>
-          <w:b/>
-          <w:color w:val="2D3748"/>
-          <w:sz w:val="23"/>
-        </w:rPr>
-        <w:t>B) Como Alterar a Senha de um Usuário Existente:</w:t>
+        <w:t>Localize o adaptador de rede conectado (Ethernet ou Wi-Fi) e veja o número na linha 'Endereço IPv4'.</w:t>
       </w:r>
     </w:p>
     <w:p>
@@ -2033,7 +2565,7 @@
           <w:color w:val="007A87"/>
           <w:sz w:val="20"/>
         </w:rPr>
-        <w:t xml:space="preserve">1. </w:t>
+        <w:t xml:space="preserve">4. </w:t>
       </w:r>
       <w:r>
         <w:rPr>
@@ -2042,7 +2574,7 @@
           <w:color w:val="2D3748"/>
           <w:sz w:val="21"/>
         </w:rPr>
-        <w:t xml:space="preserve">Navegação: </w:t>
+        <w:t xml:space="preserve">Montagem: </w:t>
       </w:r>
       <w:r>
         <w:rPr>
@@ -2050,256 +2582,22 @@
           <w:color w:val="2D3748"/>
           <w:sz w:val="21"/>
         </w:rPr>
-        <w:t>Acesse 'Usuários' no menu lateral.</w:t>
+        <w:t>Adicione 'http://' no início e ':5173/' no final para formar o link (ex: http://10.1.1.111:5173/).</w:t>
       </w:r>
     </w:p>
     <w:p>
       <w:pPr>
-        <w:spacing w:before="40" w:after="60" w:line="276" w:lineRule="auto"/>
-      </w:pPr>
-      <w:r>
-        <w:rPr>
-          <w:rFonts w:ascii="Arial" w:hAnsi="Arial"/>
-          <w:b/>
-          <w:color w:val="007A87"/>
-          <w:sz w:val="20"/>
-        </w:rPr>
-        <w:t xml:space="preserve">2. </w:t>
-      </w:r>
+        <w:spacing w:before="0" w:after="80" w:line="276" w:lineRule="auto"/>
+      </w:pPr>
       <w:r>
         <w:rPr>
           <w:rFonts w:ascii="Calibri" w:hAnsi="Calibri"/>
           <w:b/>
+          <w:i w:val="0"/>
           <w:color w:val="2D3748"/>
           <w:sz w:val="21"/>
         </w:rPr>
-        <w:t xml:space="preserve">Seleção: </w:t>
-      </w:r>
-      <w:r>
-        <w:rPr>
-          <w:rFonts w:ascii="Calibri" w:hAnsi="Calibri"/>
-          <w:color w:val="2D3748"/>
-          <w:sz w:val="21"/>
-        </w:rPr>
-        <w:t>Localize o usuário na tabela e clique sobre a linha dele (ou no ícone de lápis de edição).</w:t>
-      </w:r>
-    </w:p>
-    <w:p>
-      <w:pPr>
-        <w:spacing w:before="40" w:after="60" w:line="276" w:lineRule="auto"/>
-      </w:pPr>
-      <w:r>
-        <w:rPr>
-          <w:rFonts w:ascii="Arial" w:hAnsi="Arial"/>
-          <w:b/>
-          <w:color w:val="007A87"/>
-          <w:sz w:val="20"/>
-        </w:rPr>
-        <w:t xml:space="preserve">3. </w:t>
-      </w:r>
-      <w:r>
-        <w:rPr>
-          <w:rFonts w:ascii="Calibri" w:hAnsi="Calibri"/>
-          <w:b/>
-          <w:color w:val="2D3748"/>
-          <w:sz w:val="21"/>
-        </w:rPr>
-        <w:t xml:space="preserve">Definir Senha: </w:t>
-      </w:r>
-      <w:r>
-        <w:rPr>
-          <w:rFonts w:ascii="Calibri" w:hAnsi="Calibri"/>
-          <w:color w:val="2D3748"/>
-          <w:sz w:val="21"/>
-        </w:rPr>
-        <w:t>No formulário que abrir, localize o campo 'Nova Senha'. Digite a nova senha desejada.</w:t>
-      </w:r>
-    </w:p>
-    <w:p>
-      <w:pPr>
-        <w:spacing w:before="40" w:after="60" w:line="276" w:lineRule="auto"/>
-      </w:pPr>
-      <w:r>
-        <w:rPr>
-          <w:rFonts w:ascii="Arial" w:hAnsi="Arial"/>
-          <w:b/>
-          <w:color w:val="007A87"/>
-          <w:sz w:val="20"/>
-        </w:rPr>
-        <w:t xml:space="preserve">4. </w:t>
-      </w:r>
-      <w:r>
-        <w:rPr>
-          <w:rFonts w:ascii="Calibri" w:hAnsi="Calibri"/>
-          <w:b/>
-          <w:color w:val="2D3748"/>
-          <w:sz w:val="21"/>
-        </w:rPr>
-        <w:t xml:space="preserve">Confirmar: </w:t>
-      </w:r>
-      <w:r>
-        <w:rPr>
-          <w:rFonts w:ascii="Calibri" w:hAnsi="Calibri"/>
-          <w:color w:val="2D3748"/>
-          <w:sz w:val="21"/>
-        </w:rPr>
-        <w:t>Clique em 'Salvar Alterações'. A senha é criptografada imediatamente no banco de dados com algoritmo de alta segurança (PBKDF2/SHA256).</w:t>
-      </w:r>
-    </w:p>
-    <w:p>
-      <w:pPr>
-        <w:pStyle w:val="Heading3"/>
-        <w:keepNext/>
-        <w:spacing w:before="160" w:after="40"/>
-      </w:pPr>
-      <w:r>
-        <w:rPr>
-          <w:rFonts w:ascii="Calibri" w:hAnsi="Calibri"/>
-          <w:b/>
-          <w:color w:val="2D3748"/>
-          <w:sz w:val="23"/>
-        </w:rPr>
-        <w:t>C) Recuperação de Senha Esquecida (Pelo Próprio Usuário):</w:t>
-      </w:r>
-    </w:p>
-    <w:p>
-      <w:pPr>
-        <w:spacing w:before="40" w:after="60" w:line="276" w:lineRule="auto"/>
-      </w:pPr>
-      <w:r>
-        <w:rPr>
-          <w:rFonts w:ascii="Arial" w:hAnsi="Arial"/>
-          <w:b/>
-          <w:color w:val="007A87"/>
-          <w:sz w:val="20"/>
-        </w:rPr>
-        <w:t xml:space="preserve">1. </w:t>
-      </w:r>
-      <w:r>
-        <w:rPr>
-          <w:rFonts w:ascii="Calibri" w:hAnsi="Calibri"/>
-          <w:b/>
-          <w:color w:val="2D3748"/>
-          <w:sz w:val="21"/>
-        </w:rPr>
-        <w:t xml:space="preserve">Solicitação: </w:t>
-      </w:r>
-      <w:r>
-        <w:rPr>
-          <w:rFonts w:ascii="Calibri" w:hAnsi="Calibri"/>
-          <w:color w:val="2D3748"/>
-          <w:sz w:val="21"/>
-        </w:rPr>
-        <w:t>Na tela de login do sistema, clique no link 'Esqueci minha senha'.</w:t>
-      </w:r>
-    </w:p>
-    <w:p>
-      <w:pPr>
-        <w:spacing w:before="40" w:after="60" w:line="276" w:lineRule="auto"/>
-      </w:pPr>
-      <w:r>
-        <w:rPr>
-          <w:rFonts w:ascii="Arial" w:hAnsi="Arial"/>
-          <w:b/>
-          <w:color w:val="007A87"/>
-          <w:sz w:val="20"/>
-        </w:rPr>
-        <w:t xml:space="preserve">2. </w:t>
-      </w:r>
-      <w:r>
-        <w:rPr>
-          <w:rFonts w:ascii="Calibri" w:hAnsi="Calibri"/>
-          <w:b/>
-          <w:color w:val="2D3748"/>
-          <w:sz w:val="21"/>
-        </w:rPr>
-        <w:t xml:space="preserve">Identificação: </w:t>
-      </w:r>
-      <w:r>
-        <w:rPr>
-          <w:rFonts w:ascii="Calibri" w:hAnsi="Calibri"/>
-          <w:color w:val="2D3748"/>
-          <w:sz w:val="21"/>
-        </w:rPr>
-        <w:t>Digite o e-mail cadastrado no sistema e clique em 'Enviar Link'.</w:t>
-      </w:r>
-    </w:p>
-    <w:p>
-      <w:pPr>
-        <w:spacing w:before="40" w:after="60" w:line="276" w:lineRule="auto"/>
-      </w:pPr>
-      <w:r>
-        <w:rPr>
-          <w:rFonts w:ascii="Arial" w:hAnsi="Arial"/>
-          <w:b/>
-          <w:color w:val="007A87"/>
-          <w:sz w:val="20"/>
-        </w:rPr>
-        <w:t xml:space="preserve">3. </w:t>
-      </w:r>
-      <w:r>
-        <w:rPr>
-          <w:rFonts w:ascii="Calibri" w:hAnsi="Calibri"/>
-          <w:b/>
-          <w:color w:val="2D3748"/>
-          <w:sz w:val="21"/>
-        </w:rPr>
-        <w:t xml:space="preserve">E-mail: </w:t>
-      </w:r>
-      <w:r>
-        <w:rPr>
-          <w:rFonts w:ascii="Calibri" w:hAnsi="Calibri"/>
-          <w:color w:val="2D3748"/>
-          <w:sz w:val="21"/>
-        </w:rPr>
-        <w:t>O usuário receberá em sua caixa postal um link exclusivo de uso único com token seguro.</w:t>
-      </w:r>
-    </w:p>
-    <w:p>
-      <w:pPr>
-        <w:spacing w:before="40" w:after="60" w:line="276" w:lineRule="auto"/>
-      </w:pPr>
-      <w:r>
-        <w:rPr>
-          <w:rFonts w:ascii="Arial" w:hAnsi="Arial"/>
-          <w:b/>
-          <w:color w:val="007A87"/>
-          <w:sz w:val="20"/>
-        </w:rPr>
-        <w:t xml:space="preserve">4. </w:t>
-      </w:r>
-      <w:r>
-        <w:rPr>
-          <w:rFonts w:ascii="Calibri" w:hAnsi="Calibri"/>
-          <w:b/>
-          <w:color w:val="2D3748"/>
-          <w:sz w:val="21"/>
-        </w:rPr>
-        <w:t xml:space="preserve">Redefinição: </w:t>
-      </w:r>
-      <w:r>
-        <w:rPr>
-          <w:rFonts w:ascii="Calibri" w:hAnsi="Calibri"/>
-          <w:color w:val="2D3748"/>
-          <w:sz w:val="21"/>
-        </w:rPr>
-        <w:t>Ao clicar no link, abrirá a tela para digitar e confirmar a nova senha.</w:t>
-      </w:r>
-    </w:p>
-    <w:p>
-      <w:pPr>
-        <w:pStyle w:val="Heading2"/>
-        <w:keepNext/>
-        <w:spacing w:before="240" w:after="80"/>
-      </w:pPr>
-      <w:r>
-        <w:rPr>
-          <w:rFonts w:ascii="Arial" w:hAnsi="Arial"/>
-          <w:b/>
-          <w:color w:val="007A87"/>
-          <w:sz w:val="26"/>
-        </w:rPr>
-        <w:t>2.2 Gestão da Tabela Salarial e Cadastro de Cargos</w:t>
+        <w:t>Método 3: Acesso Direto pelo Nome do Computador (Imune a Mudanças de IP):</w:t>
       </w:r>
     </w:p>
     <w:p>
@@ -2314,7 +2612,7 @@
           <w:color w:val="2D3748"/>
           <w:sz w:val="21"/>
         </w:rPr>
-        <w:t>A tabela de salários alimenta os cálculos de folha de pagamento projetada, custo médio de turnover e orçamentos de escopo. Fica localizada em Menu Lateral &gt; Salários:</w:t>
+        <w:t>O computador servidor possui o nome de rede INOVACAO-TMG64. Nas redes corporativas Windows, os navegadores conseguem localizar o computador pelo próprio nome! Portanto, os colaboradores podem simplesmente digitar no Google Chrome ou Edge: http://INOVACAO-TMG64:5173/. A grande vantagem deste método é que mesmo se o roteador alterar o IP do servidor (via DHCP), o nome nunca muda e o link continuará funcionando.</w:t>
       </w:r>
     </w:p>
     <w:p>
@@ -2330,7 +2628,69 @@
           <w:color w:val="2D3748"/>
           <w:sz w:val="23"/>
         </w:rPr>
-        <w:t>A) Como Criar um Novo Cargo:</w:t>
+        <w:t>C) Qual Porta Usar? (Entendendo a Diferença entre 5173 e 8000):</w:t>
+      </w:r>
+    </w:p>
+    <w:p>
+      <w:pPr>
+        <w:pStyle w:val="ListBullet"/>
+        <w:spacing w:before="20" w:after="40" w:line="276" w:lineRule="auto"/>
+      </w:pPr>
+      <w:r>
+        <w:rPr>
+          <w:rFonts w:ascii="Calibri" w:hAnsi="Calibri"/>
+          <w:b/>
+          <w:color w:val="2D3748"/>
+          <w:sz w:val="21"/>
+        </w:rPr>
+        <w:t xml:space="preserve">• </w:t>
+      </w:r>
+      <w:r>
+        <w:rPr>
+          <w:rFonts w:ascii="Calibri" w:hAnsi="Calibri"/>
+          <w:color w:val="2D3748"/>
+          <w:sz w:val="21"/>
+        </w:rPr>
+        <w:t>Porta 5173 (Frontend React - RECOMENDADA PARA OS USUÁRIOS): É a interface gráfica moderna, rápida e dinâmica do sistema. É nessa porta que os operadores devem trabalhar diariamente para carregar arquivos, visualizar gráficos e emitir relatórios.</w:t>
+      </w:r>
+    </w:p>
+    <w:p>
+      <w:pPr>
+        <w:pStyle w:val="ListBullet"/>
+        <w:spacing w:before="20" w:after="40" w:line="276" w:lineRule="auto"/>
+      </w:pPr>
+      <w:r>
+        <w:rPr>
+          <w:rFonts w:ascii="Calibri" w:hAnsi="Calibri"/>
+          <w:b/>
+          <w:color w:val="2D3748"/>
+          <w:sz w:val="21"/>
+        </w:rPr>
+        <w:t xml:space="preserve">• </w:t>
+      </w:r>
+      <w:r>
+        <w:rPr>
+          <w:rFonts w:ascii="Calibri" w:hAnsi="Calibri"/>
+          <w:color w:val="2D3748"/>
+          <w:sz w:val="21"/>
+        </w:rPr>
+        <w:t>Porta 8000 (Backend Django / Waitress): É o motor de processamento, cálculo e banco de dados. Os usuários normais não precisam acessar diretamente a porta 8000 no navegador, pois o Frontend (5173) já se conecta a ela de forma transparente.</w:t>
+      </w:r>
+    </w:p>
+    <w:p>
+      <w:pPr>
+        <w:pStyle w:val="Heading3"/>
+        <w:keepNext/>
+        <w:spacing w:before="160" w:after="40"/>
+      </w:pPr>
+      <w:r>
+        <w:rPr>
+          <w:rFonts w:ascii="Calibri" w:hAnsi="Calibri"/>
+          <w:b/>
+          <w:color w:val="2D3748"/>
+          <w:sz w:val="23"/>
+        </w:rPr>
+        <w:t>D) Dica Prática: Criar Atalho na Área de Trabalho dos Colaboradores:</w:t>
       </w:r>
     </w:p>
     <w:p>
@@ -2353,7 +2713,7 @@
           <w:color w:val="2D3748"/>
           <w:sz w:val="21"/>
         </w:rPr>
-        <w:t xml:space="preserve">Navegação: </w:t>
+        <w:t xml:space="preserve">Abrir: </w:t>
       </w:r>
       <w:r>
         <w:rPr>
@@ -2361,7 +2721,7 @@
           <w:color w:val="2D3748"/>
           <w:sz w:val="21"/>
         </w:rPr>
-        <w:t>Acesse a tela 'Salários'.</w:t>
+        <w:t>No computador de cada colaborador, abra o Google Chrome ou Microsoft Edge e acesse o link do sistema.</w:t>
       </w:r>
     </w:p>
     <w:p>
@@ -2384,7 +2744,7 @@
           <w:color w:val="2D3748"/>
           <w:sz w:val="21"/>
         </w:rPr>
-        <w:t xml:space="preserve">Abrir Modal: </w:t>
+        <w:t xml:space="preserve">Menu: </w:t>
       </w:r>
       <w:r>
         <w:rPr>
@@ -2392,7 +2752,7 @@
           <w:color w:val="2D3748"/>
           <w:sz w:val="21"/>
         </w:rPr>
-        <w:t>No topo da tela, clique no botão cinza 'Novo Cargo' (ao lado de 'Novo Salário').</w:t>
+        <w:t>Clique nos 3 pontinhos no canto superior direito do navegador &gt; 'Salvar e compartilhar' (ou 'Mais ferramentas') &gt; 'Criar atalho...'.</w:t>
       </w:r>
     </w:p>
     <w:p>
@@ -2415,7 +2775,7 @@
           <w:color w:val="2D3748"/>
           <w:sz w:val="21"/>
         </w:rPr>
-        <w:t xml:space="preserve">Nomeclatura: </w:t>
+        <w:t xml:space="preserve">Nomear: </w:t>
       </w:r>
       <w:r>
         <w:rPr>
@@ -2423,7 +2783,7 @@
           <w:color w:val="2D3748"/>
           <w:sz w:val="21"/>
         </w:rPr>
-        <w:t>Digite o nome exato do novo cargo (ex: 'LÍDER DE LOJA', 'OPERADOR DE CAIXA', 'SUBGERENTE').</w:t>
+        <w:t>Digite o nome 'Sistema de Análises Operacionais', marque a opção 'Abrir como janela' e clique em 'Criar'.</w:t>
       </w:r>
     </w:p>
     <w:p>
@@ -2446,7 +2806,7 @@
           <w:color w:val="2D3748"/>
           <w:sz w:val="21"/>
         </w:rPr>
-        <w:t xml:space="preserve">Confirmar: </w:t>
+        <w:t xml:space="preserve">Facilidade: </w:t>
       </w:r>
       <w:r>
         <w:rPr>
@@ -2454,7 +2814,95 @@
           <w:color w:val="2D3748"/>
           <w:sz w:val="21"/>
         </w:rPr>
-        <w:t>Clique em 'Salvar Cargo'. O novo cargo fica imediatamente disponível para receber valores de salário por estado.</w:t>
+        <w:t>Pronto! Um ícone direto será criado na Área de Trabalho e na Barra de Tarefas do colaborador, funcionando como um aplicativo nativo.</w:t>
+      </w:r>
+    </w:p>
+    <w:tbl>
+      <w:tblPr>
+        <w:tblW w:type="auto" w:w="0"/>
+        <w:jc w:val="center"/>
+        <w:tblLook w:firstColumn="1" w:firstRow="1" w:lastColumn="0" w:lastRow="0" w:noHBand="0" w:noVBand="1" w:val="04A0"/>
+      </w:tblPr>
+      <w:tblGrid>
+        <w:gridCol w:w="9936"/>
+      </w:tblGrid>
+      <w:tr>
+        <w:tc>
+          <w:tcPr>
+            <w:tcW w:type="dxa" w:w="9936"/>
+            <w:shd w:fill="FFFAF0"/>
+            <w:tcMar>
+              <w:top w:w="120" w:type="dxa"/>
+              <w:bottom w:w="120" w:type="dxa"/>
+              <w:left w:w="180" w:type="dxa"/>
+              <w:right w:w="180" w:type="dxa"/>
+            </w:tcMar>
+            <w:tcBorders>
+              <w:top w:val="none"/>
+              <w:left w:val="single" w:sz="36" w:space="0" w:color="DD6B20"/>
+              <w:bottom w:val="none"/>
+              <w:right w:val="none"/>
+            </w:tcBorders>
+          </w:tcPr>
+          <w:p>
+            <w:pPr>
+              <w:spacing w:before="40" w:after="40" w:line="276" w:lineRule="auto"/>
+            </w:pPr>
+            <w:r>
+              <w:rPr>
+                <w:rFonts w:ascii="Calibri" w:hAnsi="Calibri"/>
+                <w:b/>
+                <w:color w:val="DD6B20"/>
+                <w:sz w:val="21"/>
+              </w:rPr>
+              <w:t xml:space="preserve">📌 O QUE FAZER SE O LINK NÃO ABRIR EM OUTRO COMPUTADOR: </w:t>
+            </w:r>
+            <w:r>
+              <w:rPr>
+                <w:rFonts w:ascii="Calibri" w:hAnsi="Calibri"/>
+                <w:color w:val="2D3748"/>
+                <w:sz w:val="20"/>
+              </w:rPr>
+              <w:t>Se o sistema não abrir no computador de um colaborador, confira 3 pontos básicos: (1) O computador servidor está ligado com as janelas do sistema abertas? (2) O computador do colaborador está conectado na mesma rede da empresa (mesmo Wi-Fi ou cabo)? (3) O IP da máquina servidora mudou? Se sim, rode o diagnostico.bat e passe o link atualizado ou utilize o link pelo nome http://INOVACAO-TMG64:5173/.</w:t>
+            </w:r>
+          </w:p>
+        </w:tc>
+      </w:tr>
+    </w:tbl>
+    <w:p>
+      <w:pPr>
+        <w:spacing w:before="0" w:after="80"/>
+      </w:pPr>
+    </w:p>
+    <w:p>
+      <w:pPr>
+        <w:pStyle w:val="Heading2"/>
+        <w:keepNext/>
+        <w:spacing w:before="240" w:after="80"/>
+      </w:pPr>
+      <w:r>
+        <w:rPr>
+          <w:rFonts w:ascii="Arial" w:hAnsi="Arial"/>
+          <w:b/>
+          <w:color w:val="007A87"/>
+          <w:sz w:val="26"/>
+        </w:rPr>
+        <w:t>2.2 Gestão de Usuários, Senhas e Permissões</w:t>
+      </w:r>
+    </w:p>
+    <w:p>
+      <w:pPr>
+        <w:spacing w:before="0" w:after="80" w:line="276" w:lineRule="auto"/>
+      </w:pPr>
+      <w:r>
+        <w:rPr>
+          <w:rFonts w:ascii="Calibri" w:hAnsi="Calibri"/>
+          <w:b w:val="0"/>
+          <w:i w:val="0"/>
+          <w:color w:val="2D3748"/>
+          <w:sz w:val="21"/>
+        </w:rPr>
+        <w:t>O controle de quem acessa o sistema e o nível de permissão é realizado no Menu Lateral &gt; Usuários:</w:t>
       </w:r>
     </w:p>
     <w:p>
@@ -2470,7 +2918,7 @@
           <w:color w:val="2D3748"/>
           <w:sz w:val="23"/>
         </w:rPr>
-        <w:t>B) Como Criar um Novo Salário:</w:t>
+        <w:t>A) Como Criar um Novo Usuário:</w:t>
       </w:r>
     </w:p>
     <w:p>
@@ -2493,7 +2941,7 @@
           <w:color w:val="2D3748"/>
           <w:sz w:val="21"/>
         </w:rPr>
-        <w:t xml:space="preserve">Abrir Modal: </w:t>
+        <w:t xml:space="preserve">Navegação: </w:t>
       </w:r>
       <w:r>
         <w:rPr>
@@ -2501,7 +2949,7 @@
           <w:color w:val="2D3748"/>
           <w:sz w:val="21"/>
         </w:rPr>
-        <w:t>Na tela 'Salários', clique no botão azul 'Novo Salário'.</w:t>
+        <w:t>Acesse o menu lateral esquerdo e clique em 'Usuários'.</w:t>
       </w:r>
     </w:p>
     <w:p>
@@ -2524,7 +2972,7 @@
           <w:color w:val="2D3748"/>
           <w:sz w:val="21"/>
         </w:rPr>
-        <w:t xml:space="preserve">Cargo: </w:t>
+        <w:t xml:space="preserve">Abrir Modal: </w:t>
       </w:r>
       <w:r>
         <w:rPr>
@@ -2532,7 +2980,7 @@
           <w:color w:val="2D3748"/>
           <w:sz w:val="21"/>
         </w:rPr>
-        <w:t>No campo 'Cargo', selecione o cargo desejado na lista pesquisável.</w:t>
+        <w:t>No canto superior direito da tela, clique no botão azul 'Novo Usuário'.</w:t>
       </w:r>
     </w:p>
     <w:p>
@@ -2555,7 +3003,7 @@
           <w:color w:val="2D3748"/>
           <w:sz w:val="21"/>
         </w:rPr>
-        <w:t xml:space="preserve">Estado (UF): </w:t>
+        <w:t xml:space="preserve">Preenchimento: </w:t>
       </w:r>
       <w:r>
         <w:rPr>
@@ -2563,7 +3011,7 @@
           <w:color w:val="2D3748"/>
           <w:sz w:val="21"/>
         </w:rPr>
-        <w:t>Selecione o Estado (UF) em que esse salário é vigente (ex: SP, RJ, MG, PR ou 'BR' para nacional).</w:t>
+        <w:t>Preencha o Nome de Usuário (login único), Nome Completo, E-mail corporativo e a Senha inicial de acesso.</w:t>
       </w:r>
     </w:p>
     <w:p>
@@ -2586,7 +3034,7 @@
           <w:color w:val="2D3748"/>
           <w:sz w:val="21"/>
         </w:rPr>
-        <w:t xml:space="preserve">Ano: </w:t>
+        <w:t xml:space="preserve">Perfil: </w:t>
       </w:r>
       <w:r>
         <w:rPr>
@@ -2594,7 +3042,76 @@
           <w:color w:val="2D3748"/>
           <w:sz w:val="21"/>
         </w:rPr>
-        <w:t>Informe o Ano de vigência (ex: 2026).</w:t>
+        <w:t>Selecione o Grupo de Acesso (Função):</w:t>
+      </w:r>
+    </w:p>
+    <w:p>
+      <w:pPr>
+        <w:pStyle w:val="ListBullet"/>
+        <w:spacing w:before="20" w:after="40" w:line="276" w:lineRule="auto"/>
+      </w:pPr>
+      <w:r>
+        <w:rPr>
+          <w:rFonts w:ascii="Calibri" w:hAnsi="Calibri"/>
+          <w:b/>
+          <w:color w:val="2D3748"/>
+          <w:sz w:val="21"/>
+        </w:rPr>
+        <w:t xml:space="preserve">• Administrador: </w:t>
+      </w:r>
+      <w:r>
+        <w:rPr>
+          <w:rFonts w:ascii="Calibri" w:hAnsi="Calibri"/>
+          <w:color w:val="2D3748"/>
+          <w:sz w:val="21"/>
+        </w:rPr>
+        <w:t>Acesso irrestrito a todas as telas, configurações e gerenciamento de contas.</w:t>
+      </w:r>
+    </w:p>
+    <w:p>
+      <w:pPr>
+        <w:pStyle w:val="ListBullet"/>
+        <w:spacing w:before="20" w:after="40" w:line="276" w:lineRule="auto"/>
+      </w:pPr>
+      <w:r>
+        <w:rPr>
+          <w:rFonts w:ascii="Calibri" w:hAnsi="Calibri"/>
+          <w:b/>
+          <w:color w:val="2D3748"/>
+          <w:sz w:val="21"/>
+        </w:rPr>
+        <w:t xml:space="preserve">• Gestão: </w:t>
+      </w:r>
+      <w:r>
+        <w:rPr>
+          <w:rFonts w:ascii="Calibri" w:hAnsi="Calibri"/>
+          <w:color w:val="2D3748"/>
+          <w:sz w:val="21"/>
+        </w:rPr>
+        <w:t>Acesso para visualização de relatórios, lançamentos e importações de dados, sem acesso ao cadastro de novos administradores.</w:t>
+      </w:r>
+    </w:p>
+    <w:p>
+      <w:pPr>
+        <w:pStyle w:val="ListBullet"/>
+        <w:spacing w:before="20" w:after="40" w:line="276" w:lineRule="auto"/>
+      </w:pPr>
+      <w:r>
+        <w:rPr>
+          <w:rFonts w:ascii="Calibri" w:hAnsi="Calibri"/>
+          <w:b/>
+          <w:color w:val="2D3748"/>
+          <w:sz w:val="21"/>
+        </w:rPr>
+        <w:t xml:space="preserve">• Aprendiz: </w:t>
+      </w:r>
+      <w:r>
+        <w:rPr>
+          <w:rFonts w:ascii="Calibri" w:hAnsi="Calibri"/>
+          <w:color w:val="2D3748"/>
+          <w:sz w:val="21"/>
+        </w:rPr>
+        <w:t>Perfil restrito para consulta operacional e apoio.</w:t>
       </w:r>
     </w:p>
     <w:p>
@@ -2617,7 +3134,7 @@
           <w:color w:val="2D3748"/>
           <w:sz w:val="21"/>
         </w:rPr>
-        <w:t xml:space="preserve">Valor (R$): </w:t>
+        <w:t xml:space="preserve">Concluir: </w:t>
       </w:r>
       <w:r>
         <w:rPr>
@@ -2625,7 +3142,23 @@
           <w:color w:val="2D3748"/>
           <w:sz w:val="21"/>
         </w:rPr>
-        <w:t>Digite o Valor do salário base em reais (ex: 1850.00).</w:t>
+        <w:t>Clique em 'Salvar Usuário'. Se houver e-mail cadastrado, o sistema enviará uma mensagem de boas-vindas com as credenciais.</w:t>
+      </w:r>
+    </w:p>
+    <w:p>
+      <w:pPr>
+        <w:pStyle w:val="Heading3"/>
+        <w:keepNext/>
+        <w:spacing w:before="160" w:after="40"/>
+      </w:pPr>
+      <w:r>
+        <w:rPr>
+          <w:rFonts w:ascii="Calibri" w:hAnsi="Calibri"/>
+          <w:b/>
+          <w:color w:val="2D3748"/>
+          <w:sz w:val="23"/>
+        </w:rPr>
+        <w:t>B) Como Alterar a Senha de um Usuário Existente:</w:t>
       </w:r>
     </w:p>
     <w:p>
@@ -2639,7 +3172,7 @@
           <w:color w:val="007A87"/>
           <w:sz w:val="20"/>
         </w:rPr>
-        <w:t xml:space="preserve">6. </w:t>
+        <w:t xml:space="preserve">1. </w:t>
       </w:r>
       <w:r>
         <w:rPr>
@@ -2648,7 +3181,7 @@
           <w:color w:val="2D3748"/>
           <w:sz w:val="21"/>
         </w:rPr>
-        <w:t xml:space="preserve">Confirmar: </w:t>
+        <w:t xml:space="preserve">Navegação: </w:t>
       </w:r>
       <w:r>
         <w:rPr>
@@ -2656,7 +3189,100 @@
           <w:color w:val="2D3748"/>
           <w:sz w:val="21"/>
         </w:rPr>
-        <w:t>Clique em 'Salvar'. O sistema registrará a vigência salarial.</w:t>
+        <w:t>Acesse 'Usuários' no menu lateral.</w:t>
+      </w:r>
+    </w:p>
+    <w:p>
+      <w:pPr>
+        <w:spacing w:before="40" w:after="60" w:line="276" w:lineRule="auto"/>
+      </w:pPr>
+      <w:r>
+        <w:rPr>
+          <w:rFonts w:ascii="Arial" w:hAnsi="Arial"/>
+          <w:b/>
+          <w:color w:val="007A87"/>
+          <w:sz w:val="20"/>
+        </w:rPr>
+        <w:t xml:space="preserve">2. </w:t>
+      </w:r>
+      <w:r>
+        <w:rPr>
+          <w:rFonts w:ascii="Calibri" w:hAnsi="Calibri"/>
+          <w:b/>
+          <w:color w:val="2D3748"/>
+          <w:sz w:val="21"/>
+        </w:rPr>
+        <w:t xml:space="preserve">Seleção: </w:t>
+      </w:r>
+      <w:r>
+        <w:rPr>
+          <w:rFonts w:ascii="Calibri" w:hAnsi="Calibri"/>
+          <w:color w:val="2D3748"/>
+          <w:sz w:val="21"/>
+        </w:rPr>
+        <w:t>Localize o usuário na tabela e clique sobre a linha dele (ou no ícone de lápis de edição).</w:t>
+      </w:r>
+    </w:p>
+    <w:p>
+      <w:pPr>
+        <w:spacing w:before="40" w:after="60" w:line="276" w:lineRule="auto"/>
+      </w:pPr>
+      <w:r>
+        <w:rPr>
+          <w:rFonts w:ascii="Arial" w:hAnsi="Arial"/>
+          <w:b/>
+          <w:color w:val="007A87"/>
+          <w:sz w:val="20"/>
+        </w:rPr>
+        <w:t xml:space="preserve">3. </w:t>
+      </w:r>
+      <w:r>
+        <w:rPr>
+          <w:rFonts w:ascii="Calibri" w:hAnsi="Calibri"/>
+          <w:b/>
+          <w:color w:val="2D3748"/>
+          <w:sz w:val="21"/>
+        </w:rPr>
+        <w:t xml:space="preserve">Definir Senha: </w:t>
+      </w:r>
+      <w:r>
+        <w:rPr>
+          <w:rFonts w:ascii="Calibri" w:hAnsi="Calibri"/>
+          <w:color w:val="2D3748"/>
+          <w:sz w:val="21"/>
+        </w:rPr>
+        <w:t>No formulário que abrir, localize o campo 'Nova Senha'. Digite a nova senha desejada.</w:t>
+      </w:r>
+    </w:p>
+    <w:p>
+      <w:pPr>
+        <w:spacing w:before="40" w:after="60" w:line="276" w:lineRule="auto"/>
+      </w:pPr>
+      <w:r>
+        <w:rPr>
+          <w:rFonts w:ascii="Arial" w:hAnsi="Arial"/>
+          <w:b/>
+          <w:color w:val="007A87"/>
+          <w:sz w:val="20"/>
+        </w:rPr>
+        <w:t xml:space="preserve">4. </w:t>
+      </w:r>
+      <w:r>
+        <w:rPr>
+          <w:rFonts w:ascii="Calibri" w:hAnsi="Calibri"/>
+          <w:b/>
+          <w:color w:val="2D3748"/>
+          <w:sz w:val="21"/>
+        </w:rPr>
+        <w:t xml:space="preserve">Confirmar: </w:t>
+      </w:r>
+      <w:r>
+        <w:rPr>
+          <w:rFonts w:ascii="Calibri" w:hAnsi="Calibri"/>
+          <w:color w:val="2D3748"/>
+          <w:sz w:val="21"/>
+        </w:rPr>
+        <w:t>Clique em 'Salvar Alterações'. A senha é criptografada imediatamente no banco de dados com algoritmo de alta segurança (PBKDF2/SHA256).</w:t>
       </w:r>
     </w:p>
     <w:p>
@@ -2672,7 +3298,7 @@
           <w:color w:val="2D3748"/>
           <w:sz w:val="23"/>
         </w:rPr>
-        <w:t>C) Como Alterar o Valor de um Salário Existente:</w:t>
+        <w:t>C) Recuperação de Senha Esquecida (Pelo Próprio Usuário):</w:t>
       </w:r>
     </w:p>
     <w:p>
@@ -2695,7 +3321,7 @@
           <w:color w:val="2D3748"/>
           <w:sz w:val="21"/>
         </w:rPr>
-        <w:t xml:space="preserve">Localizar: </w:t>
+        <w:t xml:space="preserve">Solicitação: </w:t>
       </w:r>
       <w:r>
         <w:rPr>
@@ -2703,7 +3329,7 @@
           <w:color w:val="2D3748"/>
           <w:sz w:val="21"/>
         </w:rPr>
-        <w:t>Utilize os filtros no topo da tela para encontrar o salário desejado (filtre por Cargo, UF ou Ano).</w:t>
+        <w:t>Na tela de login do sistema, clique no link 'Esqueci minha senha'.</w:t>
       </w:r>
     </w:p>
     <w:p>
@@ -2726,7 +3352,7 @@
           <w:color w:val="2D3748"/>
           <w:sz w:val="21"/>
         </w:rPr>
-        <w:t xml:space="preserve">Editar: </w:t>
+        <w:t xml:space="preserve">Identificação: </w:t>
       </w:r>
       <w:r>
         <w:rPr>
@@ -2734,7 +3360,7 @@
           <w:color w:val="2D3748"/>
           <w:sz w:val="21"/>
         </w:rPr>
-        <w:t>Na linha do salário que deseja alterar, clique no ícone de Lápis (Editar) no canto direito.</w:t>
+        <w:t>Digite o e-mail cadastrado no sistema e clique em 'Enviar Link'.</w:t>
       </w:r>
     </w:p>
     <w:p>
@@ -2757,7 +3383,7 @@
           <w:color w:val="2D3748"/>
           <w:sz w:val="21"/>
         </w:rPr>
-        <w:t xml:space="preserve">Ajuste: </w:t>
+        <w:t xml:space="preserve">E-mail: </w:t>
       </w:r>
       <w:r>
         <w:rPr>
@@ -2765,7 +3391,7 @@
           <w:color w:val="2D3748"/>
           <w:sz w:val="21"/>
         </w:rPr>
-        <w:t>Altere o campo 'Valor (R$)' para o novo montante reajustado.</w:t>
+        <w:t>O usuário receberá em sua caixa postal um link exclusivo de uso único com token seguro.</w:t>
       </w:r>
     </w:p>
     <w:p>
@@ -2788,7 +3414,7 @@
           <w:color w:val="2D3748"/>
           <w:sz w:val="21"/>
         </w:rPr>
-        <w:t xml:space="preserve">Concluir: </w:t>
+        <w:t xml:space="preserve">Redefinição: </w:t>
       </w:r>
       <w:r>
         <w:rPr>
@@ -2796,7 +3422,7 @@
           <w:color w:val="2D3748"/>
           <w:sz w:val="21"/>
         </w:rPr>
-        <w:t>Clique em 'Salvar'. Todos os relatórios e cálculos do sistema passarão a usar o novo valor automaticamente.</w:t>
+        <w:t>Ao clicar no link, abrirá a tela para digitar e confirmar a nova senha.</w:t>
       </w:r>
     </w:p>
     <w:p>
@@ -2812,7 +3438,520 @@
           <w:color w:val="007A87"/>
           <w:sz w:val="26"/>
         </w:rPr>
-        <w:t>2.3 Guia Passo a Passo: Como Obter os Arquivos nas Fontes Oficiais</w:t>
+        <w:t>2.3 Gestão da Tabela Salarial e Cadastro de Cargos</w:t>
+      </w:r>
+    </w:p>
+    <w:p>
+      <w:pPr>
+        <w:spacing w:before="0" w:after="80" w:line="276" w:lineRule="auto"/>
+      </w:pPr>
+      <w:r>
+        <w:rPr>
+          <w:rFonts w:ascii="Calibri" w:hAnsi="Calibri"/>
+          <w:b w:val="0"/>
+          <w:i w:val="0"/>
+          <w:color w:val="2D3748"/>
+          <w:sz w:val="21"/>
+        </w:rPr>
+        <w:t>A tabela de salários alimenta os cálculos de folha de pagamento projetada, custo médio de turnover e orçamentos de escopo. Fica localizada em Menu Lateral &gt; Salários:</w:t>
+      </w:r>
+    </w:p>
+    <w:p>
+      <w:pPr>
+        <w:pStyle w:val="Heading3"/>
+        <w:keepNext/>
+        <w:spacing w:before="160" w:after="40"/>
+      </w:pPr>
+      <w:r>
+        <w:rPr>
+          <w:rFonts w:ascii="Calibri" w:hAnsi="Calibri"/>
+          <w:b/>
+          <w:color w:val="2D3748"/>
+          <w:sz w:val="23"/>
+        </w:rPr>
+        <w:t>A) Como Criar um Novo Cargo:</w:t>
+      </w:r>
+    </w:p>
+    <w:p>
+      <w:pPr>
+        <w:spacing w:before="40" w:after="60" w:line="276" w:lineRule="auto"/>
+      </w:pPr>
+      <w:r>
+        <w:rPr>
+          <w:rFonts w:ascii="Arial" w:hAnsi="Arial"/>
+          <w:b/>
+          <w:color w:val="007A87"/>
+          <w:sz w:val="20"/>
+        </w:rPr>
+        <w:t xml:space="preserve">1. </w:t>
+      </w:r>
+      <w:r>
+        <w:rPr>
+          <w:rFonts w:ascii="Calibri" w:hAnsi="Calibri"/>
+          <w:b/>
+          <w:color w:val="2D3748"/>
+          <w:sz w:val="21"/>
+        </w:rPr>
+        <w:t xml:space="preserve">Navegação: </w:t>
+      </w:r>
+      <w:r>
+        <w:rPr>
+          <w:rFonts w:ascii="Calibri" w:hAnsi="Calibri"/>
+          <w:color w:val="2D3748"/>
+          <w:sz w:val="21"/>
+        </w:rPr>
+        <w:t>Acesse a tela 'Salários'.</w:t>
+      </w:r>
+    </w:p>
+    <w:p>
+      <w:pPr>
+        <w:spacing w:before="40" w:after="60" w:line="276" w:lineRule="auto"/>
+      </w:pPr>
+      <w:r>
+        <w:rPr>
+          <w:rFonts w:ascii="Arial" w:hAnsi="Arial"/>
+          <w:b/>
+          <w:color w:val="007A87"/>
+          <w:sz w:val="20"/>
+        </w:rPr>
+        <w:t xml:space="preserve">2. </w:t>
+      </w:r>
+      <w:r>
+        <w:rPr>
+          <w:rFonts w:ascii="Calibri" w:hAnsi="Calibri"/>
+          <w:b/>
+          <w:color w:val="2D3748"/>
+          <w:sz w:val="21"/>
+        </w:rPr>
+        <w:t xml:space="preserve">Abrir Modal: </w:t>
+      </w:r>
+      <w:r>
+        <w:rPr>
+          <w:rFonts w:ascii="Calibri" w:hAnsi="Calibri"/>
+          <w:color w:val="2D3748"/>
+          <w:sz w:val="21"/>
+        </w:rPr>
+        <w:t>No topo da tela, clique no botão cinza 'Novo Cargo' (ao lado de 'Novo Salário').</w:t>
+      </w:r>
+    </w:p>
+    <w:p>
+      <w:pPr>
+        <w:spacing w:before="40" w:after="60" w:line="276" w:lineRule="auto"/>
+      </w:pPr>
+      <w:r>
+        <w:rPr>
+          <w:rFonts w:ascii="Arial" w:hAnsi="Arial"/>
+          <w:b/>
+          <w:color w:val="007A87"/>
+          <w:sz w:val="20"/>
+        </w:rPr>
+        <w:t xml:space="preserve">3. </w:t>
+      </w:r>
+      <w:r>
+        <w:rPr>
+          <w:rFonts w:ascii="Calibri" w:hAnsi="Calibri"/>
+          <w:b/>
+          <w:color w:val="2D3748"/>
+          <w:sz w:val="21"/>
+        </w:rPr>
+        <w:t xml:space="preserve">Nomeclatura: </w:t>
+      </w:r>
+      <w:r>
+        <w:rPr>
+          <w:rFonts w:ascii="Calibri" w:hAnsi="Calibri"/>
+          <w:color w:val="2D3748"/>
+          <w:sz w:val="21"/>
+        </w:rPr>
+        <w:t>Digite o nome exato do novo cargo (ex: 'LÍDER DE LOJA', 'OPERADOR DE CAIXA', 'SUBGERENTE').</w:t>
+      </w:r>
+    </w:p>
+    <w:p>
+      <w:pPr>
+        <w:spacing w:before="40" w:after="60" w:line="276" w:lineRule="auto"/>
+      </w:pPr>
+      <w:r>
+        <w:rPr>
+          <w:rFonts w:ascii="Arial" w:hAnsi="Arial"/>
+          <w:b/>
+          <w:color w:val="007A87"/>
+          <w:sz w:val="20"/>
+        </w:rPr>
+        <w:t xml:space="preserve">4. </w:t>
+      </w:r>
+      <w:r>
+        <w:rPr>
+          <w:rFonts w:ascii="Calibri" w:hAnsi="Calibri"/>
+          <w:b/>
+          <w:color w:val="2D3748"/>
+          <w:sz w:val="21"/>
+        </w:rPr>
+        <w:t xml:space="preserve">Confirmar: </w:t>
+      </w:r>
+      <w:r>
+        <w:rPr>
+          <w:rFonts w:ascii="Calibri" w:hAnsi="Calibri"/>
+          <w:color w:val="2D3748"/>
+          <w:sz w:val="21"/>
+        </w:rPr>
+        <w:t>Clique em 'Salvar Cargo'. O novo cargo fica imediatamente disponível para receber valores de salário por estado.</w:t>
+      </w:r>
+    </w:p>
+    <w:p>
+      <w:pPr>
+        <w:pStyle w:val="Heading3"/>
+        <w:keepNext/>
+        <w:spacing w:before="160" w:after="40"/>
+      </w:pPr>
+      <w:r>
+        <w:rPr>
+          <w:rFonts w:ascii="Calibri" w:hAnsi="Calibri"/>
+          <w:b/>
+          <w:color w:val="2D3748"/>
+          <w:sz w:val="23"/>
+        </w:rPr>
+        <w:t>B) Como Criar um Novo Salário:</w:t>
+      </w:r>
+    </w:p>
+    <w:p>
+      <w:pPr>
+        <w:spacing w:before="40" w:after="60" w:line="276" w:lineRule="auto"/>
+      </w:pPr>
+      <w:r>
+        <w:rPr>
+          <w:rFonts w:ascii="Arial" w:hAnsi="Arial"/>
+          <w:b/>
+          <w:color w:val="007A87"/>
+          <w:sz w:val="20"/>
+        </w:rPr>
+        <w:t xml:space="preserve">1. </w:t>
+      </w:r>
+      <w:r>
+        <w:rPr>
+          <w:rFonts w:ascii="Calibri" w:hAnsi="Calibri"/>
+          <w:b/>
+          <w:color w:val="2D3748"/>
+          <w:sz w:val="21"/>
+        </w:rPr>
+        <w:t xml:space="preserve">Abrir Modal: </w:t>
+      </w:r>
+      <w:r>
+        <w:rPr>
+          <w:rFonts w:ascii="Calibri" w:hAnsi="Calibri"/>
+          <w:color w:val="2D3748"/>
+          <w:sz w:val="21"/>
+        </w:rPr>
+        <w:t>Na tela 'Salários', clique no botão azul 'Novo Salário'.</w:t>
+      </w:r>
+    </w:p>
+    <w:p>
+      <w:pPr>
+        <w:spacing w:before="40" w:after="60" w:line="276" w:lineRule="auto"/>
+      </w:pPr>
+      <w:r>
+        <w:rPr>
+          <w:rFonts w:ascii="Arial" w:hAnsi="Arial"/>
+          <w:b/>
+          <w:color w:val="007A87"/>
+          <w:sz w:val="20"/>
+        </w:rPr>
+        <w:t xml:space="preserve">2. </w:t>
+      </w:r>
+      <w:r>
+        <w:rPr>
+          <w:rFonts w:ascii="Calibri" w:hAnsi="Calibri"/>
+          <w:b/>
+          <w:color w:val="2D3748"/>
+          <w:sz w:val="21"/>
+        </w:rPr>
+        <w:t xml:space="preserve">Cargo: </w:t>
+      </w:r>
+      <w:r>
+        <w:rPr>
+          <w:rFonts w:ascii="Calibri" w:hAnsi="Calibri"/>
+          <w:color w:val="2D3748"/>
+          <w:sz w:val="21"/>
+        </w:rPr>
+        <w:t>No campo 'Cargo', selecione o cargo desejado na lista pesquisável.</w:t>
+      </w:r>
+    </w:p>
+    <w:p>
+      <w:pPr>
+        <w:spacing w:before="40" w:after="60" w:line="276" w:lineRule="auto"/>
+      </w:pPr>
+      <w:r>
+        <w:rPr>
+          <w:rFonts w:ascii="Arial" w:hAnsi="Arial"/>
+          <w:b/>
+          <w:color w:val="007A87"/>
+          <w:sz w:val="20"/>
+        </w:rPr>
+        <w:t xml:space="preserve">3. </w:t>
+      </w:r>
+      <w:r>
+        <w:rPr>
+          <w:rFonts w:ascii="Calibri" w:hAnsi="Calibri"/>
+          <w:b/>
+          <w:color w:val="2D3748"/>
+          <w:sz w:val="21"/>
+        </w:rPr>
+        <w:t xml:space="preserve">Estado (UF): </w:t>
+      </w:r>
+      <w:r>
+        <w:rPr>
+          <w:rFonts w:ascii="Calibri" w:hAnsi="Calibri"/>
+          <w:color w:val="2D3748"/>
+          <w:sz w:val="21"/>
+        </w:rPr>
+        <w:t>Selecione o Estado (UF) em que esse salário é vigente (ex: SP, RJ, MG, PR ou 'BR' para nacional).</w:t>
+      </w:r>
+    </w:p>
+    <w:p>
+      <w:pPr>
+        <w:spacing w:before="40" w:after="60" w:line="276" w:lineRule="auto"/>
+      </w:pPr>
+      <w:r>
+        <w:rPr>
+          <w:rFonts w:ascii="Arial" w:hAnsi="Arial"/>
+          <w:b/>
+          <w:color w:val="007A87"/>
+          <w:sz w:val="20"/>
+        </w:rPr>
+        <w:t xml:space="preserve">4. </w:t>
+      </w:r>
+      <w:r>
+        <w:rPr>
+          <w:rFonts w:ascii="Calibri" w:hAnsi="Calibri"/>
+          <w:b/>
+          <w:color w:val="2D3748"/>
+          <w:sz w:val="21"/>
+        </w:rPr>
+        <w:t xml:space="preserve">Ano: </w:t>
+      </w:r>
+      <w:r>
+        <w:rPr>
+          <w:rFonts w:ascii="Calibri" w:hAnsi="Calibri"/>
+          <w:color w:val="2D3748"/>
+          <w:sz w:val="21"/>
+        </w:rPr>
+        <w:t>Informe o Ano de vigência (ex: 2026).</w:t>
+      </w:r>
+    </w:p>
+    <w:p>
+      <w:pPr>
+        <w:spacing w:before="40" w:after="60" w:line="276" w:lineRule="auto"/>
+      </w:pPr>
+      <w:r>
+        <w:rPr>
+          <w:rFonts w:ascii="Arial" w:hAnsi="Arial"/>
+          <w:b/>
+          <w:color w:val="007A87"/>
+          <w:sz w:val="20"/>
+        </w:rPr>
+        <w:t xml:space="preserve">5. </w:t>
+      </w:r>
+      <w:r>
+        <w:rPr>
+          <w:rFonts w:ascii="Calibri" w:hAnsi="Calibri"/>
+          <w:b/>
+          <w:color w:val="2D3748"/>
+          <w:sz w:val="21"/>
+        </w:rPr>
+        <w:t xml:space="preserve">Valor (R$): </w:t>
+      </w:r>
+      <w:r>
+        <w:rPr>
+          <w:rFonts w:ascii="Calibri" w:hAnsi="Calibri"/>
+          <w:color w:val="2D3748"/>
+          <w:sz w:val="21"/>
+        </w:rPr>
+        <w:t>Digite o Valor do salário base em reais (ex: 1850.00).</w:t>
+      </w:r>
+    </w:p>
+    <w:p>
+      <w:pPr>
+        <w:spacing w:before="40" w:after="60" w:line="276" w:lineRule="auto"/>
+      </w:pPr>
+      <w:r>
+        <w:rPr>
+          <w:rFonts w:ascii="Arial" w:hAnsi="Arial"/>
+          <w:b/>
+          <w:color w:val="007A87"/>
+          <w:sz w:val="20"/>
+        </w:rPr>
+        <w:t xml:space="preserve">6. </w:t>
+      </w:r>
+      <w:r>
+        <w:rPr>
+          <w:rFonts w:ascii="Calibri" w:hAnsi="Calibri"/>
+          <w:b/>
+          <w:color w:val="2D3748"/>
+          <w:sz w:val="21"/>
+        </w:rPr>
+        <w:t xml:space="preserve">Confirmar: </w:t>
+      </w:r>
+      <w:r>
+        <w:rPr>
+          <w:rFonts w:ascii="Calibri" w:hAnsi="Calibri"/>
+          <w:color w:val="2D3748"/>
+          <w:sz w:val="21"/>
+        </w:rPr>
+        <w:t>Clique em 'Salvar'. O sistema registrará a vigência salarial.</w:t>
+      </w:r>
+    </w:p>
+    <w:p>
+      <w:pPr>
+        <w:pStyle w:val="Heading3"/>
+        <w:keepNext/>
+        <w:spacing w:before="160" w:after="40"/>
+      </w:pPr>
+      <w:r>
+        <w:rPr>
+          <w:rFonts w:ascii="Calibri" w:hAnsi="Calibri"/>
+          <w:b/>
+          <w:color w:val="2D3748"/>
+          <w:sz w:val="23"/>
+        </w:rPr>
+        <w:t>C) Como Alterar o Valor de um Salário Existente:</w:t>
+      </w:r>
+    </w:p>
+    <w:p>
+      <w:pPr>
+        <w:spacing w:before="40" w:after="60" w:line="276" w:lineRule="auto"/>
+      </w:pPr>
+      <w:r>
+        <w:rPr>
+          <w:rFonts w:ascii="Arial" w:hAnsi="Arial"/>
+          <w:b/>
+          <w:color w:val="007A87"/>
+          <w:sz w:val="20"/>
+        </w:rPr>
+        <w:t xml:space="preserve">1. </w:t>
+      </w:r>
+      <w:r>
+        <w:rPr>
+          <w:rFonts w:ascii="Calibri" w:hAnsi="Calibri"/>
+          <w:b/>
+          <w:color w:val="2D3748"/>
+          <w:sz w:val="21"/>
+        </w:rPr>
+        <w:t xml:space="preserve">Localizar: </w:t>
+      </w:r>
+      <w:r>
+        <w:rPr>
+          <w:rFonts w:ascii="Calibri" w:hAnsi="Calibri"/>
+          <w:color w:val="2D3748"/>
+          <w:sz w:val="21"/>
+        </w:rPr>
+        <w:t>Utilize os filtros no topo da tela para encontrar o salário desejado (filtre por Cargo, UF ou Ano).</w:t>
+      </w:r>
+    </w:p>
+    <w:p>
+      <w:pPr>
+        <w:spacing w:before="40" w:after="60" w:line="276" w:lineRule="auto"/>
+      </w:pPr>
+      <w:r>
+        <w:rPr>
+          <w:rFonts w:ascii="Arial" w:hAnsi="Arial"/>
+          <w:b/>
+          <w:color w:val="007A87"/>
+          <w:sz w:val="20"/>
+        </w:rPr>
+        <w:t xml:space="preserve">2. </w:t>
+      </w:r>
+      <w:r>
+        <w:rPr>
+          <w:rFonts w:ascii="Calibri" w:hAnsi="Calibri"/>
+          <w:b/>
+          <w:color w:val="2D3748"/>
+          <w:sz w:val="21"/>
+        </w:rPr>
+        <w:t xml:space="preserve">Editar: </w:t>
+      </w:r>
+      <w:r>
+        <w:rPr>
+          <w:rFonts w:ascii="Calibri" w:hAnsi="Calibri"/>
+          <w:color w:val="2D3748"/>
+          <w:sz w:val="21"/>
+        </w:rPr>
+        <w:t>Na linha do salário que deseja alterar, clique no ícone de Lápis (Editar) no canto direito.</w:t>
+      </w:r>
+    </w:p>
+    <w:p>
+      <w:pPr>
+        <w:spacing w:before="40" w:after="60" w:line="276" w:lineRule="auto"/>
+      </w:pPr>
+      <w:r>
+        <w:rPr>
+          <w:rFonts w:ascii="Arial" w:hAnsi="Arial"/>
+          <w:b/>
+          <w:color w:val="007A87"/>
+          <w:sz w:val="20"/>
+        </w:rPr>
+        <w:t xml:space="preserve">3. </w:t>
+      </w:r>
+      <w:r>
+        <w:rPr>
+          <w:rFonts w:ascii="Calibri" w:hAnsi="Calibri"/>
+          <w:b/>
+          <w:color w:val="2D3748"/>
+          <w:sz w:val="21"/>
+        </w:rPr>
+        <w:t xml:space="preserve">Ajuste: </w:t>
+      </w:r>
+      <w:r>
+        <w:rPr>
+          <w:rFonts w:ascii="Calibri" w:hAnsi="Calibri"/>
+          <w:color w:val="2D3748"/>
+          <w:sz w:val="21"/>
+        </w:rPr>
+        <w:t>Altere o campo 'Valor (R$)' para o novo montante reajustado.</w:t>
+      </w:r>
+    </w:p>
+    <w:p>
+      <w:pPr>
+        <w:spacing w:before="40" w:after="60" w:line="276" w:lineRule="auto"/>
+      </w:pPr>
+      <w:r>
+        <w:rPr>
+          <w:rFonts w:ascii="Arial" w:hAnsi="Arial"/>
+          <w:b/>
+          <w:color w:val="007A87"/>
+          <w:sz w:val="20"/>
+        </w:rPr>
+        <w:t xml:space="preserve">4. </w:t>
+      </w:r>
+      <w:r>
+        <w:rPr>
+          <w:rFonts w:ascii="Calibri" w:hAnsi="Calibri"/>
+          <w:b/>
+          <w:color w:val="2D3748"/>
+          <w:sz w:val="21"/>
+        </w:rPr>
+        <w:t xml:space="preserve">Concluir: </w:t>
+      </w:r>
+      <w:r>
+        <w:rPr>
+          <w:rFonts w:ascii="Calibri" w:hAnsi="Calibri"/>
+          <w:color w:val="2D3748"/>
+          <w:sz w:val="21"/>
+        </w:rPr>
+        <w:t>Clique em 'Salvar'. Todos os relatórios e cálculos do sistema passarão a usar o novo valor automaticamente.</w:t>
+      </w:r>
+    </w:p>
+    <w:p>
+      <w:pPr>
+        <w:pStyle w:val="Heading2"/>
+        <w:keepNext/>
+        <w:spacing w:before="240" w:after="80"/>
+      </w:pPr>
+      <w:r>
+        <w:rPr>
+          <w:rFonts w:ascii="Arial" w:hAnsi="Arial"/>
+          <w:b/>
+          <w:color w:val="007A87"/>
+          <w:sz w:val="26"/>
+        </w:rPr>
+        <w:t>2.4 Guia Passo a Passo: Como Obter os Arquivos nas Fontes Oficiais</w:t>
       </w:r>
     </w:p>
     <w:p>
@@ -3844,7 +4983,7 @@
           <w:color w:val="007A87"/>
           <w:sz w:val="26"/>
         </w:rPr>
-        <w:t>2.4 Telas de Carga no Sistema de Análises Operacionais</w:t>
+        <w:t>2.5 Telas de Carga no Sistema de Análises Operacionais</w:t>
       </w:r>
     </w:p>
     <w:p>
@@ -4726,7 +5865,7 @@
           <w:color w:val="2D3748"/>
           <w:sz w:val="21"/>
         </w:rPr>
-        <w:t xml:space="preserve">PASSO 3: Checagem de IP — </w:t>
+        <w:t xml:space="preserve">PASSO 3: Checagem de IP e Link — </w:t>
       </w:r>
       <w:r>
         <w:rPr>
@@ -4734,7 +5873,7 @@
           <w:color w:val="2D3748"/>
           <w:sz w:val="21"/>
         </w:rPr>
-        <w:t>Abra o navegador em outro computador e tente acessar: http://[IP_DO_SERVIDOR]:5173 ou :8000. Se ainda não abrir, execute o arquivo 'diagnostico.bat'. O arquivo 'diagnostico.txt' será aberto na tela. Verifique a linha 'Endereço IPv4'. Se o número do IP tiver mudado (ex: de 10.1.1.111 para 10.1.1.115), avise os usuários sobre o novo endereço.</w:t>
+        <w:t>Abra o navegador em outro computador e tente acessar: http://[IP_DO_SERVIDOR]:5173 ou http://INOVACAO-TMG64:5173. Se ainda não abrir, execute o arquivo 'diagnostico.bat'. O arquivo 'diagnostico.txt' será aberto na tela com o IP exato atualizado. Se o número do IP tiver mudado (ex: de 10.1.1.111 para outro número), basta repassar o novo link para a equipe conforme ensinado na Seção 2.1.</w:t>
       </w:r>
     </w:p>
     <w:p>

</xml_diff>

<commit_message>
docs: documenta arquivos oficiais de inicializacao de teste e producao e auto-deteccao de portas
</commit_message>
<xml_diff>
--- a/DOCUMENTACAO_DO_SISTEMA.docx
+++ b/DOCUMENTACAO_DO_SISTEMA.docx
@@ -1489,7 +1489,7 @@
           <w:color w:val="2D3748"/>
           <w:sz w:val="21"/>
         </w:rPr>
-        <w:t>Disparada no logon do usuário. Executa o script que ativa o ambiente virtual Python e inicia o Waitress e o Vite.</w:t>
+        <w:t>Disparada no logon do usuário. Executa o script oficial C:\Users\aprendiz.operacional\Documents\Start Projeto\start-projeto-cmd.bat, que aciona o inicializador de produção com todas as verificações de integridade.</w:t>
       </w:r>
     </w:p>
     <w:p>
@@ -1512,7 +1512,7 @@
           <w:color w:val="2D3748"/>
           <w:sz w:val="21"/>
         </w:rPr>
-        <w:t>Disparada às 18:05:58 para encerrar a máquina fora do expediente comercial conforme a política corporativa da empresa.</w:t>
+        <w:t>Disparada diariamente às 18:05:58 para encerrar a máquina fora do expediente comercial conforme a política corporativa da empresa.</w:t>
       </w:r>
     </w:p>
     <w:p>
@@ -1527,7 +1527,7 @@
           <w:color w:val="2D3748"/>
           <w:sz w:val="21"/>
         </w:rPr>
-        <w:t>O novo inicializador inteligente iniciar_sistema.bat realiza 4 verificações automáticas antes de abrir os servidores:</w:t>
+        <w:t>O inicializador inteligente iniciar_sistema.bat realiza 5 verificações automáticas com auto-detecção de ambiente:</w:t>
       </w:r>
     </w:p>
     <w:p>
@@ -1611,7 +1611,7 @@
           <w:color w:val="2D3748"/>
           <w:sz w:val="21"/>
         </w:rPr>
-        <w:t xml:space="preserve">4. Verificação de Porta: </w:t>
+        <w:t xml:space="preserve">4. Auto-Detecção Inteligente de Portas e Ambiente: </w:t>
       </w:r>
       <w:r>
         <w:rPr>
@@ -1619,7 +1619,30 @@
           <w:color w:val="2D3748"/>
           <w:sz w:val="21"/>
         </w:rPr>
-        <w:t>Checa se a porta 8000 já está em uso para evitar conflito de instâncias duplicadas.</w:t>
+        <w:t>Identifica se está rodando na pasta de Produção (Documents) ou de Testes (Desktop). Se for Produção, aloca Backend 8000 e Frontend 5173 via Vite local; se for Testes, aloca Backend 8001 e Frontend 5174 via Yarn, permitindo rodar ambos simultaneamente sem conflito.</w:t>
+      </w:r>
+    </w:p>
+    <w:p>
+      <w:pPr>
+        <w:pStyle w:val="ListBullet"/>
+        <w:spacing w:before="20" w:after="40" w:line="276" w:lineRule="auto"/>
+      </w:pPr>
+      <w:r>
+        <w:rPr>
+          <w:rFonts w:ascii="Calibri" w:hAnsi="Calibri"/>
+          <w:b/>
+          <w:color w:val="2D3748"/>
+          <w:sz w:val="21"/>
+        </w:rPr>
+        <w:t xml:space="preserve">5. Verificação de Porta: </w:t>
+      </w:r>
+      <w:r>
+        <w:rPr>
+          <w:rFonts w:ascii="Calibri" w:hAnsi="Calibri"/>
+          <w:color w:val="2D3748"/>
+          <w:sz w:val="21"/>
+        </w:rPr>
+        <w:t>Checa se a porta do ambiente já está em uso para evitar conflito de instâncias duplicadas.</w:t>
       </w:r>
     </w:p>
     <w:p>
@@ -2817,6 +2840,68 @@
         <w:t>Pronto! Um ícone direto será criado na Área de Trabalho e na Barra de Tarefas do colaborador, funcionando como um aplicativo nativo.</w:t>
       </w:r>
     </w:p>
+    <w:p>
+      <w:pPr>
+        <w:pStyle w:val="Heading3"/>
+        <w:keepNext/>
+        <w:spacing w:before="160" w:after="40"/>
+      </w:pPr>
+      <w:r>
+        <w:rPr>
+          <w:rFonts w:ascii="Calibri" w:hAnsi="Calibri"/>
+          <w:b/>
+          <w:color w:val="2D3748"/>
+          <w:sz w:val="23"/>
+        </w:rPr>
+        <w:t>E) Arquivos Oficiais para Abrir Cada Ambiente:</w:t>
+      </w:r>
+    </w:p>
+    <w:p>
+      <w:pPr>
+        <w:pStyle w:val="ListBullet"/>
+        <w:spacing w:before="20" w:after="40" w:line="276" w:lineRule="auto"/>
+      </w:pPr>
+      <w:r>
+        <w:rPr>
+          <w:rFonts w:ascii="Calibri" w:hAnsi="Calibri"/>
+          <w:b/>
+          <w:color w:val="2D3748"/>
+          <w:sz w:val="21"/>
+        </w:rPr>
+        <w:t xml:space="preserve">• Para Iniciar o Ambiente de PRODUÇÃO: </w:t>
+      </w:r>
+      <w:r>
+        <w:rPr>
+          <w:rFonts w:ascii="Calibri" w:hAnsi="Calibri"/>
+          <w:color w:val="2D3748"/>
+          <w:sz w:val="21"/>
+        </w:rPr>
+        <w:t>Dê duplo clique no script oficial C:\Users\aprendiz.operacional\Documents\Start Projeto\start-projeto-cmd.bat (ou no iniciar_sistema.bat dentro de Documents\analises-operacionais). Ele aloca o backend na porta 8000 e o frontend na porta 5173 para os usuários da rede.</w:t>
+      </w:r>
+    </w:p>
+    <w:p>
+      <w:pPr>
+        <w:pStyle w:val="ListBullet"/>
+        <w:spacing w:before="20" w:after="40" w:line="276" w:lineRule="auto"/>
+      </w:pPr>
+      <w:r>
+        <w:rPr>
+          <w:rFonts w:ascii="Calibri" w:hAnsi="Calibri"/>
+          <w:b/>
+          <w:color w:val="2D3748"/>
+          <w:sz w:val="21"/>
+        </w:rPr>
+        <w:t xml:space="preserve">• Para Iniciar o Ambiente de TESTES: </w:t>
+      </w:r>
+      <w:r>
+        <w:rPr>
+          <w:rFonts w:ascii="Calibri" w:hAnsi="Calibri"/>
+          <w:color w:val="2D3748"/>
+          <w:sz w:val="21"/>
+        </w:rPr>
+        <w:t>Dê duplo clique no arquivo iniciar_sistema.bat dentro da pasta de testes na Área de Trabalho (c:\Users\aprendiz.operacional\Desktop\ryanmont\analises-operacionais\iniciar_sistema.bat). Ele detecta automaticamente o ambiente de testes e aloca o backend na porta 8001 e o frontend na porta 5174, permitindo rodar ambos os ambientes ao mesmo tempo sem colisão de portas.</w:t>
+      </w:r>
+    </w:p>
     <w:tbl>
       <w:tblPr>
         <w:tblW w:type="auto" w:w="0"/>
@@ -5219,7 +5304,7 @@
           <w:color w:val="007A87"/>
           <w:sz w:val="26"/>
         </w:rPr>
-        <w:t>3.1 O Painel de Emergência (menu_emergencia.bat)</w:t>
+        <w:t>3.1 O Painel de Emergência (menu_emergencia.bat) e Scripts Oficiais</w:t>
       </w:r>
     </w:p>
     <w:p>
@@ -5234,7 +5319,7 @@
           <w:color w:val="2D3748"/>
           <w:sz w:val="21"/>
         </w:rPr>
-        <w:t>Para que qualquer pessoa consiga operar e reparar o sistema sem digitar comandos complexos no terminal, foi criado o menu interativo menu_emergencia.bat na raiz do projeto. Ele contém 8 opções diretas:</w:t>
+        <w:t>Para que qualquer pessoa consiga operar e reparar o sistema sem digitar comandos complexos no terminal, a raiz do projeto conta exclusivamente com 4 scripts oficiais padronizados (todos os scripts legados anteriores foram descontinuados e removidos). O arquivo menu_emergencia.bat centraliza todas as ações administrativas em 8 opções diretas:</w:t>
       </w:r>
     </w:p>
     <w:tbl>

</xml_diff>